<commit_message>
Validierung 3.0 -> 4.0: Policy-Design ist Vertrauens-Design (§ 8.4)
Neuer Abschluss-Absatz in § 8.4, der die Luecke zwischen
Systemstabilitaetsargument und konkreten Instrumenten schließt:
Wertschoepfungsabgabe, Teilhabefonds, Umstellung der
Sozialstaatsfinanzierung muessen nicht nur fiskalisch funktionieren,
sondern sichtbar, verstaendlich und spuerbar sein - sonst werden sie
als weiterer Zug im Huetchenspiel gelesen und verstaerken den
Vertrauensverlust, den sie heilen sollen. Drei konkrete
Sichtbarkeitsanforderungen benannt (Staatsfonds-Ertraege pro Buerger,
transparente Aufschluesselung Lohn vs. Wertschoepfung, klare Zusage
Buerger-statt-Verwaltungs-Verbleib).

Version 3.0 -> 4.0 durchgezogen (Hauptdokument, README, Build-Skripte,
Protokoll). PDF 25 Seiten, Absatz auf Seite 18. Grundarchitektur
unveraendert.

https://claude.ai/code/session_01WQshatLskjZS9vKFsjK325
</commit_message>
<xml_diff>
--- a/Arbeitspapier_KI_Robotik_Besteuerung.docx
+++ b/Arbeitspapier_KI_Robotik_Besteuerung.docx
@@ -112,7 +112,7 @@
           <w:color w:val="666666"/>
           <w:sz w:val="18"/>
         </w:rPr>
-        <w:t>Version 3.0</w:t>
+        <w:t>Version 4.0</w:t>
       </w:r>
     </w:p>
     <w:p>
@@ -3661,6 +3661,47 @@
           <w:sz w:val="19"/>
         </w:rPr>
         <w:t>Das OpenAI-Papier selbst greift diese Linie implizit auf, wenn es formuliert, dass „die Institutionen und sozialen Sicherungen, die diesen Übergang bewältigen müssen, zurückbleiben könnten", wenn die Politik nicht mithält. Aus deutscher Perspektive ist das weniger eine neue Einsicht als eine Wiederentdeckung Bismarckscher Staatsräson unter modernen Vorzeichen.</w:t>
+      </w:r>
+    </w:p>
+    <w:p>
+      <w:pPr>
+        <w:jc w:val="both"/>
+      </w:pPr>
+      <w:r>
+        <w:rPr>
+          <w:rFonts w:ascii="Arial" w:hAnsi="Arial"/>
+          <w:b/>
+          <w:i w:val="0"/>
+          <w:sz w:val="19"/>
+        </w:rPr>
+        <w:t>Policy-Design ist Vertrauens-Design.</w:t>
+      </w:r>
+      <w:r>
+        <w:rPr>
+          <w:rFonts w:ascii="Arial" w:hAnsi="Arial"/>
+          <w:b w:val="0"/>
+          <w:i w:val="0"/>
+          <w:sz w:val="19"/>
+        </w:rPr>
+        <w:t xml:space="preserve"> Daraus folgt eine praktische Konsequenz für die in Kapitel 10 entwickelten Empfehlungen: Die vorgeschlagenen Instrumente — Wertschöpfungsabgabe, Teilhabefonds, Umstellung der Sozialstaatsfinanzierung — müssen nicht nur fiskalisch funktionieren, sondern </w:t>
+      </w:r>
+      <w:r>
+        <w:rPr>
+          <w:rFonts w:ascii="Arial" w:hAnsi="Arial"/>
+          <w:b/>
+          <w:i w:val="0"/>
+          <w:sz w:val="19"/>
+        </w:rPr>
+        <w:t>sichtbar, verständlich und spürbar</w:t>
+      </w:r>
+      <w:r>
+        <w:rPr>
+          <w:rFonts w:ascii="Arial" w:hAnsi="Arial"/>
+          <w:b w:val="0"/>
+          <w:i w:val="0"/>
+          <w:sz w:val="19"/>
+        </w:rPr>
+        <w:t xml:space="preserve"> sein. Eine technokratisch korrekte Reform, deren Wirkung für die Bevölkerung nicht nachvollziehbar wird, verfehlt ihr wichtigstes Ziel: die Wiederherstellung des institutionellen Vertrauens, auf dem demokratische Steuerungsfähigkeit beruht. Konkret heißt das: eine jährliche, individuell zuordenbare Ausweisung der Staatsfonds-Erträge je Bürger; eine transparente Aufschlüsselung der Sozialversicherungsfinanzierung nach Lohn- und Wertschöpfungsanteil; eine klare Zusage, dass Reformerträge bei den Bürgern landen und nicht in neuen Verwaltungsebenen. Wo der psychologische Grundvertrag zwischen Bürger und Institution bereits erodiert ist, reicht fiskalische Korrektheit nicht aus — die Reform muss erfahrbar werden, sonst wird sie als weiterer Zug im Hütchenspiel gelesen und verstärkt den Vertrauensverlust, den sie eigentlich heilen soll.</w:t>
       </w:r>
     </w:p>
     <w:p>
@@ -5901,7 +5942,7 @@
         <w:color w:val="999999"/>
         <w:sz w:val="15"/>
       </w:rPr>
-      <w:t>Version 3.0 — April 2026 — CC BY 4.0</w:t>
+      <w:t>Version 4.0 — April 2026 — CC BY 4.0</w:t>
       <w:tab/>
       <w:t xml:space="preserve">Seite </w:t>
     </w:r>

</xml_diff>

<commit_message>
Validierung 4.0 -> 5.0: Web-Recherche April 2026 integriert
- Bundestag WD 4-3000-040/25 (September 2025): aktueller Diskussionsstand
- OECD Side-by-Side-Paket (Januar 2026): US-MNE Ausnahme von UTPR/IIR
- EU AI Act: volle Wirksamkeit 2. August 2026
- Sanders-Report "Big Tech Oligarchs' War Against Workers" (97M Jobs)
- Salvaggio "Policymercial"-Kritik; Leicht/Fortune-Referenz
- Altersvorsorgedepot (27. März 2026), Aktivrente
- Acemoglu/Autor/Hazell/Restrepo (2022) ergaenzt
- Sanders-Titel verifiziert, Marker entfernt
- Version auf 5.0 angehoben, PDF/Word neu erstellt

https://claude.ai/code/session_014yehemqLHAzJXm9xst7pcw
</commit_message>
<xml_diff>
--- a/Arbeitspapier_KI_Robotik_Besteuerung.docx
+++ b/Arbeitspapier_KI_Robotik_Besteuerung.docx
@@ -112,7 +112,7 @@
           <w:color w:val="666666"/>
           <w:sz w:val="18"/>
         </w:rPr>
-        <w:t>Version 4.0</w:t>
+        <w:t>Version 5.0</w:t>
       </w:r>
     </w:p>
     <w:p>
@@ -325,7 +325,7 @@
           <w:i w:val="0"/>
           <w:sz w:val="19"/>
         </w:rPr>
-        <w:t>Das Papier wertet die aktuelle wissenschaftliche Literatur (insbesondere Brookings, NBER — National Bureau of Economic Research, JEEA — Journal of the European Economic Association), Stellungnahmen von Institutionen (EU-Parlament, IAB, IW Köln, BMAS — Bundesministerium für Arbeit und Soziales, Gabler Wirtschaftslexikon, bpb — Bundeszentrale für politische Bildung) sowie jüngste Politikpapiere (OpenAI April 2026, Sanders-Report Oktober 2025) aus. Die Recherche hat einen Stand von April 2026. Ein Schwerpunkt liegt auf der Einordnung für den deutschen Kontext — insbesondere mit Blick auf die Finanzierung der sozialen Sicherungssysteme und die Situation im Gesundheitswesen.</w:t>
+        <w:t>Das Papier wertet die aktuelle wissenschaftliche Literatur (insbesondere Brookings, NBER — National Bureau of Economic Research, JEEA — Journal of the European Economic Association), Stellungnahmen von Institutionen (EU-Parlament, IAB, IW Köln, BMAS — Bundesministerium für Arbeit und Soziales, Gabler Wirtschaftslexikon, bpb — Bundeszentrale für politische Bildung, Wissenschaftliche Dienste des Deutschen Bundestages) sowie jüngste Politikpapiere (OpenAI April 2026, Sanders-Report Oktober 2025, OECD Pillar-Two-„Side-by-Side"-Guidance Januar 2026) aus. Die Recherche hat einen Stand von April 2026. Ein Schwerpunkt liegt auf der Einordnung für den deutschen Kontext — insbesondere mit Blick auf die Finanzierung der sozialen Sicherungssysteme und die Situation im Gesundheitswesen.</w:t>
       </w:r>
     </w:p>
     <w:p>
@@ -1403,6 +1403,20 @@
     </w:p>
     <w:p>
       <w:pPr>
+        <w:jc w:val="both"/>
+      </w:pPr>
+      <w:r>
+        <w:rPr>
+          <w:rFonts w:ascii="Arial" w:hAnsi="Arial"/>
+          <w:b w:val="0"/>
+          <w:i w:val="0"/>
+          <w:sz w:val="19"/>
+        </w:rPr>
+        <w:t>Die Wissenschaftlichen Dienste des Deutschen Bundestages haben den aktuellen Diskussionsstand in einer Kurzinformation (WD 4 – 3000 – 040/25, 4. September 2025) aufgearbeitet: „Aspekte einer Wertschöpfungsabgabe bzw. -steuer, die über die Finanzierung der Sozialversicherungssysteme hinausgehen". Das Papier skizziert verschiedene denkbare Bemessungsgrundlagen für eine Robotersteuer — darunter ein fiktiv zugerechneter Lohn für die von einer Maschine verrichtete Arbeit analog zu einem menschlichen Beschäftigten sowie eine objekt- oder besitzbezogene Steuer auf Roboter — und diskutiert sie im Zusammenhang mit der Wertschöpfungsabgabe und den OECD-Reforminitiativen. Die Ausarbeitung ist politisch neutral angelegt, dokumentiert aber, dass die Idee im parlamentarischen Betrieb wieder ernsthaft referenziert wird.</w:t>
+      </w:r>
+    </w:p>
+    <w:p>
+      <w:pPr>
         <w:spacing w:before="120" w:after="80"/>
       </w:pPr>
       <w:r>
@@ -1562,7 +1576,21 @@
           <w:i w:val="0"/>
           <w:sz w:val="19"/>
         </w:rPr>
-        <w:t>Die Two-Pillar-Reform der OECD (Organisation für wirtschaftliche Zusammenarbeit und Entwicklung; Pillar 1 zur Umverteilung von Besteuerungsrechten, Pillar 2 zur globalen Mindestbesteuerung von 15 %) schafft einen Rahmen, in dem große digitale Konzerne stärker besteuert werden können — allerdings nicht spezifisch für KI-Leistungen.</w:t>
+        <w:t>Die Two-Pillar-Reform der OECD (Organisation für wirtschaftliche Zusammenarbeit und Entwicklung; Pillar 1 zur Umverteilung von Besteuerungsrechten, Pillar 2 zur globalen Mindestbesteuerung von 15 %) schafft einen Rahmen, in dem große digitale Konzerne stärker besteuert werden können — allerdings nicht spezifisch für KI-Leistungen. Am 5. Januar 2026 hat die OECD im Inclusive Framework ein ergänzendes „Side-by-Side"-Paket veröffentlicht, nach dem US-gemutterte multinationale Konzerne unter bestimmten Voraussetzungen von der Undertaxed Profits Rule (UTPR) und der Income Inclusion Rule (IIR) des Pillar 2 ausgenommen werden; Qualifizierte inländische Mindeststeuern (Qualified Domestic Minimum Top-Up Taxes, QDMTT) bleiben dagegen anwendbar. Die USA waren zum Stand April 2026 die bislang einzige Jurisdiktion, die das OECD-Sekretariat auf der sogenannten Central-Record-Liste geführt hat. Für die europäische KI-Besteuerungsdebatte bedeutet dieser Schritt eine spürbare Verengung des fiskalischen Zugriffs auf die US-dominierten Anbieter von KI-Basismodellen — das in Kapitel 8 diskutierte Rohstoff-Analogon wird damit sichtbarer, nicht schwächer.</w:t>
+      </w:r>
+    </w:p>
+    <w:p>
+      <w:pPr>
+        <w:jc w:val="both"/>
+      </w:pPr>
+      <w:r>
+        <w:rPr>
+          <w:rFonts w:ascii="Arial" w:hAnsi="Arial"/>
+          <w:b w:val="0"/>
+          <w:i w:val="0"/>
+          <w:sz w:val="19"/>
+        </w:rPr>
+        <w:t>Auf der regulatorischen Seite tritt die EU-KI-Verordnung (AI Act) am 2. August 2026 in wesentlichen Teilen in vollen Wirkbetrieb: Die Pflichten für Hochrisiko-KI-Systeme gemäß Anhang III, die Transparenz- und Kennzeichnungspflichten für generative Systeme sowie die nationalen Aufsichtsstrukturen werden ab diesem Datum verbindlich. Für Anbieter von General-Purpose-AI-Modellen, die bereits seit 2. August 2025 regulatorische Pflichten haben, wurden Bestandsmodelle mit einer Übergangsfrist bis 2. August 2027 versehen. Der AI Act ist kein Steuerinstrument, bildet aber zusammen mit dem Data Governance Act, dem European Health Data Space (EHDS) und der Digital Services Tax das regulatorische Ökosystem, in das sich eine KI-bezogene Abgabelogik einpassen müsste.</w:t>
       </w:r>
     </w:p>
     <w:p>
@@ -1605,16 +1633,16 @@
           <w:i w:val="0"/>
           <w:sz w:val="19"/>
         </w:rPr>
-        <w:t>Sanders-Report (Oktober 2025):</w:t>
-      </w:r>
-      <w:r>
-        <w:rPr>
-          <w:rFonts w:ascii="Arial" w:hAnsi="Arial"/>
-          <w:b w:val="0"/>
-          <w:i w:val="0"/>
-          <w:sz w:val="19"/>
-        </w:rPr>
-        <w:t xml:space="preserve"> US-Senator Bernie Sanders, ranghöchstes Mitglied im HELP-Ausschuss des US-Senats, veröffentlichte einen Bericht, der eine „Robotersteuer" für Unternehmen forderte, die KI einsetzen, um Arbeitsplätze zu ersetzen. Dies ist der bislang konkreteste politische Vorstoß auf US-Bundesebene.</w:t>
+        <w:t>Sanders-Report „The Big Tech Oligarchs' War Against Workers" (6. Oktober 2025):</w:t>
+      </w:r>
+      <w:r>
+        <w:rPr>
+          <w:rFonts w:ascii="Arial" w:hAnsi="Arial"/>
+          <w:b w:val="0"/>
+          <w:i w:val="0"/>
+          <w:sz w:val="19"/>
+        </w:rPr>
+        <w:t xml:space="preserve"> US-Senator Bernie Sanders, ranghöchstes Mitglied im HELP-Ausschuss (Committee on Health, Education, Labor and Pensions) des US-Senats, veröffentlichte gemeinsam mit dem Minderheitsstab des Ausschusses einen 30-seitigen Bericht, der eine „Robotersteuer" für Unternehmen fordert, die KI einsetzen, um Arbeitsplätze zu ersetzen. Der Bericht stützt sich auf eine ChatGPT-gestützte Modellrechnung und kommt zu dem Ergebnis, dass KI und Automatisierung in den kommenden zehn Jahren bis zu rund 97 Millionen US-Arbeitsplätze substituieren könnten; als besonders betroffen werden u. a. 89 % der Fast-Food- und Counter-Beschäftigten, 64 % der Buchhalter und 47 % der Fernfahrer genannt. Ergänzend fordert der Bericht eine 32-Stunden-Woche bei vollem Lohnausgleich, einen bundesstaatlichen Mindestlohn von 17 US-Dollar, eine Beteiligung der Beschäftigten an automatisierten Unternehmen und ein Verbot von Aktienrückkäufen. Dies ist der bislang konkreteste politische Vorstoß auf US-Bundesebene. Die Methodik ist in der Fachpresse (u. a. Tax Notes vom 20. Oktober 2025, American Enterprise Institute) kritisch kommentiert worden: Kritiker bemängelten die ChatGPT-basierte Schätzung als nicht belastbar und die Definition eines „Roboters" als zu unscharf, um eine operationalisierbare Bemessungsgrundlage zu stützen. Die substanzielle politische Forderung — Verschiebung der Steuerlast von Arbeit auf automatisierendes Kapital — bleibt davon unberührt.</w:t>
       </w:r>
     </w:p>
     <w:p>
@@ -1665,7 +1693,7 @@
           <w:i w:val="0"/>
           <w:sz w:val="19"/>
         </w:rPr>
-        <w:t>Das Papier ist bemerkenswert, weil hier ein führender KI-Anbieter selbst die steuerliche Abschöpfung seines eigenen Geschäftsmodells zur Diskussion stellt. Es ist aber auch als Agenda-Setting-Instrument zu lesen: Eine Million Dollar API-Credits für Forschung an „diesen und verwandten politischen Ideen" schafft Pfadabhängigkeiten in der akademischen Debatte. Kritiker haben das Papier als „Regulatory Nihilism" bezeichnet, weil es großzügig klinge, aber keine konkreten Selbstverpflichtungen des Absenders enthalte — die Robotersteuer zahlten „Unternehmen, die Arbeit automatisieren", nicht spezifisch OpenAI selbst. Europa kommt in dem Papier weder als Partner noch als Modell vor; der Entwurf konzentriert sich explizit auf die USA.</w:t>
+        <w:t>Das Papier ist bemerkenswert, weil hier ein führender KI-Anbieter selbst die steuerliche Abschöpfung seines eigenen Geschäftsmodells zur Diskussion stellt. Es ist aber auch als Agenda-Setting-Instrument zu lesen: Eine Million Dollar API-Credits für Forschung an „diesen und verwandten politischen Ideen" schafft Pfadabhängigkeiten in der akademischen Debatte. Kritiker haben das Papier als „Regulatory Nihilism" bezeichnet, weil es großzügig klinge, aber keine konkreten Selbstverpflichtungen des Absenders enthalte — die Robotersteuer zahlten „Unternehmen, die Arbeit automatisieren", nicht spezifisch OpenAI selbst. Eryk Salvaggio hat das Dokument in Tech Policy Press als „Policymercial" bezeichnet — Marketingtext in Gestalt eines Politikvorschlags — und darauf hingewiesen, dass OpenAI in anderen Kontexten (EU AI Act, kalifornische SB 1047) aktiv gegen vergleichbare Regulierung lobbyiert hat. Anton Leicht ergänzte in einer Fortune-Analyse vom 6. April 2026, die vorgeschlagenen Reformen seien politisch so voraussetzungsreich, dass sie eher an ein „Silicon-Valley-Gedankenexperiment" als an umsetzungsfähige Gesetzgebung erinnerten. Europa kommt in dem Papier weder als Partner noch als Modell vor; der Entwurf konzentriert sich explizit auf die USA.</w:t>
       </w:r>
     </w:p>
     <w:p>
@@ -1828,7 +1856,7 @@
           <w:i w:val="0"/>
           <w:sz w:val="19"/>
         </w:rPr>
-        <w:t xml:space="preserve"> Das Bundesministerium für Arbeit und Soziales hat eine Kurzexpertise veröffentlicht (Forschungsbericht 489), die untersucht, ob eine Wertschöpfungsabgabe in Deutschland als ein möglicher (zusätzlicher) Finanzierungsbaustein für soziale Sicherung dienen könne. Die Expertise ist im politischen Diskurs bislang wenig prominent geworden.</w:t>
+        <w:t xml:space="preserve"> Das Bundesministerium für Arbeit und Soziales hat eine Kurzexpertise veröffentlicht (Forschungsbericht 489), die untersucht, ob eine Wertschöpfungsabgabe in Deutschland als ein möglicher (zusätzlicher) Finanzierungsbaustein für soziale Sicherung dienen könne. Die Expertise ist im politischen Diskurs bislang wenig prominent geworden. Parallel dazu haben die Wissenschaftlichen Dienste des Deutschen Bundestages im September 2025 (WD 4 – 3000 – 040/25) weitergehende Einsatzfelder einer Wertschöpfungsabgabe jenseits der Sozialversicherungsfinanzierung beschrieben — unter anderem die Finanzierung kommunaler Aufgaben sowie die Anschlussfähigkeit an die OECD-Reforminitiativen — und damit die fiskalpolitische Diskussionsbasis im parlamentarischen Raum verbreitert (vgl. § 4.2).</w:t>
       </w:r>
     </w:p>
     <w:p>
@@ -3848,7 +3876,7 @@
           <w:i w:val="0"/>
           <w:sz w:val="19"/>
         </w:rPr>
-        <w:t xml:space="preserve"> Die Teilhabekomponente erfordert eine politische Kraftanstrengung, die über die bisherige Reformdebatte hinausgeht. Ein deutscher oder europäischer Staatsfonds nach norwegischem Vorbild ist institutionell nicht vorhanden; seine Konstruktion würde Jahre beanspruchen. Übergangsweise kommen hybride Modelle in Betracht — etwa eine zweckgebundene Kapitalkomponente in der gesetzlichen Rentenversicherung, die bereits 2024 in Deutschland mit der „Generationenkapital"-Initiative angelegt wurde.</w:t>
+        <w:t xml:space="preserve"> Die Teilhabekomponente erfordert eine politische Kraftanstrengung, die über die bisherige Reformdebatte hinausgeht. Ein deutscher oder europäischer Staatsfonds nach norwegischem Vorbild ist institutionell nicht vorhanden; seine Konstruktion würde Jahre beanspruchen. Übergangsweise kommen hybride Modelle in Betracht — etwa eine zweckgebundene Kapitalkomponente in der gesetzlichen Rentenversicherung, die bereits 2024 in Deutschland mit der „Generationenkapital"-Initiative angelegt wurde und die im Jahr 2026 um zwei komplementäre Bausteine erweitert wurde: das vom Bundestag am 27. März 2026 beschlossene Altersvorsorgedepot (kapitalmarktbasierte Nachfolgelösung für die Riester-Rente, Inkrafttreten 1. Januar 2027) und die zum 1. Januar 2026 in Kraft getretene Aktivrente (steuerlich privilegierter Zuverdienst bis 2.000 Euro monatlich für Regelaltersrentnerinnen und -rentner). Diese Instrumente schaffen keinen Staatsfonds im engeren Sinne, bauen aber erstmals eine breitere Kultur kapitalgedeckter Altersvorsorge in Deutschland auf, an die ein späterer Teilhabefonds institutionell anknüpfen könnte.</w:t>
       </w:r>
     </w:p>
     <w:p>
@@ -4419,7 +4447,21 @@
           <w:i w:val="0"/>
           <w:sz w:val="19"/>
         </w:rPr>
-        <w:t>Die Staffelung ist bewusst: Stufe 1 schafft Erfahrungs- und Datenbasis, ohne auf internationale Einigung zu warten. Stufen 2 und 3 sind nicht optional, aber längerfristig. Wer nur auf die internationale Lösung setzt, riskiert eine Lähmung, wie sie in der Digitalsteuer-Debatte seit 2018 zu beobachten war.</w:t>
+        <w:t>Für die internationale Stufe ist das OECD-„Side-by-Side"-Paket vom 5. Januar 2026 zu berücksichtigen: Es reduziert die praktische Durchgriffswirkung von Pillar 2 auf US-gemutterte Konzerne (UTPR/IIR-Ausnahme bei Anerkennung des US-Steuerregimes; QDMTT bleibt) und verändert damit die Ausgangslage für KI-spezifische Anknüpfungspunkte erheblich. Für die europäische Strategie bedeutet das, dass qualifizierte inländische Mindeststeuern und EU-weit harmonisierte Anknüpfungen an die Nutzungsseite (Digital-Services-Logik, importierte KI-Dienste) an Bedeutung gewinnen, während globale Top-up-Mechanismen bei den größten US-Anbietern an Reichweite verlieren.</w:t>
+      </w:r>
+    </w:p>
+    <w:p>
+      <w:pPr>
+        <w:jc w:val="both"/>
+      </w:pPr>
+      <w:r>
+        <w:rPr>
+          <w:rFonts w:ascii="Arial" w:hAnsi="Arial"/>
+          <w:b w:val="0"/>
+          <w:i w:val="0"/>
+          <w:sz w:val="19"/>
+        </w:rPr>
+        <w:t>Die Staffelung ist bewusst: Stufe 1 schafft Erfahrungs- und Datenbasis, ohne auf internationale Einigung zu warten. Stufen 2 und 3 sind nicht optional, aber längerfristig. Wer nur auf die internationale Lösung setzt, riskiert eine Lähmung, wie sie in der Digitalsteuer-Debatte seit 2018 zu beobachten war und die sich durch das Side-by-Side-Paket für den Pillar-2-Pfad weiter akzentuiert hat.</w:t>
       </w:r>
     </w:p>
     <w:p>
@@ -5074,6 +5116,38 @@
           <w:i w:val="0"/>
           <w:sz w:val="19"/>
         </w:rPr>
+        <w:t xml:space="preserve">Acemoglu, D., Autor, D., Hazell, J., &amp; Restrepo, P. (2022). Artificial Intelligence and Jobs: Evidence from Online Vacancies. </w:t>
+      </w:r>
+      <w:r>
+        <w:rPr>
+          <w:rFonts w:ascii="Arial" w:hAnsi="Arial"/>
+          <w:b w:val="0"/>
+          <w:i/>
+          <w:sz w:val="19"/>
+        </w:rPr>
+        <w:t>Journal of Labor Economics</w:t>
+      </w:r>
+      <w:r>
+        <w:rPr>
+          <w:rFonts w:ascii="Arial" w:hAnsi="Arial"/>
+          <w:b w:val="0"/>
+          <w:i w:val="0"/>
+          <w:sz w:val="19"/>
+        </w:rPr>
+        <w:t>, 40(S1), S293-S340.</w:t>
+      </w:r>
+    </w:p>
+    <w:p>
+      <w:pPr>
+        <w:jc w:val="both"/>
+      </w:pPr>
+      <w:r>
+        <w:rPr>
+          <w:rFonts w:ascii="Arial" w:hAnsi="Arial"/>
+          <w:b w:val="0"/>
+          <w:i w:val="0"/>
+          <w:sz w:val="19"/>
+        </w:rPr>
         <w:t xml:space="preserve">Acemoglu, D., Lelarge, C., &amp; Restrepo, P. (2020). Competing with Robots: Firm-Level Evidence from France. </w:t>
       </w:r>
       <w:r>
@@ -5558,6 +5632,70 @@
           <w:i w:val="0"/>
           <w:sz w:val="19"/>
         </w:rPr>
+        <w:t xml:space="preserve">Bundestag, Wissenschaftliche Dienste. (4. September 2025). </w:t>
+      </w:r>
+      <w:r>
+        <w:rPr>
+          <w:rFonts w:ascii="Arial" w:hAnsi="Arial"/>
+          <w:b w:val="0"/>
+          <w:i/>
+          <w:sz w:val="19"/>
+        </w:rPr>
+        <w:t>Aspekte einer Wertschöpfungsabgabe bzw. -steuer, die über die Finanzierung der Sozialversicherungssysteme hinausgehen.</w:t>
+      </w:r>
+      <w:r>
+        <w:rPr>
+          <w:rFonts w:ascii="Arial" w:hAnsi="Arial"/>
+          <w:b w:val="0"/>
+          <w:i w:val="0"/>
+          <w:sz w:val="19"/>
+        </w:rPr>
+        <w:t xml:space="preserve"> Ausarbeitung WD 4 – 3000 – 040/25, Fachbereich Haushalt und Finanzen. URL: https://www.bundestag.de/resource/blob/1113012/WD-4-040-25.pdf</w:t>
+      </w:r>
+    </w:p>
+    <w:p>
+      <w:pPr>
+        <w:jc w:val="both"/>
+      </w:pPr>
+      <w:r>
+        <w:rPr>
+          <w:rFonts w:ascii="Arial" w:hAnsi="Arial"/>
+          <w:b w:val="0"/>
+          <w:i w:val="0"/>
+          <w:sz w:val="19"/>
+        </w:rPr>
+        <w:t xml:space="preserve">Deutscher Bundestag. (27. März 2026). </w:t>
+      </w:r>
+      <w:r>
+        <w:rPr>
+          <w:rFonts w:ascii="Arial" w:hAnsi="Arial"/>
+          <w:b w:val="0"/>
+          <w:i/>
+          <w:sz w:val="19"/>
+        </w:rPr>
+        <w:t>Beschluss des Bundestages zur Reform der steuerlich geförderten privaten Altersvorsorge („Altersvorsorgedepot").</w:t>
+      </w:r>
+      <w:r>
+        <w:rPr>
+          <w:rFonts w:ascii="Arial" w:hAnsi="Arial"/>
+          <w:b w:val="0"/>
+          <w:i w:val="0"/>
+          <w:sz w:val="19"/>
+        </w:rPr>
+        <w:t xml:space="preserve"> Plenarprotokoll/Textarchiv KW 13/2026. URL: https://www.bundestag.de/dokumente/textarchiv/2026/kw13-de-altersvorsorge-1156798</w:t>
+      </w:r>
+    </w:p>
+    <w:p>
+      <w:pPr>
+        <w:jc w:val="both"/>
+      </w:pPr>
+      <w:r>
+        <w:rPr>
+          <w:rFonts w:ascii="Arial" w:hAnsi="Arial"/>
+          <w:b w:val="0"/>
+          <w:i w:val="0"/>
+          <w:sz w:val="19"/>
+        </w:rPr>
         <w:t>Bundeszentrale für politische Bildung (bpb). Pro und Contra zur Robotersteuer. Dossier „Zukunft der Arbeit".</w:t>
       </w:r>
     </w:p>
@@ -5586,6 +5724,38 @@
           <w:i w:val="0"/>
           <w:sz w:val="19"/>
         </w:rPr>
+        <w:t xml:space="preserve">Europäische Kommission. (2024/2026). </w:t>
+      </w:r>
+      <w:r>
+        <w:rPr>
+          <w:rFonts w:ascii="Arial" w:hAnsi="Arial"/>
+          <w:b w:val="0"/>
+          <w:i/>
+          <w:sz w:val="19"/>
+        </w:rPr>
+        <w:t>Artificial Intelligence Act – Regulatory Framework and Implementation Timeline.</w:t>
+      </w:r>
+      <w:r>
+        <w:rPr>
+          <w:rFonts w:ascii="Arial" w:hAnsi="Arial"/>
+          <w:b w:val="0"/>
+          <w:i w:val="0"/>
+          <w:sz w:val="19"/>
+        </w:rPr>
+        <w:t xml:space="preserve"> Shaping Europe's digital future. URL: https://digital-strategy.ec.europa.eu/en/policies/regulatory-framework-ai</w:t>
+      </w:r>
+    </w:p>
+    <w:p>
+      <w:pPr>
+        <w:jc w:val="both"/>
+      </w:pPr>
+      <w:r>
+        <w:rPr>
+          <w:rFonts w:ascii="Arial" w:hAnsi="Arial"/>
+          <w:b w:val="0"/>
+          <w:i w:val="0"/>
+          <w:sz w:val="19"/>
+        </w:rPr>
         <w:t>Europäisches Parlament. (2017). Bericht mit Empfehlungen an die Kommission zu zivilrechtlichen Regelungen im Bereich Robotik (A8-0005/2017). Berichterstatterin: Mady Delvaux.</w:t>
       </w:r>
     </w:p>
@@ -5600,7 +5770,7 @@
           <w:i w:val="0"/>
           <w:sz w:val="19"/>
         </w:rPr>
-        <w:t>IAB, BIBB, GWS. (November 2025). Künstliche Intelligenz: Potenzielle Effekte für den deutschen Arbeitsmarkt. IAB-Forschungsbericht 23/2025.</w:t>
+        <w:t>IAB, BIBB, GWS. (November 2025). Künstliche Intelligenz: Potenzielle Effekte für den deutschen Arbeitsmarkt. IAB-Forschungsbericht 23/2025. URL: https://doku.iab.de/forschungsbericht/2025/fb2325.pdf</w:t>
       </w:r>
     </w:p>
     <w:p>
@@ -5628,6 +5798,38 @@
           <w:i w:val="0"/>
           <w:sz w:val="19"/>
         </w:rPr>
+        <w:t xml:space="preserve">OECD/G20 Inclusive Framework on BEPS. (5. Januar 2026). </w:t>
+      </w:r>
+      <w:r>
+        <w:rPr>
+          <w:rFonts w:ascii="Arial" w:hAnsi="Arial"/>
+          <w:b w:val="0"/>
+          <w:i/>
+          <w:sz w:val="19"/>
+        </w:rPr>
+        <w:t>Administrative Guidance under the GloBE Rules: Pillar Two – Central Record and „Side-by-Side"-Arrangement.</w:t>
+      </w:r>
+      <w:r>
+        <w:rPr>
+          <w:rFonts w:ascii="Arial" w:hAnsi="Arial"/>
+          <w:b w:val="0"/>
+          <w:i w:val="0"/>
+          <w:sz w:val="19"/>
+        </w:rPr>
+        <w:t xml:space="preserve"> URL: https://www.oecd.org/content/dam/oecd/en/topics/policy-sub-issues/global-minimum-tax/administrative-guidance-globe-rules-pillar-two-central-record-legislation-transitional-qualified-status.pdf</w:t>
+      </w:r>
+    </w:p>
+    <w:p>
+      <w:pPr>
+        <w:jc w:val="both"/>
+      </w:pPr>
+      <w:r>
+        <w:rPr>
+          <w:rFonts w:ascii="Arial" w:hAnsi="Arial"/>
+          <w:b w:val="0"/>
+          <w:i w:val="0"/>
+          <w:sz w:val="19"/>
+        </w:rPr>
         <w:t xml:space="preserve">OpenAI. (6. April 2026). </w:t>
       </w:r>
       <w:r>
@@ -5660,7 +5862,25 @@
           <w:i w:val="0"/>
           <w:sz w:val="19"/>
         </w:rPr>
-        <w:t>Sanders, B. (Oktober 2025). Bericht zur Robotersteuer / KI-Abgabe. US-Senat, Committee on Health, Education, Labor and Pensions (HELP), Minderheitsbericht. Vollständige Titelangabe zu verifizieren.</w:t>
+        <w:t xml:space="preserve">Sanders, B. (6. Oktober 2025). </w:t>
+      </w:r>
+      <w:r>
+        <w:rPr>
+          <w:rFonts w:ascii="Arial" w:hAnsi="Arial"/>
+          <w:b w:val="0"/>
+          <w:i/>
+          <w:sz w:val="19"/>
+        </w:rPr>
+        <w:t>The Big Tech Oligarchs' War Against Workers: AI and Automation's Coming Impact on American Workers.</w:t>
+      </w:r>
+      <w:r>
+        <w:rPr>
+          <w:rFonts w:ascii="Arial" w:hAnsi="Arial"/>
+          <w:b w:val="0"/>
+          <w:i w:val="0"/>
+          <w:sz w:val="19"/>
+        </w:rPr>
+        <w:t xml:space="preserve"> US-Senat, Committee on Health, Education, Labor and Pensions (HELP), Minderheitsbericht (Democratic Staff), 30 Seiten. URL: https://www.sanders.senate.gov/wp-content/uploads/10.6.2025-The-Big-Tech-Oligarchs-War-Against-Workers.pdf</w:t>
       </w:r>
     </w:p>
     <w:p>
@@ -5675,6 +5895,38 @@
           <w:sz w:val="19"/>
         </w:rPr>
         <w:t>Springer Gabler Verlag. Gabler Wirtschaftslexikon, Stichwort: Robotersteuer.</w:t>
+      </w:r>
+    </w:p>
+    <w:p>
+      <w:pPr>
+        <w:jc w:val="both"/>
+      </w:pPr>
+      <w:r>
+        <w:rPr>
+          <w:rFonts w:ascii="Arial" w:hAnsi="Arial"/>
+          <w:b w:val="0"/>
+          <w:i w:val="0"/>
+          <w:sz w:val="19"/>
+        </w:rPr>
+        <w:t xml:space="preserve">US Department of the Treasury. (Januar 2026). </w:t>
+      </w:r>
+      <w:r>
+        <w:rPr>
+          <w:rFonts w:ascii="Arial" w:hAnsi="Arial"/>
+          <w:b w:val="0"/>
+          <w:i/>
+          <w:sz w:val="19"/>
+        </w:rPr>
+        <w:t>Agreement to Exempt U.S.-Headquartered Companies from Pillar Two Global Minimum Tax Rules („Side-by-Side"-Package).</w:t>
+      </w:r>
+      <w:r>
+        <w:rPr>
+          <w:rFonts w:ascii="Arial" w:hAnsi="Arial"/>
+          <w:b w:val="0"/>
+          <w:i w:val="0"/>
+          <w:sz w:val="19"/>
+        </w:rPr>
+        <w:t xml:space="preserve"> Pressemitteilung. URL: https://home.treasury.gov/news/press-releases/sb0350</w:t>
       </w:r>
     </w:p>
     <w:p>
@@ -5797,7 +6049,7 @@
           <w:i w:val="0"/>
           <w:sz w:val="19"/>
         </w:rPr>
-        <w:t>Euronews. (April 2026). Robotersteuer und Vier-Tage-Woche: So will OpenAI die KI-Wirtschaft gestalten.</w:t>
+        <w:t>Euronews. (April 2026). Robotersteuer und Vier-Tage-Woche: So will OpenAI die KI-Wirtschaft gestalten. URL: https://de.euronews.com/next/2026/04/07/robotersteuer-und-vier-tage-woche-so-will-openai-die-ki-wirtschaft-gestalten</w:t>
       </w:r>
     </w:p>
     <w:p>
@@ -5811,6 +6063,20 @@
           <w:i w:val="0"/>
           <w:sz w:val="19"/>
         </w:rPr>
+        <w:t>Fortune. (6. April 2026). How people are reacting to OpenAI's 13-page policy paper on AI superintelligence (Beiträge u. a. von Anton Leicht). URL: https://fortune.com/2026/04/06/sam-altman-says-ai-superintelligence-is-so-big-that-we-need-a-new-deal-critics-say-openais-policy-ideas-are-a-cover-for-regulatory-nihilism/</w:t>
+      </w:r>
+    </w:p>
+    <w:p>
+      <w:pPr>
+        <w:jc w:val="both"/>
+      </w:pPr>
+      <w:r>
+        <w:rPr>
+          <w:rFonts w:ascii="Arial" w:hAnsi="Arial"/>
+          <w:b w:val="0"/>
+          <w:i w:val="0"/>
+          <w:sz w:val="19"/>
+        </w:rPr>
         <w:t>Robotik und Produktion. (Dezember 2023). Keine Steuererklärung für Roboter.</w:t>
       </w:r>
     </w:p>
@@ -5825,6 +6091,34 @@
           <w:i w:val="0"/>
           <w:sz w:val="19"/>
         </w:rPr>
+        <w:t>Salvaggio, E. (April 2026). OpenAI's New ‚Industrial Policy for the Intelligence Age' is a Policymercial. Tech Policy Press. URL: https://www.techpolicy.press/openais-new-industrial-policy-for-the-intelligence-age-is-a-policymercial/</w:t>
+      </w:r>
+    </w:p>
+    <w:p>
+      <w:pPr>
+        <w:jc w:val="both"/>
+      </w:pPr>
+      <w:r>
+        <w:rPr>
+          <w:rFonts w:ascii="Arial" w:hAnsi="Arial"/>
+          <w:b w:val="0"/>
+          <w:i w:val="0"/>
+          <w:sz w:val="19"/>
+        </w:rPr>
+        <w:t>Tax Notes. (20. Oktober 2025). ‚Robot Tax' Proposal Sparks Skepticism Over Its Practicality.</w:t>
+      </w:r>
+    </w:p>
+    <w:p>
+      <w:pPr>
+        <w:jc w:val="both"/>
+      </w:pPr>
+      <w:r>
+        <w:rPr>
+          <w:rFonts w:ascii="Arial" w:hAnsi="Arial"/>
+          <w:b w:val="0"/>
+          <w:i w:val="0"/>
+          <w:sz w:val="19"/>
+        </w:rPr>
         <w:t>Euractiv. (2017). Robotik-Bericht: Nein zum bedingungslosen Grundeinkommen.</w:t>
       </w:r>
     </w:p>
@@ -5862,7 +6156,7 @@
           <w:i w:val="0"/>
           <w:sz w:val="19"/>
         </w:rPr>
-        <w:t xml:space="preserve"> Dieses Arbeitspapier gibt den Stand April 2026 wieder. Die Debatte entwickelt sich dynamisch, insbesondere im Zuge der OpenAI-Strategiepapiere und der laufenden EU-Regulierungsarbeit zum AI Act. Eine regelmäßige Aktualisierung ist vorgesehen.</w:t>
+        <w:t xml:space="preserve"> Dieses Arbeitspapier gibt den Stand April 2026 wieder. Die Debatte entwickelt sich dynamisch, insbesondere im Zuge der OpenAI-Strategiepapiere, der Sanders-Initiative im US-Senat, der Bundestags-Ausarbeitung vom September 2025 sowie der laufenden EU-Regulierungsarbeit zum AI Act (vollständige Anwendbarkeit zum 2. August 2026) und der OECD-„Side-by-Side"-Anpassung von Pillar 2 (Januar 2026). Eine regelmäßige Aktualisierung ist vorgesehen.</w:t>
       </w:r>
     </w:p>
     <w:p>
@@ -5942,7 +6236,7 @@
         <w:color w:val="999999"/>
         <w:sz w:val="15"/>
       </w:rPr>
-      <w:t>Version 4.0 — April 2026 — CC BY 4.0</w:t>
+      <w:t>Version 5.0 — April 2026 — CC BY 4.0</w:t>
       <w:tab/>
       <w:t xml:space="preserve">Seite </w:t>
     </w:r>

</xml_diff>

<commit_message>
Validierung 4.0 -> 5.0: Aktualisierung mit Korinek/Lockwood, Mensch, Sanders/AOC, Merz, OECD-Pillar-2-Update
Inhaltliche Aktualisierung nach systematischer Web-Recherche:
- § 3.3 Korinek & Lockwood (NBER WP 34873 / Brookings, Jan. 2026)
- § 4.5 Mistral/Mensch EU-KI-Abgabe-Vorschlag (FT, 20. März 2026)
- § 4.5 Sanders/Ocasio-Cortez AI Data Center Moratorium Act (25. März 2026)
- § 4.5 Bundeskanzler Merz Hannover Messe April 2026
- § 4.4 OECD Pillar 2 Deutschland: BMF-Entwurfsverordnung 8. April 2026
- § 4.4 DST-Update 2025/26 (Italien, AT/CZ 5%, Meta-Überwälzung 1. Juli 2026)
- § 4.2 HDE-Position gegen KI-Steuer
- § 8.6 Generationenkapital-Start Januar 2026 (10 Mrd. EUR)
- § 11.5 IAB-Prognose März 2026
- Sanders 2025 Titel verifiziert ("The Big Tech Oligarchs' War Against Workers")

Validierung dokumentiert in Validierung-Ergebnisse.md.
PDF und DOCX neu gebaut.

https://claude.ai/code/session_012fTCMBGDVtMWpKJ9stkfXL
</commit_message>
<xml_diff>
--- a/Arbeitspapier_KI_Robotik_Besteuerung.docx
+++ b/Arbeitspapier_KI_Robotik_Besteuerung.docx
@@ -112,7 +112,7 @@
           <w:color w:val="666666"/>
           <w:sz w:val="18"/>
         </w:rPr>
-        <w:t>Version 4.0</w:t>
+        <w:t>Version 5.0</w:t>
       </w:r>
     </w:p>
     <w:p>
@@ -1032,6 +1032,29 @@
           <w:i w:val="0"/>
           <w:sz w:val="19"/>
         </w:rPr>
+        <w:t>Korinek &amp; Lockwood (2026):</w:t>
+      </w:r>
+      <w:r>
+        <w:rPr>
+          <w:rFonts w:ascii="Arial" w:hAnsi="Arial"/>
+          <w:b w:val="0"/>
+          <w:i w:val="0"/>
+          <w:sz w:val="19"/>
+        </w:rPr>
+        <w:t xml:space="preserve"> Die bislang umfassendste Weiterentwicklung der Debatte über die Finanzierung des Staates in einer KI-geprägten Ökonomie liefern Anton Korinek und Lee M. Lockwood in „Public Finance in the Age of AI: A Primer" (NBER Working Paper 34873, Brookings-Arbeitspapier Januar 2026). Die Autoren unterscheiden zwei Phasen: In Phase 1 verdrängt KI zunehmend menschliche Arbeit, Menschen bleiben aber die primären Konsumenten — hier argumentieren sie für eine Verlagerung hin zur Konsumsteuer und warnen explizit davor, KI-Kapital in der Frühphase zu besteuern, weil dies den Infrastrukturaufbau verzerre. In Phase 2 (transformative AI / AGI-Szenarien) sinkt der Anteil menschlichen Konsums am Gesamtprodukt so weit ab, dass Konsumsteuern nicht mehr ausreichen; eine Besteuerung autonomer KI-Systeme wird dann als Optimierungsproblem formuliert, dessen Lösung von der intertemporalen Diskontierung der Gesellschaft abhängt. Staatsfonds und Windfall Clauses werden explizit als Instrumente diskutiert. Für die hier geführte Debatte ist das Papier relevant, weil es die Argumentation der Acemoglu-Linie (Kapital- und Konsumbesteuerung statt Arbeitsbesteuerung) mit einer expliziten Phasenlogik untermauert und zugleich die Grenzen spezifischer Roboter-/KI-Steuern im heutigen Stadium markiert.</w:t>
+      </w:r>
+    </w:p>
+    <w:p>
+      <w:pPr>
+        <w:jc w:val="both"/>
+      </w:pPr>
+      <w:r>
+        <w:rPr>
+          <w:rFonts w:ascii="Arial" w:hAnsi="Arial"/>
+          <w:b/>
+          <w:i w:val="0"/>
+          <w:sz w:val="19"/>
+        </w:rPr>
         <w:t>Empirische Forschung:</w:t>
       </w:r>
       <w:r>
@@ -1398,7 +1421,7 @@
           <w:i w:val="0"/>
           <w:sz w:val="19"/>
         </w:rPr>
-        <w:t>Diese Argumentation ist nicht unumstritten, weist aber auf ein reales Dilemma hin: Eine zusätzliche Belastung von Kapital in einer offenen Volkswirtschaft kann zu Kapitalabfluss und Verlagerung von Investitionen führen.</w:t>
+        <w:t>Diese Argumentation ist nicht unumstritten, weist aber auf ein reales Dilemma hin: Eine zusätzliche Belastung von Kapital in einer offenen Volkswirtschaft kann zu Kapitalabfluss und Verlagerung von Investitionen führen. Auch Branchenverbände schließen sich dieser Linie an: Der Handelsverband Deutschland (HDE) warnt in einer Stellungnahme, eine KI-Steuer drohe technologische Innovationen auszubremsen und den Wirtschaftsstandort Deutschland zurückzuwerfen, statt den Einsatz künstlicher Intelligenz zu fördern. Im Zusammenspiel mit der IW-Köln-Position ergibt sich damit ein breites wirtschaftsnahes Ablehnungsfeld für eine spezifische KI- oder Robotersteuer im engeren Sinne — unabhängig davon, wie die strukturelle Finanzierungsfrage des Sozialstaats beantwortet wird.</w:t>
       </w:r>
     </w:p>
     <w:p>
@@ -1562,7 +1585,21 @@
           <w:i w:val="0"/>
           <w:sz w:val="19"/>
         </w:rPr>
-        <w:t>Die Two-Pillar-Reform der OECD (Organisation für wirtschaftliche Zusammenarbeit und Entwicklung; Pillar 1 zur Umverteilung von Besteuerungsrechten, Pillar 2 zur globalen Mindestbesteuerung von 15 %) schafft einen Rahmen, in dem große digitale Konzerne stärker besteuert werden können — allerdings nicht spezifisch für KI-Leistungen.</w:t>
+        <w:t>Die Two-Pillar-Reform der OECD (Organisation für wirtschaftliche Zusammenarbeit und Entwicklung; Pillar 1 zur Umverteilung von Besteuerungsrechten, Pillar 2 zur globalen Mindestbesteuerung von 15 %) schafft einen Rahmen, in dem große digitale Konzerne stärker besteuert werden können — allerdings nicht spezifisch für KI-Leistungen. Deutschland hat mit dem am 23. Dezember 2025 verabschiedeten Gesetz zur Anpassung des Mindeststeuergesetzes den Administrative-Guidance-Stand vom Januar 2025 und die DAC9-Änderungen in nationales Recht übernommen; am 8. April 2026 veröffentlichte das Bundesfinanzministerium eine Entwurfsverordnung mit der Liste der Jurisdiktionen mit qualifizierendem Status für IIR, UTPR und QDMTT. Die erste Frist für Pillar-2-Erklärungen betroffener Konzerne in Deutschland ist der 30. Juni 2026. Damit verschiebt sich die internationale Koordinationsebene von einer zunehmend nur noch politisch-programmatischen auf eine operativ wirksame Stufe — mit Konsequenzen auch für die strategische Frage, ob ergänzende nationale Abgaben sinnvoll an diese Infrastruktur andocken oder sie stören würden.</w:t>
+      </w:r>
+    </w:p>
+    <w:p>
+      <w:pPr>
+        <w:jc w:val="both"/>
+      </w:pPr>
+      <w:r>
+        <w:rPr>
+          <w:rFonts w:ascii="Arial" w:hAnsi="Arial"/>
+          <w:b w:val="0"/>
+          <w:i w:val="0"/>
+          <w:sz w:val="19"/>
+        </w:rPr>
+        <w:t>Innerhalb der EU-Digitalsteuern hat sich 2025/26 das Bild weiter differenziert: Italien hat zum Januar 2025 seine inländische Umsatzschwelle abgeschafft, sodass seither alle Unternehmen oberhalb der globalen Schwelle erfasst werden; Frankreich, Italien, Belgien, Lettland und Spanien erheben einen Satz von 3 %, Österreich und Tschechien einen Satz von 5 %. Meta hat angekündigt, ab dem 1. Juli 2026 länderspezifische Zuschläge von 2 bis 5 % auf Rechnungen an Werbetreibende in Großbritannien, Frankreich, Italien, Spanien, Österreich und der Türkei zu überwälzen — ein praxisrelevantes Beispiel dafür, dass Digitalabgaben ökonomisch schnell die Marktgegenseite erreichen, wenn das Instrument einseitig national gesetzt wird.</w:t>
       </w:r>
     </w:p>
     <w:p>
@@ -1605,16 +1642,16 @@
           <w:i w:val="0"/>
           <w:sz w:val="19"/>
         </w:rPr>
-        <w:t>Sanders-Report (Oktober 2025):</w:t>
-      </w:r>
-      <w:r>
-        <w:rPr>
-          <w:rFonts w:ascii="Arial" w:hAnsi="Arial"/>
-          <w:b w:val="0"/>
-          <w:i w:val="0"/>
-          <w:sz w:val="19"/>
-        </w:rPr>
-        <w:t xml:space="preserve"> US-Senator Bernie Sanders, ranghöchstes Mitglied im HELP-Ausschuss des US-Senats, veröffentlichte einen Bericht, der eine „Robotersteuer" für Unternehmen forderte, die KI einsetzen, um Arbeitsplätze zu ersetzen. Dies ist der bislang konkreteste politische Vorstoß auf US-Bundesebene.</w:t>
+        <w:t>Sanders-Report (Oktober 2025) und AI Data Center Moratorium Act (März 2026):</w:t>
+      </w:r>
+      <w:r>
+        <w:rPr>
+          <w:rFonts w:ascii="Arial" w:hAnsi="Arial"/>
+          <w:b w:val="0"/>
+          <w:i w:val="0"/>
+          <w:sz w:val="19"/>
+        </w:rPr>
+        <w:t xml:space="preserve"> US-Senator Bernie Sanders, ranghöchstes Mitglied im HELP-Ausschuss des US-Senats, veröffentlichte einen Bericht, der eine „Robotersteuer" für Unternehmen forderte, die KI einsetzen, um Arbeitsplätze zu ersetzen. Dies ist der bislang konkreteste politische Vorstoß auf US-Bundesebene. Am 25. März 2026 legten Sanders und Rep. Alexandria Ocasio-Cortez den AI Data Center Moratorium Act vor, der ein befristetes Moratorium auf neue und modernisierte KI-Rechenzentren oberhalb definierter Stromlastschwellen vorsieht, solange keine bundesweiten Sicherheits- und Schutzregeln in Kraft sind. Der Entwurf gilt im Kongress derzeit als wenig aussichtsreich, verdeutlicht aber, dass die Debatte auf dem linken Flügel der Demokraten von der Steuerfrage auf eine breitere Infrastruktur- und Regulierungsfrage ausgeweitet wird.</w:t>
       </w:r>
     </w:p>
     <w:p>
@@ -1689,6 +1726,52 @@
           <w:sz w:val="19"/>
         </w:rPr>
         <w:t xml:space="preserve"> Yang argumentierte, wenn KI-Systeme menschliche Aufgaben ersetzen, solle man Arbeit nicht mehr besteuern. Stattdessen sollten Kapitalerträge und Unternehmensgewinne stärker belastet werden.</w:t>
+      </w:r>
+    </w:p>
+    <w:p>
+      <w:pPr>
+        <w:jc w:val="both"/>
+      </w:pPr>
+      <w:r>
+        <w:rPr>
+          <w:rFonts w:ascii="Arial" w:hAnsi="Arial"/>
+          <w:b/>
+          <w:i w:val="0"/>
+          <w:sz w:val="19"/>
+        </w:rPr>
+        <w:t>Arthur Mensch / Mistral (März 2026):</w:t>
+      </w:r>
+      <w:r>
+        <w:rPr>
+          <w:rFonts w:ascii="Arial" w:hAnsi="Arial"/>
+          <w:b w:val="0"/>
+          <w:i w:val="0"/>
+          <w:sz w:val="19"/>
+        </w:rPr>
+        <w:t xml:space="preserve"> Bemerkenswert ist, dass der Vorstoß für eine europäische Abgabe erstmals aus der KI-Industrie selbst kommt: Arthur Mensch, Mitgründer und CEO des französischen KI-Anbieters Mistral, forderte in einem Gastbeitrag in der Financial Times vom 20. März 2026 eine EU-weite umsatzbasierte Abgabe auf kommerzielle KI-Anbieter. Vorgeschlagen wird ein Satz von 1 bis 1,5 Prozent auf die EU-Umsätze aller Anbieter, die KI-Modelle in Europa in Verkehr bringen — unabhängig vom Sitz des Anbieters. Das Aufkommen solle in einen europäischen Kulturfonds fließen, der Urheber und Inhalte-Produzenten entschädigt, deren Material zum Training der Modelle genutzt wurde. Die Konstruktion ist enger als eine Robotersteuer (sie knüpft an der Trainingsdaten-Problematik an, nicht an der Beschäftigungs-Substitution), demonstriert aber, dass die Logik einer KI-spezifischen Umsatzabgabe jenseits der OpenAI-Linie in der Branche diskutiert wird. Für die deutsche Debatte ist der Vorschlag vor allem als Hinweis relevant, dass eine EU-weite Abgabe auf KI-Dienste technisch als umsatzbasierter Zuschlag gedacht werden kann, der nicht an die Definition von „Robotern" oder „Ersatz menschlicher Arbeit" anknüpfen muss.</w:t>
+      </w:r>
+    </w:p>
+    <w:p>
+      <w:pPr>
+        <w:jc w:val="both"/>
+      </w:pPr>
+      <w:r>
+        <w:rPr>
+          <w:rFonts w:ascii="Arial" w:hAnsi="Arial"/>
+          <w:b/>
+          <w:i w:val="0"/>
+          <w:sz w:val="19"/>
+        </w:rPr>
+        <w:t>Deutsche Bundesregierung / Merz (April 2026):</w:t>
+      </w:r>
+      <w:r>
+        <w:rPr>
+          <w:rFonts w:ascii="Arial" w:hAnsi="Arial"/>
+          <w:b w:val="0"/>
+          <w:i w:val="0"/>
+          <w:sz w:val="19"/>
+        </w:rPr>
+        <w:t xml:space="preserve"> Auf deutscher Seite setzt die im Mai 2025 angetretene Bundesregierung unter Bundeskanzler Friedrich Merz bei KI primär auf einen industriepolitischen Entlastungskurs. In seiner Eröffnungsrede zur Hannover Messe im April 2026 forderte Merz, europäische Regeln für industrielle KI-Anwendungen zu lockern und industrielle KI aus dem „zu engen Korsett" der EU-Regulierung herauszulösen. Eine spezifische KI- oder Robotersteuer ist in der Koalitionsvereinbarung nicht vorgesehen; Deutschland soll stattdessen zur „führenden KI-Nation" werden. Für die steuerpolitische Debatte bedeutet das: Der Impuls kommt in Deutschland auf absehbare Zeit nicht aus der Regierungskoalition, sondern aus der wissenschaftlichen, sozialstaatlichen und europäischen Debatte.</w:t>
       </w:r>
     </w:p>
     <w:p>
@@ -3848,7 +3931,7 @@
           <w:i w:val="0"/>
           <w:sz w:val="19"/>
         </w:rPr>
-        <w:t xml:space="preserve"> Die Teilhabekomponente erfordert eine politische Kraftanstrengung, die über die bisherige Reformdebatte hinausgeht. Ein deutscher oder europäischer Staatsfonds nach norwegischem Vorbild ist institutionell nicht vorhanden; seine Konstruktion würde Jahre beanspruchen. Übergangsweise kommen hybride Modelle in Betracht — etwa eine zweckgebundene Kapitalkomponente in der gesetzlichen Rentenversicherung, die bereits 2024 in Deutschland mit der „Generationenkapital"-Initiative angelegt wurde.</w:t>
+        <w:t xml:space="preserve"> Die Teilhabekomponente erfordert eine politische Kraftanstrengung, die über die bisherige Reformdebatte hinausgeht. Ein deutscher oder europäischer Staatsfonds nach norwegischem Vorbild ist institutionell nicht vorhanden; seine Konstruktion würde Jahre beanspruchen. Übergangsweise kommen hybride Modelle in Betracht — etwa eine zweckgebundene Kapitalkomponente in der gesetzlichen Rentenversicherung, die bereits 2024 in Deutschland mit der „Generationenkapital"-Initiative angelegt und zum Januar 2026 mit einem ersten Kapitalstock von 10 Mrd. Euro aus Bundesmitteln operativ gestartet wurde; Erträge sollen ab etwa Mitte der 2030er-Jahre zur Stabilisierung des Rentenbeitragssatzes beitragen. Diese Konstruktion ist kein KI-spezifischer Teilhabefonds, aber der institutionelle Anknüpfungspunkt, an den eine KI-bezogene Zweckkomponente später andocken könnte.</w:t>
       </w:r>
     </w:p>
     <w:p>
@@ -5312,6 +5395,38 @@
           <w:i w:val="0"/>
           <w:sz w:val="19"/>
         </w:rPr>
+        <w:t xml:space="preserve">Korinek, A., &amp; Lockwood, L. M. (Januar 2026). </w:t>
+      </w:r>
+      <w:r>
+        <w:rPr>
+          <w:rFonts w:ascii="Arial" w:hAnsi="Arial"/>
+          <w:b w:val="0"/>
+          <w:i/>
+          <w:sz w:val="19"/>
+        </w:rPr>
+        <w:t>Public Finance in the Age of AI: A Primer.</w:t>
+      </w:r>
+      <w:r>
+        <w:rPr>
+          <w:rFonts w:ascii="Arial" w:hAnsi="Arial"/>
+          <w:b w:val="0"/>
+          <w:i w:val="0"/>
+          <w:sz w:val="19"/>
+        </w:rPr>
+        <w:t xml:space="preserve"> NBER Working Paper 34873; zugleich Brookings Working Paper. Forthcoming in: The Economics of Transformative AI (NBER Volume). https://www.nber.org/papers/w34873 | https://www.brookings.edu/articles/public-finance-age-ai-primer/</w:t>
+      </w:r>
+    </w:p>
+    <w:p>
+      <w:pPr>
+        <w:jc w:val="both"/>
+      </w:pPr>
+      <w:r>
+        <w:rPr>
+          <w:rFonts w:ascii="Arial" w:hAnsi="Arial"/>
+          <w:b w:val="0"/>
+          <w:i w:val="0"/>
+          <w:sz w:val="19"/>
+        </w:rPr>
         <w:t>Nakatani, R. (2024). Optimal Taxation in the Automated Era. MPRA Paper 121347, University Library of Munich.</w:t>
       </w:r>
     </w:p>
@@ -5660,7 +5775,99 @@
           <w:i w:val="0"/>
           <w:sz w:val="19"/>
         </w:rPr>
-        <w:t>Sanders, B. (Oktober 2025). Bericht zur Robotersteuer / KI-Abgabe. US-Senat, Committee on Health, Education, Labor and Pensions (HELP), Minderheitsbericht. Vollständige Titelangabe zu verifizieren.</w:t>
+        <w:t xml:space="preserve">Sanders, B. (Oktober 2025). </w:t>
+      </w:r>
+      <w:r>
+        <w:rPr>
+          <w:rFonts w:ascii="Arial" w:hAnsi="Arial"/>
+          <w:b w:val="0"/>
+          <w:i/>
+          <w:sz w:val="19"/>
+        </w:rPr>
+        <w:t>The Big Tech Oligarchs' War Against Workers: AI and Automation.</w:t>
+      </w:r>
+      <w:r>
+        <w:rPr>
+          <w:rFonts w:ascii="Arial" w:hAnsi="Arial"/>
+          <w:b w:val="0"/>
+          <w:i w:val="0"/>
+          <w:sz w:val="19"/>
+        </w:rPr>
+        <w:t xml:space="preserve"> US-Senat, Committee on Health, Education, Labor and Pensions (HELP), Minderheitsbericht. https://www.sanders.senate.gov/wp-content/uploads/10.6.2025-The-Big-Tech-Oligarchs-War-Against-Workers.pdf</w:t>
+      </w:r>
+    </w:p>
+    <w:p>
+      <w:pPr>
+        <w:jc w:val="both"/>
+      </w:pPr>
+      <w:r>
+        <w:rPr>
+          <w:rFonts w:ascii="Arial" w:hAnsi="Arial"/>
+          <w:b w:val="0"/>
+          <w:i w:val="0"/>
+          <w:sz w:val="19"/>
+        </w:rPr>
+        <w:t xml:space="preserve">Sanders, B., &amp; Ocasio-Cortez, A. (25. März 2026). </w:t>
+      </w:r>
+      <w:r>
+        <w:rPr>
+          <w:rFonts w:ascii="Arial" w:hAnsi="Arial"/>
+          <w:b w:val="0"/>
+          <w:i/>
+          <w:sz w:val="19"/>
+        </w:rPr>
+        <w:t>AI Data Center Moratorium Act.</w:t>
+      </w:r>
+      <w:r>
+        <w:rPr>
+          <w:rFonts w:ascii="Arial" w:hAnsi="Arial"/>
+          <w:b w:val="0"/>
+          <w:i w:val="0"/>
+          <w:sz w:val="19"/>
+        </w:rPr>
+        <w:t xml:space="preserve"> Pressemitteilung und Gesetzentwurf. https://www.sanders.senate.gov/press-releases/news-sanders-ocasio-cortez-announce-ai-data-center-moratorium-act/</w:t>
+      </w:r>
+    </w:p>
+    <w:p>
+      <w:pPr>
+        <w:jc w:val="both"/>
+      </w:pPr>
+      <w:r>
+        <w:rPr>
+          <w:rFonts w:ascii="Arial" w:hAnsi="Arial"/>
+          <w:b w:val="0"/>
+          <w:i w:val="0"/>
+          <w:sz w:val="19"/>
+        </w:rPr>
+        <w:t>Bundeskanzler Friedrich Merz. (April 2026). Eröffnungsrede zur Hannover Messe. Positionierung zu europäischer KI-Regulierung und industrieller KI. Bundesregierung / Pressemitteilung.</w:t>
+      </w:r>
+    </w:p>
+    <w:p>
+      <w:pPr>
+        <w:jc w:val="both"/>
+      </w:pPr>
+      <w:r>
+        <w:rPr>
+          <w:rFonts w:ascii="Arial" w:hAnsi="Arial"/>
+          <w:b w:val="0"/>
+          <w:i w:val="0"/>
+          <w:sz w:val="19"/>
+        </w:rPr>
+        <w:t>Bundesministerium der Finanzen (BMF). (8. April 2026). Entwurfsverordnung zu Jurisdiktionen mit qualifizierendem Status für IIR, UTPR und QDMTT nach dem Mindeststeuergesetz.</w:t>
+      </w:r>
+    </w:p>
+    <w:p>
+      <w:pPr>
+        <w:jc w:val="both"/>
+      </w:pPr>
+      <w:r>
+        <w:rPr>
+          <w:rFonts w:ascii="Arial" w:hAnsi="Arial"/>
+          <w:b w:val="0"/>
+          <w:i w:val="0"/>
+          <w:sz w:val="19"/>
+        </w:rPr>
+        <w:t>Handelsverband Deutschland (HDE). (2026). Stellungnahme zur KI-Steuer: Neue Technologien nicht ausbremsen, sondern fördern.</w:t>
       </w:r>
     </w:p>
     <w:p>
@@ -5840,6 +6047,94 @@
           <w:sz w:val="19"/>
         </w:rPr>
         <w:t>Yang, A. (März 2026). Interview zur KI-Besteuerung. CNBC.</w:t>
+      </w:r>
+    </w:p>
+    <w:p>
+      <w:pPr>
+        <w:jc w:val="both"/>
+      </w:pPr>
+      <w:r>
+        <w:rPr>
+          <w:rFonts w:ascii="Arial" w:hAnsi="Arial"/>
+          <w:b w:val="0"/>
+          <w:i w:val="0"/>
+          <w:sz w:val="19"/>
+        </w:rPr>
+        <w:t xml:space="preserve">Mensch, A. (20. März 2026). Gastbeitrag zur europäischen KI-Abgabe. </w:t>
+      </w:r>
+      <w:r>
+        <w:rPr>
+          <w:rFonts w:ascii="Arial" w:hAnsi="Arial"/>
+          <w:b w:val="0"/>
+          <w:i/>
+          <w:sz w:val="19"/>
+        </w:rPr>
+        <w:t>Financial Times</w:t>
+      </w:r>
+      <w:r>
+        <w:rPr>
+          <w:rFonts w:ascii="Arial" w:hAnsi="Arial"/>
+          <w:b w:val="0"/>
+          <w:i w:val="0"/>
+          <w:sz w:val="19"/>
+        </w:rPr>
+        <w:t>; Zusammenfassungen u. a. Tech.eu, AI Business, IT Pro, April 2026. https://tech.eu/2026/03/20/ai-model-giants-should-pay-a-levy-to-operate-in-europe-says-mistral-boss/</w:t>
+      </w:r>
+    </w:p>
+    <w:p>
+      <w:pPr>
+        <w:jc w:val="both"/>
+      </w:pPr>
+      <w:r>
+        <w:rPr>
+          <w:rFonts w:ascii="Arial" w:hAnsi="Arial"/>
+          <w:b w:val="0"/>
+          <w:i w:val="0"/>
+          <w:sz w:val="19"/>
+        </w:rPr>
+        <w:t>Fortune. (April 2026). How people are reacting to OpenAI's 13-page policy paper on AI superintelligence — Kritik „Regulatory Nihilism". https://fortune.com/2026/04/06/sam-altman-says-ai-superintelligence-is-so-big-that-we-need-a-new-deal-critics-say-openais-policy-ideas-are-a-cover-for-regulatory-nihilism/</w:t>
+      </w:r>
+    </w:p>
+    <w:p>
+      <w:pPr>
+        <w:jc w:val="both"/>
+      </w:pPr>
+      <w:r>
+        <w:rPr>
+          <w:rFonts w:ascii="Arial" w:hAnsi="Arial"/>
+          <w:b w:val="0"/>
+          <w:i w:val="0"/>
+          <w:sz w:val="19"/>
+        </w:rPr>
+        <w:t>Tech Policy Press. (April 2026). OpenAI's New „Industrial Policy for the Intelligence Age" is a Policymercial. https://www.techpolicy.press/openais-new-industrial-policy-for-the-intelligence-age-is-a-policymercial/</w:t>
+      </w:r>
+    </w:p>
+    <w:p>
+      <w:pPr>
+        <w:jc w:val="both"/>
+      </w:pPr>
+      <w:r>
+        <w:rPr>
+          <w:rFonts w:ascii="Arial" w:hAnsi="Arial"/>
+          <w:b w:val="0"/>
+          <w:i w:val="0"/>
+          <w:sz w:val="19"/>
+        </w:rPr>
+        <w:t>Euronews. (27. Januar 2026). Taxing tech: How do digital services levies differ across Europe?</w:t>
+      </w:r>
+    </w:p>
+    <w:p>
+      <w:pPr>
+        <w:jc w:val="both"/>
+      </w:pPr>
+      <w:r>
+        <w:rPr>
+          <w:rFonts w:ascii="Arial" w:hAnsi="Arial"/>
+          <w:b w:val="0"/>
+          <w:i w:val="0"/>
+          <w:sz w:val="19"/>
+        </w:rPr>
+        <w:t>IAB. (März 2026). Prognose für 2026: Sozialversicherungspflichtige Beschäftigung schrumpft erstmals seit 2009 leicht; Transformationskrise und Demografie überlagern KI-Effekte. https://iab.de/presseinfo/iab-prognose-fuer-2026-fiskalpolitischer-rueckenwind-trifft-auf-geopolitischen-gegenwind/</w:t>
       </w:r>
     </w:p>
     <w:p>
@@ -5942,7 +6237,7 @@
         <w:color w:val="999999"/>
         <w:sz w:val="15"/>
       </w:rPr>
-      <w:t>Version 4.0 — April 2026 — CC BY 4.0</w:t>
+      <w:t>Version 5.0 — April 2026 — CC BY 4.0</w:t>
       <w:tab/>
       <w:t xml:space="preserve">Seite </w:t>
     </w:r>

</xml_diff>

<commit_message>
Version 5.0 -> 6.0: Update Dezember 2025 - April 2026
Sechs belegbare Neuigkeiten aufgenommen:
- Anthropic Economic Index 2026 (Kap. 3.5 / 11.1)
- OECD Pillar-2-Side-by-Side-Paket Januar 2026 (Kap. 4.4 / 11.3)
- No Robot Bosses Act H.R. 6371 (Kap. 4.5 / 11.3)
- Alterssicherungskommission und Kommission zur Sozialstaatsreform 2026
  (Kap. 5.2, 8.6, 11.3)
- Q1-2026-Tech-Layoff-Daten mit KI-Attribution (Kap. 1.1)
- Konkretisierung des Altman-Anschlags (Verdaechtiger, zweiter Vorfall;
  Kap. 8.4 / 11.5)

Kollateralfixes:
- build_pdf.py und build_docx.py: Versionsstring 4.0 -> 6.0
- README.md: Version 5.0 -> 6.0, KI-Offenlegung und Zitiervorschlag
- Claude.md: Version 5.0 -> 6.0, Seitenangabe aktualisiert

Validierung gemaess Validierung.md vollstaendig durchgefuehrt und in
Validierung-Ergebnisse.md protokolliert (18 Pruefschritte, ein Befund
behoben).

PDF und DOCX neu erzeugt.
</commit_message>
<xml_diff>
--- a/Arbeitspapier_KI_Robotik_Besteuerung.docx
+++ b/Arbeitspapier_KI_Robotik_Besteuerung.docx
@@ -112,7 +112,7 @@
           <w:color w:val="666666"/>
           <w:sz w:val="18"/>
         </w:rPr>
-        <w:t>Version 4.0</w:t>
+        <w:t>Version 6.0</w:t>
       </w:r>
     </w:p>
     <w:p>
@@ -184,7 +184,7 @@
           <w:i w:val="0"/>
           <w:sz w:val="19"/>
         </w:rPr>
-        <w:t>Der Einsatz von KI-Systemen und Robotik in produktiven und dienstleistenden Tätigkeiten beschleunigt sich. Zwei parallele Entwicklungen erzeugen politischen Handlungsdruck: Einerseits warnen Studien vor erheblichen Verschiebungen auf dem Arbeitsmarkt — das IAB (Institut für Arbeitsmarkt- und Berufsforschung) rechnet im KI-Szenario für Deutschland mit einem Wegfall oder Neuentstehen von rund 1,6 Millionen Stellen in den nächsten 15 Jahren bei gleichzeitigem Wertschöpfungszuwachs von 4,5 Billionen Euro; kurzfristig erwartet das IAB in seiner Prognose für 2025/2026 einen leichten Rückgang der Erwerbstätigkeit um etwa 20.000 Personen und in dreizehn der sechzehn Bundesländer einen weiteren Anstieg der Arbeitslosigkeit. Andererseits steht die Finanzierung der sozialen Sicherungssysteme — insbesondere der paritätisch über Löhne finanzierten Zweige Kranken-, Pflege-, Renten- und Arbeitslosenversicherung — vor strukturellen Herausforderungen durch den demografischen Wandel.</w:t>
+        <w:t>Der Einsatz von KI-Systemen und Robotik in produktiven und dienstleistenden Tätigkeiten beschleunigt sich. Zwei parallele Entwicklungen erzeugen politischen Handlungsdruck: Einerseits warnen Studien vor erheblichen Verschiebungen auf dem Arbeitsmarkt — das IAB (Institut für Arbeitsmarkt- und Berufsforschung) rechnet im KI-Szenario für Deutschland mit einem Wegfall oder Neuentstehen von rund 1,6 Millionen Stellen in den nächsten 15 Jahren bei gleichzeitigem Wertschöpfungszuwachs von 4,5 Billionen Euro; kurzfristig erwartet das IAB in seiner Prognose für 2025/2026 einen leichten Rückgang der Erwerbstätigkeit um etwa 20.000 Personen und in dreizehn der sechzehn Bundesländer einen weiteren Anstieg der Arbeitslosigkeit. Parallel dazu dokumentiert eine Branchenauswertung für das erste Quartal 2026 rund 78.500 Stellenstreichungen in der weltweiten Tech-Industrie, davon etwa 48 % explizit als KI- oder Automatisierungsmaßnahmen begründet; zugleich stiegen KI-bezogene Stellenausschreibungen im selben Zeitraum deutlich an, was auf einen strukturellen Umbau der Beschäftigungszusammensetzung hindeutet. Andererseits steht die Finanzierung der sozialen Sicherungssysteme — insbesondere der paritätisch über Löhne finanzierten Zweige Kranken-, Pflege-, Renten- und Arbeitslosenversicherung — vor strukturellen Herausforderungen durch den demografischen Wandel.</w:t>
       </w:r>
     </w:p>
     <w:p>
@@ -1196,7 +1196,25 @@
           <w:i w:val="0"/>
           <w:sz w:val="19"/>
         </w:rPr>
-        <w:t xml:space="preserve">Offen ist die Frage nach der gesamtwirtschaftlichen Größenordnung KI-induzierter Verschiebungen. Acemoglu schätzt in „The Simple Macroeconomics of AI" (NBER Working Paper 32487, 2024) die BIP- und TFP-Effekte generativer KI über einen Zeithorizont von zehn Jahren auf einen moderaten Bereich (BIP-Effekt rund 0,9 – 1,1 %; TFP-Steigerung 0,53 – 0,66 %). Auch andere makroökonomische Kalibrierungen liegen deutlich unter den expliziten oder impliziten Erwartungen populärer Disruptionsnarrative. Das bedeutet nicht, dass die Finanzierungsfrage des Sozialstaats damit entschärft wäre — sektorale Verschiebungen können trotz moderater aggregierter Effekte erheblich sein —, es spricht aber dafür, das steuerpolitische Instrumentarium </w:t>
+        <w:t xml:space="preserve">Offen ist die Frage nach der gesamtwirtschaftlichen Größenordnung KI-induzierter Verschiebungen. Acemoglu schätzt in „The Simple Macroeconomics of AI" (NBER Working Paper 32487, 2024) die BIP- und TFP-Effekte generativer KI über einen Zeithorizont von zehn Jahren auf einen moderaten Bereich (BIP-Effekt rund 0,9 – 1,1 %; TFP-Steigerung 0,53 – 0,66 %). Auch andere makroökonomische Kalibrierungen liegen deutlich unter den expliziten oder impliziten Erwartungen populärer Disruptionsnarrative. Der </w:t>
+      </w:r>
+      <w:r>
+        <w:rPr>
+          <w:rFonts w:ascii="Arial" w:hAnsi="Arial"/>
+          <w:b w:val="0"/>
+          <w:i/>
+          <w:sz w:val="19"/>
+        </w:rPr>
+        <w:t>Anthropic Economic Index</w:t>
+      </w:r>
+      <w:r>
+        <w:rPr>
+          <w:rFonts w:ascii="Arial" w:hAnsi="Arial"/>
+          <w:b w:val="0"/>
+          <w:i w:val="0"/>
+          <w:sz w:val="19"/>
+        </w:rPr>
+        <w:t xml:space="preserve"> (Stand 2026), der Millionen tatsächlicher KI-Nutzungsinteraktionen auswertet, kommt zu einer komplementären Beobachtung: Trotz hohen theoretischen Automatisierungspotenzials zeigen sich bislang keine klaren aggregierten Arbeitslosigkeitseffekte; der größere Teil der KI-Nutzung ist unterstützend und kollaborativ ausgestaltet, während vollständige Substitution auf einen kleineren Anteil der Tasks beschränkt bleibt. Frühe Struktureffekte — insbesondere auf Berufseinsteigerinnen und -einsteiger in kognitiven Routinetätigkeiten — sind gleichwohl erkennbar. Das bedeutet nicht, dass die Finanzierungsfrage des Sozialstaats damit entschärft wäre — sektorale Verschiebungen können trotz moderater aggregierter Effekte erheblich sein —, es spricht aber dafür, das steuerpolitische Instrumentarium </w:t>
       </w:r>
       <w:r>
         <w:rPr>
@@ -1603,7 +1621,7 @@
           <w:i w:val="0"/>
           <w:sz w:val="19"/>
         </w:rPr>
-        <w:t>Die Two-Pillar-Reform der OECD (Organisation für wirtschaftliche Zusammenarbeit und Entwicklung; Pillar 1 zur Umverteilung von Besteuerungsrechten, Pillar 2 zur globalen Mindestbesteuerung von 15 %) schafft einen Rahmen, in dem große digitale Konzerne stärker besteuert werden können — allerdings nicht spezifisch für KI-Leistungen.</w:t>
+        <w:t>Die Two-Pillar-Reform der OECD (Organisation für wirtschaftliche Zusammenarbeit und Entwicklung; Pillar 1 zur Umverteilung von Besteuerungsrechten, Pillar 2 zur globalen Mindestbesteuerung von 15 %) schafft einen Rahmen, in dem große digitale Konzerne stärker besteuert werden können — allerdings nicht spezifisch für KI-Leistungen. Im Januar 2026 hat das OECD Inclusive Framework mit dem „Side-by-Side Package" einen verfeinerten Umsetzungsrahmen für Pillar 2 vorgelegt (neue administrative Leitlinien, zusätzliche Safe-Harbor-Regelungen, aktualisierter zentraler Rechtsaktenkatalog zum Stand 1. Dezember 2025); die fortlaufende Arbeitsagenda zeigt, dass das internationale Koordinationsgerüst weiter belastbar ist — bleibt aber für KI-spezifische Anknüpfungspunkte (etwa Abschöpfung inländischer KI-Nutzung) ausbaufähig.</w:t>
       </w:r>
     </w:p>
     <w:p>
@@ -1730,6 +1748,29 @@
           <w:sz w:val="19"/>
         </w:rPr>
         <w:t xml:space="preserve"> Yang argumentierte, wenn KI-Systeme menschliche Aufgaben ersetzen, solle man Arbeit nicht mehr besteuern. Stattdessen sollten Kapitalerträge und Unternehmensgewinne stärker belastet werden.</w:t>
+      </w:r>
+    </w:p>
+    <w:p>
+      <w:pPr>
+        <w:jc w:val="both"/>
+      </w:pPr>
+      <w:r>
+        <w:rPr>
+          <w:rFonts w:ascii="Arial" w:hAnsi="Arial"/>
+          <w:b/>
+          <w:i w:val="0"/>
+          <w:sz w:val="19"/>
+        </w:rPr>
+        <w:t>No Robot Bosses Act (H.R. 6371, US-Repräsentantenhaus, Dezember 2025):</w:t>
+      </w:r>
+      <w:r>
+        <w:rPr>
+          <w:rFonts w:ascii="Arial" w:hAnsi="Arial"/>
+          <w:b w:val="0"/>
+          <w:i w:val="0"/>
+          <w:sz w:val="19"/>
+        </w:rPr>
+        <w:t xml:space="preserve"> Parallel zum steuerpolitischen Diskurs haben Abgeordnete um Suzanne Bonamici (D-OR) am 3. Dezember 2025 einen Gesetzentwurf eingebracht, der Arbeitgebern verbietet, sich bei Einstellungs-, Kündigungs- und Disziplinarentscheidungen ausschließlich auf automatisierte Entscheidungssysteme zu stützen; vorgesehen sind menschliche Aufsicht, regelmäßige Systemtests, Offenlegungspflichten gegenüber Beschäftigten und ein Klagerecht im Schadensfall. Der Entwurf ist keine Besteuerungsinitiative, er markiert aber — komplementär zum Sanders-Vorstoß und zum OpenAI-Papier — einen weiteren Pfad politischer Reaktion auf KI-induzierten Arbeitsplatzabbau: arbeitsrechtliche Leitplanken statt oder ergänzend zu fiskalischer Abschöpfung. Für die Besteuerungsdebatte relevant ist das insofern, als Definitions- und Nachweisfragen („wann entscheidet ein algorithmisches System allein?") strukturell dieselben sind, die auch einer zielgerichteten Ersatzabgabe (Typ 5 nach § 2.1) entgegenstehen.</w:t>
       </w:r>
     </w:p>
     <w:p>
@@ -2165,6 +2206,47 @@
     </w:p>
     <w:p>
       <w:pPr>
+        <w:jc w:val="both"/>
+      </w:pPr>
+      <w:r>
+        <w:rPr>
+          <w:rFonts w:ascii="Arial" w:hAnsi="Arial"/>
+          <w:b/>
+          <w:i w:val="0"/>
+          <w:sz w:val="19"/>
+        </w:rPr>
+        <w:t>Aktueller Reformprozess (2026):</w:t>
+      </w:r>
+      <w:r>
+        <w:rPr>
+          <w:rFonts w:ascii="Arial" w:hAnsi="Arial"/>
+          <w:b w:val="0"/>
+          <w:i w:val="0"/>
+          <w:sz w:val="19"/>
+        </w:rPr>
+        <w:t xml:space="preserve"> Die von Arbeitsministerin Bärbel Bas (SPD) berufene Alterssicherungskommission (ASK) hat am 7. Januar 2026 ihre Arbeit aufgenommen und soll bis Mitte 2026 Vorschläge zur Weiterentwicklung der drei Alterssicherungs-Säulen vorlegen. Ihr Prüfauftrag umfasst ausdrücklich auch die </w:t>
+      </w:r>
+      <w:r>
+        <w:rPr>
+          <w:rFonts w:ascii="Arial" w:hAnsi="Arial"/>
+          <w:b w:val="0"/>
+          <w:i/>
+          <w:sz w:val="19"/>
+        </w:rPr>
+        <w:t>Einbeziehung weiterer Einkommensarten in die Beitragsbemessung</w:t>
+      </w:r>
+      <w:r>
+        <w:rPr>
+          <w:rFonts w:ascii="Arial" w:hAnsi="Arial"/>
+          <w:b w:val="0"/>
+          <w:i w:val="0"/>
+          <w:sz w:val="19"/>
+        </w:rPr>
+        <w:t xml:space="preserve"> — also Kapitalerträge, Mieten und weitere nicht-lohnbasierte Einkunftsarten. Damit wird das Kernelement der Bürgerversicherung erstmals in einem formal eingesetzten Regierungsgremium geprüft. Ergänzend hat die Kommission zur Sozialstaatsreform (KSR) am 27. Januar 2026 ihre 26 Empfehlungen übergeben; sie zielen primär auf die steuerfinanzierten Leistungssysteme, enthalten aber mit dem Leitbild „sozialversicherungspflichtige Vollzeit- und vollzeitnahe Beschäftigung attraktiver machen" eine Stoßrichtung, die mit einer wertschöpfungsbasierten Finanzierungsreform (§ 5.1) kompatibel ist.</w:t>
+      </w:r>
+    </w:p>
+    <w:p>
+      <w:pPr>
         <w:spacing w:before="120" w:after="80"/>
       </w:pPr>
       <w:r>
@@ -3715,7 +3797,7 @@
           <w:i w:val="0"/>
           <w:sz w:val="19"/>
         </w:rPr>
-        <w:t>Dass dieses Argument keinen rein akademischen Status hat, zeigt ein Vorfall wenige Tage nach der OpenAI-Veröffentlichung: In der Nacht zum 10. April 2026 griff ein mutmaßlicher Einzeltäter das Haus des OpenAI-Vorstandsvorsitzenden Sam Altman in San Francisco mit einem Molotowcocktail an und steuerte anschließend die OpenAI-Zentrale an; der Tatverdächtige wurde mit Schriften aufgegriffen, die sich auf befürchtete KI-bedingte Arbeitsplatzverluste und eine „drohende Auslöschung" bezogen. Der Anschlag ist als Einzeltat kein Beleg für eine breite Bewegung, er illustriert aber, wie nah die Debatte um Automatisierung und soziale Sicherung inzwischen an Emotionen gerückt ist, die historisch Transformationskonflikte begleitet haben — und damit den Preis, den ausgebliebene politische Antworten auch in stabilen Demokratien kosten können.</w:t>
+        <w:t>Dass dieses Argument keinen rein akademischen Status hat, zeigt ein Vorfall wenige Tage nach der OpenAI-Veröffentlichung: In der Nacht zum 10. April 2026 griff ein mutmaßlicher Einzeltäter das Haus des OpenAI-Vorstandsvorsitzenden Sam Altman in San Francisco mit einem Molotowcocktail an und steuerte anschließend die OpenAI-Zentrale an; der Tatverdächtige — Daniel Moreno-Gama, 20 Jahre alt, aus dem Großraum Houston — wurde mit Schriften aufgegriffen, die sich auf befürchtete KI-bedingte Arbeitsplatzverluste und eine „drohende Auslöschung" bezogen. Laut Anklage führte er eine Liste mit Namen und Adressen von Vorständen und Investoren mehrerer KI-Unternehmen mit sich; er wurde am 13. April 2026 u. a. wegen versuchten Mordes und versuchter Brandstiftung angeklagt und ohne Kaution in Haft genommen. In der Nacht zum 12. April 2026 kam es zu einem weiteren Vorfall an Altmans Haus, bei dem ein Schuss aus einem vorbeifahrenden Fahrzeug fiel; zwei Personen wurden kurz darauf festgenommen. Der Anschlag ist als Einzeltat kein Beleg für eine breite Bewegung, er illustriert aber, wie nah die Debatte um Automatisierung und soziale Sicherung inzwischen an Emotionen gerückt ist, die historisch Transformationskonflikte begleitet haben — und damit den Preis, den ausgebliebene politische Antworten auch in stabilen Demokratien kosten können.</w:t>
       </w:r>
     </w:p>
     <w:p>
@@ -3903,7 +3985,7 @@
           <w:i w:val="0"/>
           <w:sz w:val="19"/>
         </w:rPr>
-        <w:t xml:space="preserve"> Die Teilhabekomponente erfordert eine politische Kraftanstrengung, die über die bisherige Reformdebatte hinausgeht. Ein deutscher oder europäischer Staatsfonds nach norwegischem Vorbild ist institutionell nicht vorhanden; seine Konstruktion würde Jahre beanspruchen. Übergangsweise kommen hybride Modelle in Betracht — etwa eine zweckgebundene Kapitalkomponente in der gesetzlichen Rentenversicherung, die in Deutschland 2024 mit der „Generationenkapital"-Initiative angelegt und im Januar 2026 mit einer ersten Einzahlung von rund zehn Milliarden Euro operativ gestartet wurde. Jährliche Bundesdarlehen in Höhe von zwölf Milliarden Euro, jeweils um drei Prozent fortgeschrieben, sollen den Kapitalstock bis Mitte der 2030er-Jahre auf mindestens 200 Milliarden Euro bringen; im Start­jahr hat das Vehikel nach Angaben der verwaltenden Stiftung eine Rendite von rund 7,2 % erzielt. Diese Architektur ließe sich um eine KI-spezifische Zweckbindung erweitern, ohne eine neue Institution aufbauen zu müssen.</w:t>
+        <w:t xml:space="preserve"> Die Teilhabekomponente erfordert eine politische Kraftanstrengung, die über die bisherige Reformdebatte hinausgeht. Ein deutscher oder europäischer Staatsfonds nach norwegischem Vorbild ist institutionell nicht vorhanden; seine Konstruktion würde Jahre beanspruchen. Übergangsweise kommen hybride Modelle in Betracht — etwa eine zweckgebundene Kapitalkomponente in der gesetzlichen Rentenversicherung, die in Deutschland 2024 mit der „Generationenkapital"-Initiative angelegt und im Januar 2026 mit einer ersten Einzahlung von rund zehn Milliarden Euro operativ gestartet wurde. Jährliche Bundesdarlehen in Höhe von zwölf Milliarden Euro, jeweils um drei Prozent fortgeschrieben, sollen den Kapitalstock bis Mitte der 2030er-Jahre auf mindestens 200 Milliarden Euro bringen; im Start­jahr hat das Vehikel nach Angaben der verwaltenden Stiftung eine Rendite von rund 7,2 % erzielt. Diese Architektur ließe sich um eine KI-spezifische Zweckbindung erweitern, ohne eine neue Institution aufbauen zu müssen. Flankierend hat der laufende Reformprozess 2026 — die Alterssicherungskommission und die Kommission zur Sozialstaatsreform (§ 5.2) — das politische Gelegenheitsfenster geöffnet, in dem die Einbeziehung weiterer Einkommensarten und die Finanzierungsarchitektur gemeinsam neu justiert werden können.</w:t>
       </w:r>
     </w:p>
     <w:p>
@@ -5436,6 +5518,38 @@
     </w:p>
     <w:p>
       <w:pPr>
+        <w:jc w:val="both"/>
+      </w:pPr>
+      <w:r>
+        <w:rPr>
+          <w:rFonts w:ascii="Arial" w:hAnsi="Arial"/>
+          <w:b w:val="0"/>
+          <w:i w:val="0"/>
+          <w:sz w:val="19"/>
+        </w:rPr>
+        <w:t xml:space="preserve">Anthropic. (2026). </w:t>
+      </w:r>
+      <w:r>
+        <w:rPr>
+          <w:rFonts w:ascii="Arial" w:hAnsi="Arial"/>
+          <w:b w:val="0"/>
+          <w:i/>
+          <w:sz w:val="19"/>
+        </w:rPr>
+        <w:t>Anthropic Economic Index — Understanding AI's Effects.</w:t>
+      </w:r>
+      <w:r>
+        <w:rPr>
+          <w:rFonts w:ascii="Arial" w:hAnsi="Arial"/>
+          <w:b w:val="0"/>
+          <w:i w:val="0"/>
+          <w:sz w:val="19"/>
+        </w:rPr>
+        <w:t xml:space="preserve"> Laufender Forschungsindex auf Basis ausgewerteter Claude-Nutzungsdaten. https://www.anthropic.com/economic-index</w:t>
+      </w:r>
+    </w:p>
+    <w:p>
+      <w:pPr>
         <w:spacing w:before="120" w:after="80"/>
       </w:pPr>
       <w:r>
@@ -5733,6 +5847,134 @@
           <w:i w:val="0"/>
           <w:sz w:val="19"/>
         </w:rPr>
+        <w:t xml:space="preserve">Bundesministerium für Arbeit und Soziales (BMAS). (2026). </w:t>
+      </w:r>
+      <w:r>
+        <w:rPr>
+          <w:rFonts w:ascii="Arial" w:hAnsi="Arial"/>
+          <w:b w:val="0"/>
+          <w:i/>
+          <w:sz w:val="19"/>
+        </w:rPr>
+        <w:t>Rentenkommission 2026 / Alterssicherungskommission (ASK) — Auftrag und Arbeitsstand.</w:t>
+      </w:r>
+      <w:r>
+        <w:rPr>
+          <w:rFonts w:ascii="Arial" w:hAnsi="Arial"/>
+          <w:b w:val="0"/>
+          <w:i w:val="0"/>
+          <w:sz w:val="19"/>
+        </w:rPr>
+        <w:t xml:space="preserve"> https://www.bmas.de/DE/Soziales/Rente-und-Altersvorsorge/Rentenreform-2025/Rentenkommission-2026/rentenkommission-2026.html</w:t>
+      </w:r>
+    </w:p>
+    <w:p>
+      <w:pPr>
+        <w:jc w:val="both"/>
+      </w:pPr>
+      <w:r>
+        <w:rPr>
+          <w:rFonts w:ascii="Arial" w:hAnsi="Arial"/>
+          <w:b w:val="0"/>
+          <w:i w:val="0"/>
+          <w:sz w:val="19"/>
+        </w:rPr>
+        <w:t xml:space="preserve">Bundesregierung. (27. Januar 2026). </w:t>
+      </w:r>
+      <w:r>
+        <w:rPr>
+          <w:rFonts w:ascii="Arial" w:hAnsi="Arial"/>
+          <w:b w:val="0"/>
+          <w:i/>
+          <w:sz w:val="19"/>
+        </w:rPr>
+        <w:t>Kommission zur Sozialstaatsreform: Bericht mit 26 Empfehlungen an BMAS-Ministerin Bärbel Bas übergeben.</w:t>
+      </w:r>
+      <w:r>
+        <w:rPr>
+          <w:rFonts w:ascii="Arial" w:hAnsi="Arial"/>
+          <w:b w:val="0"/>
+          <w:i w:val="0"/>
+          <w:sz w:val="19"/>
+        </w:rPr>
+        <w:t xml:space="preserve"> https://www.bundesregierung.de/breg-de/aktuelles/reform-sozialstaatskommision-2404220</w:t>
+      </w:r>
+    </w:p>
+    <w:p>
+      <w:pPr>
+        <w:jc w:val="both"/>
+      </w:pPr>
+      <w:r>
+        <w:rPr>
+          <w:rFonts w:ascii="Arial" w:hAnsi="Arial"/>
+          <w:b w:val="0"/>
+          <w:i w:val="0"/>
+          <w:sz w:val="19"/>
+        </w:rPr>
+        <w:t xml:space="preserve">OECD Inclusive Framework on BEPS. (Januar 2026). </w:t>
+      </w:r>
+      <w:r>
+        <w:rPr>
+          <w:rFonts w:ascii="Arial" w:hAnsi="Arial"/>
+          <w:b w:val="0"/>
+          <w:i/>
+          <w:sz w:val="19"/>
+        </w:rPr>
+        <w:t>Global Anti-Base Erosion Model Rules (Pillar Two) — Side-by-Side Package, Administrative Guidance und zentraler Rechtsaktenkatalog (Stand 1. Dezember 2025).</w:t>
+      </w:r>
+      <w:r>
+        <w:rPr>
+          <w:rFonts w:ascii="Arial" w:hAnsi="Arial"/>
+          <w:b w:val="0"/>
+          <w:i w:val="0"/>
+          <w:sz w:val="19"/>
+        </w:rPr>
+        <w:t xml:space="preserve"> https://www.oecd.org/en/about/news/press-releases/2025/12/international-community-agrees-way-forward-on-global-minimum-tax-package.html</w:t>
+      </w:r>
+    </w:p>
+    <w:p>
+      <w:pPr>
+        <w:jc w:val="both"/>
+      </w:pPr>
+      <w:r>
+        <w:rPr>
+          <w:rFonts w:ascii="Arial" w:hAnsi="Arial"/>
+          <w:b w:val="0"/>
+          <w:i w:val="0"/>
+          <w:sz w:val="19"/>
+        </w:rPr>
+        <w:t xml:space="preserve">US House of Representatives, 119th Congress. (3. Dezember 2025). </w:t>
+      </w:r>
+      <w:r>
+        <w:rPr>
+          <w:rFonts w:ascii="Arial" w:hAnsi="Arial"/>
+          <w:b w:val="0"/>
+          <w:i/>
+          <w:sz w:val="19"/>
+        </w:rPr>
+        <w:t>H.R. 6371 — No Robot Bosses Act</w:t>
+      </w:r>
+      <w:r>
+        <w:rPr>
+          <w:rFonts w:ascii="Arial" w:hAnsi="Arial"/>
+          <w:b w:val="0"/>
+          <w:i w:val="0"/>
+          <w:sz w:val="19"/>
+        </w:rPr>
+        <w:t xml:space="preserve"> (Einbringer: Suzanne Bonamici et al.). https://www.congress.gov/bill/119th-congress/house-bill/6371</w:t>
+      </w:r>
+    </w:p>
+    <w:p>
+      <w:pPr>
+        <w:jc w:val="both"/>
+      </w:pPr>
+      <w:r>
+        <w:rPr>
+          <w:rFonts w:ascii="Arial" w:hAnsi="Arial"/>
+          <w:b w:val="0"/>
+          <w:i w:val="0"/>
+          <w:sz w:val="19"/>
+        </w:rPr>
         <w:t>Europäische Union. (2024). Verordnung (EU) 2024/1689 des Europäischen Parlaments und des Rates vom 13. Juni 2024 zur Festlegung harmonisierter Vorschriften für künstliche Intelligenz (</w:t>
       </w:r>
       <w:r>
@@ -6054,7 +6296,7 @@
           <w:i w:val="0"/>
           <w:sz w:val="19"/>
         </w:rPr>
-        <w:t>NPR. (13. April 2026). Man accused in Molotov cocktail attack of OpenAI CEO's home charged with attempted murder.</w:t>
+        <w:t>NPR. (13. April 2026). Man accused in Molotov cocktail attack of OpenAI CEO's home charged with attempted murder. https://www.npr.org/2026/04/13/g-s1-117320/openai-sam-altman-molotov-cocktail</w:t>
       </w:r>
     </w:p>
     <w:p>
@@ -6082,7 +6324,85 @@
           <w:i w:val="0"/>
           <w:sz w:val="19"/>
         </w:rPr>
-        <w:t>SF Standard. (12. April 2026). OpenAI published a New Deal for AI. Days later, someone firebombed Sam Altman's house.</w:t>
+        <w:t>SF Standard. (12. April 2026). OpenAI published a New Deal for AI. Days later, someone firebombed Sam Altman's house. https://sfstandard.com/2026/04/12/openai-wants-new-deal-ai-attack-sam-altman-s-home-made-urgent/</w:t>
+      </w:r>
+    </w:p>
+    <w:p>
+      <w:pPr>
+        <w:jc w:val="both"/>
+      </w:pPr>
+      <w:r>
+        <w:rPr>
+          <w:rFonts w:ascii="Arial" w:hAnsi="Arial"/>
+          <w:b w:val="0"/>
+          <w:i w:val="0"/>
+          <w:sz w:val="19"/>
+        </w:rPr>
+        <w:t>CNN Business. (13./14. April 2026). Suspect in attack at Sam Altman's house charged with attempted murder and attempted arson / held without bail. https://www.cnn.com/2026/04/13/tech/sam-altman-openai-arrest-charges</w:t>
+      </w:r>
+    </w:p>
+    <w:p>
+      <w:pPr>
+        <w:jc w:val="both"/>
+      </w:pPr>
+      <w:r>
+        <w:rPr>
+          <w:rFonts w:ascii="Arial" w:hAnsi="Arial"/>
+          <w:b w:val="0"/>
+          <w:i w:val="0"/>
+          <w:sz w:val="19"/>
+        </w:rPr>
+        <w:t xml:space="preserve">Fortune. (14. April 2026). </w:t>
+      </w:r>
+      <w:r>
+        <w:rPr>
+          <w:rFonts w:ascii="Arial" w:hAnsi="Arial"/>
+          <w:b w:val="0"/>
+          <w:i/>
+          <w:sz w:val="19"/>
+        </w:rPr>
+        <w:t>Daniel Moreno-Gama, charged in attack on Sam Altman's house, had CEO kill list, prosecutors say.</w:t>
+      </w:r>
+      <w:r>
+        <w:rPr>
+          <w:rFonts w:ascii="Arial" w:hAnsi="Arial"/>
+          <w:b w:val="0"/>
+          <w:i w:val="0"/>
+          <w:sz w:val="19"/>
+        </w:rPr>
+        <w:t xml:space="preserve"> https://fortune.com/2026/04/14/man-charged-in-arson-attack-on-sam-altman-ai-ceo-kill-list-prosecutors-say/</w:t>
+      </w:r>
+    </w:p>
+    <w:p>
+      <w:pPr>
+        <w:jc w:val="both"/>
+      </w:pPr>
+      <w:r>
+        <w:rPr>
+          <w:rFonts w:ascii="Arial" w:hAnsi="Arial"/>
+          <w:b w:val="0"/>
+          <w:i w:val="0"/>
+          <w:sz w:val="19"/>
+        </w:rPr>
+        <w:t xml:space="preserve">Tom's Hardware / TechRadar / TweakTown. (April 2026). </w:t>
+      </w:r>
+      <w:r>
+        <w:rPr>
+          <w:rFonts w:ascii="Arial" w:hAnsi="Arial"/>
+          <w:b w:val="0"/>
+          <w:i/>
+          <w:sz w:val="19"/>
+        </w:rPr>
+        <w:t>Tech industry lays off nearly 80,000 employees in the first quarter of 2026 — almost 50 % of affected positions cut due to AI.</w:t>
+      </w:r>
+      <w:r>
+        <w:rPr>
+          <w:rFonts w:ascii="Arial" w:hAnsi="Arial"/>
+          <w:b w:val="0"/>
+          <w:i w:val="0"/>
+          <w:sz w:val="19"/>
+        </w:rPr>
+        <w:t xml:space="preserve"> Branchenauswertung zu Q1-2026-Tech-Layoffs. https://www.tomshardware.com/tech-industry/tech-industry-lays-off-nearly-80-000-employees-in-the-first-quarter-of-2026-almost-50-percent-of-affected-positions-cut-due-to-ai</w:t>
       </w:r>
     </w:p>
     <w:p>
@@ -6185,7 +6505,7 @@
         <w:color w:val="999999"/>
         <w:sz w:val="15"/>
       </w:rPr>
-      <w:t>Version 4.0 — April 2026 — CC BY 4.0</w:t>
+      <w:t>Version 6.0 — April 2026 — CC BY 4.0</w:t>
       <w:tab/>
       <w:t xml:space="preserve">Seite </w:t>
     </w:r>

</xml_diff>

<commit_message>
Version 7.0 -> 8.0: S.4214 Moratorium Act, Maine, Trilog-Stand, Anthropic-Index-Maerz, Trump-AI-Action-Plan
Fuenf neue belegbare Entwicklungen (Maerz/April 2026):
- S.4214 Artificial Intelligence Data Center Moratorium Act (Sanders/AOC, 25. Maerz 2026) - praezisiert Folgeinitiative aus Version 7.0
- Maine als erster US-Bundesstaat mit landesweitem Rechenzentren-Moratorium (April 2026)
- Digital Omnibus on AI Trilog-Stand (Trilog Nr. 2 am 28. April 2026 avisiert)
- Anthropic Economic Index Maerz 2026 (94 % theoretische Abdeckung; Verdoppelung API-Workflows in Business Sales und Automated Trading)
- Trumps America's AI Action Plan (Juli 2025) und AI Workforce Research Hub beim DOL

Validierung gemaess Validierung.md mit neuem Protokoll-Block. Exports (PDF/Word) neu erzeugt.

https://claude.ai/code/session_018tPjJHaTeyAGkXLBRNxRou
</commit_message>
<xml_diff>
--- a/Arbeitspapier_KI_Robotik_Besteuerung.docx
+++ b/Arbeitspapier_KI_Robotik_Besteuerung.docx
@@ -112,7 +112,7 @@
           <w:color w:val="666666"/>
           <w:sz w:val="18"/>
         </w:rPr>
-        <w:t>Version 7.0</w:t>
+        <w:t>Version 8.0</w:t>
       </w:r>
     </w:p>
     <w:p>
@@ -1214,7 +1214,25 @@
           <w:i w:val="0"/>
           <w:sz w:val="19"/>
         </w:rPr>
-        <w:t xml:space="preserve"> (Stand 2026), der Millionen tatsächlicher KI-Nutzungsinteraktionen auswertet, kommt zu einer komplementären Beobachtung: Trotz hohen theoretischen Automatisierungspotenzials zeigen sich bislang keine klaren aggregierten Arbeitslosigkeitseffekte; der größere Teil der KI-Nutzung ist unterstützend und kollaborativ ausgestaltet, während vollständige Substitution auf einen kleineren Anteil der Tasks beschränkt bleibt. Frühe Struktureffekte — insbesondere auf Berufseinsteigerinnen und -einsteiger in kognitiven Routinetätigkeiten — sind gleichwohl erkennbar. Das bedeutet nicht, dass die Finanzierungsfrage des Sozialstaats damit entschärft wäre — sektorale Verschiebungen können trotz moderater aggregierter Effekte erheblich sein —, es spricht aber dafür, das steuerpolitische Instrumentarium </w:t>
+        <w:t xml:space="preserve"> (Stand 2026), der Millionen tatsächlicher KI-Nutzungsinteraktionen auswertet, kommt zu einer komplementären Beobachtung: Trotz hohen theoretischen Automatisierungspotenzials zeigen sich bislang keine klaren aggregierten Arbeitslosigkeitseffekte; der größere Teil der KI-Nutzung ist unterstützend und kollaborativ ausgestaltet, während vollständige Substitution auf einen kleineren Anteil der Tasks beschränkt bleibt. Frühe Struktureffekte — insbesondere auf Berufseinsteigerinnen und -einsteiger in kognitiven Routinetätigkeiten — sind gleichwohl erkennbar. Der im März 2026 publizierte Index-Bericht verfeinert das Bild: Die theoretische KI-Abdeckung erreicht in den Berufsgruppen Computer/Mathematik und Business/Finance jeweils rund 94 %, in Management, Office/Administration und Rechtsberufen über 89 %; die </w:t>
+      </w:r>
+      <w:r>
+        <w:rPr>
+          <w:rFonts w:ascii="Arial" w:hAnsi="Arial"/>
+          <w:b w:val="0"/>
+          <w:i/>
+          <w:sz w:val="19"/>
+        </w:rPr>
+        <w:t>beobachtete</w:t>
+      </w:r>
+      <w:r>
+        <w:rPr>
+          <w:rFonts w:ascii="Arial" w:hAnsi="Arial"/>
+          <w:b w:val="0"/>
+          <w:i w:val="0"/>
+          <w:sz w:val="19"/>
+        </w:rPr>
+        <w:t xml:space="preserve"> Nutzung bleibt jedoch deutlich darunter. Zwischen November 2025 und Februar 2026 haben sich innerhalb der API-Nutzung zwei Aufgabenkategorien — „Business Sales and Outreach Automation" und „Automated Trading and Market Operations" — in der Anzahl der Workflows annähernd verdoppelt; dies deutet darauf hin, dass die nächste Substitutionswelle eher in kaufmännischen und handelsnahen Tätigkeiten und weniger in klassisch kognitiven Office-Berufen ansetzen könnte. Das bedeutet nicht, dass die Finanzierungsfrage des Sozialstaats damit entschärft wäre — sektorale Verschiebungen können trotz moderater aggregierter Effekte erheblich sein —, es spricht aber dafür, das steuerpolitische Instrumentarium </w:t>
       </w:r>
       <w:r>
         <w:rPr>
@@ -1578,7 +1596,7 @@
           <w:i w:val="0"/>
           <w:sz w:val="19"/>
         </w:rPr>
-        <w:t xml:space="preserve"> Eine rein nationale Lösung kann mit der Warenverkehrsfreiheit, der Dienstleistungsfreiheit und der Niederlassungsfreiheit in Konflikt geraten. Eine Regelung, die nur inländische Roboterbetreiber trifft, während grenzüberschreitende KI-Dienstleistungen unbesteuert bleiben, wäre diskriminierungsrechtlich problematisch und praktisch kaum durchsetzbar. Der EU AI Act (Verordnung 2024/1689) schafft ab dem 2. August 2026 einen unionsweit einheitlichen Regulierungsrahmen für KI-Systeme (Hochrisiko-Systeme gemäß Anhang III, Transparenzpflichten nach Art. 50, Durchsetzungsregime); dies legt einen einheitlichen Definitionsrahmen, der steuerpolitische Anknüpfungen an KI-Systemklassen mittelfristig erleichtern kann, ohne selbst steuerrechtliche Wirkung zu entfalten. Die Europäische Kommission hat am 19. November 2025 mit dem „Digital Omnibus on AI" einen Vereinfachungsvorschlag vorgelegt, den das Europäische Parlament am 16. März 2026 im Ausschuss und am 23. März 2026 im Plenum unterstützt hat. Er sieht eine Verschiebung der Hochrisiko-Pflichten vor — je nach Systemtyp bis maximal zum 2. Dezember 2027 bzw. 2. August 2028 — und koppelt ihre Anwendbarkeit an die Verfügbarkeit harmonisierter Normen; zudem wird die Kennzeichnungspflicht für KI-generierte Inhalte (Art. 50) bis zum 2. November 2026 verlängert. Die Kommissionsdurchsetzungsbefugnisse gegenüber Anbietern von Allzweck-KI-Modellen (GPAI) treten wie vorgesehen am 2. August 2026 in Kraft. Für die Steuerdebatte folgt daraus, dass der zeitliche Vorlauf für KI-Definitionen aus dem AI Act enger als ursprünglich gedacht ist — eine mittelfristige Anknüpfung steuerlicher Tatbestände an AI-Act-Kategorien bleibt möglich, setzt aber voraus, dass die Normenlandschaft nach 2027 verlässlich vorliegt.</w:t>
+        <w:t xml:space="preserve"> Eine rein nationale Lösung kann mit der Warenverkehrsfreiheit, der Dienstleistungsfreiheit und der Niederlassungsfreiheit in Konflikt geraten. Eine Regelung, die nur inländische Roboterbetreiber trifft, während grenzüberschreitende KI-Dienstleistungen unbesteuert bleiben, wäre diskriminierungsrechtlich problematisch und praktisch kaum durchsetzbar. Der EU AI Act (Verordnung 2024/1689) schafft ab dem 2. August 2026 einen unionsweit einheitlichen Regulierungsrahmen für KI-Systeme (Hochrisiko-Systeme gemäß Anhang III, Transparenzpflichten nach Art. 50, Durchsetzungsregime); dies legt einen einheitlichen Definitionsrahmen, der steuerpolitische Anknüpfungen an KI-Systemklassen mittelfristig erleichtern kann, ohne selbst steuerrechtliche Wirkung zu entfalten. Die Europäische Kommission hat am 19. November 2025 mit dem „Digital Omnibus on AI" einen Vereinfachungsvorschlag vorgelegt, den das Europäische Parlament am 16. März 2026 im Ausschuss und am 23. März 2026 im Plenum unterstützt hat. Er sieht eine Verschiebung der Hochrisiko-Pflichten vor — je nach Systemtyp bis maximal zum 2. Dezember 2027 bzw. 2. August 2028 — und koppelt ihre Anwendbarkeit an die Verfügbarkeit harmonisierter Normen; zudem wird die Kennzeichnungspflicht für KI-generierte Inhalte (Art. 50) bis zum 2. November 2026 verlängert. Die Kommissionsdurchsetzungsbefugnisse gegenüber Anbietern von Allzweck-KI-Modellen (GPAI) treten wie vorgesehen am 2. August 2026 in Kraft. Parlament und Rat haben die Trilogverhandlungen aufgenommen; ein zweiter Trilogtermin ist für den 28. April 2026 vorgesehen, mit dem Ziel, einen förmlichen Rechtsakt noch vor dem ursprünglichen Stichtag am 2. August 2026 zu verabschieden. Scheitert die Einigung bis dahin, würden die Hochrisiko-Pflichten in ihrer ursprünglich vorgesehenen Fassung anwendbar. Für die Steuerdebatte folgt daraus, dass der zeitliche Vorlauf für KI-Definitionen aus dem AI Act enger als ursprünglich gedacht ist — eine mittelfristige Anknüpfung steuerlicher Tatbestände an AI-Act-Kategorien bleibt möglich, setzt aber voraus, dass die Normenlandschaft nach 2027 verlässlich vorliegt.</w:t>
       </w:r>
     </w:p>
     <w:p>
@@ -1664,16 +1682,116 @@
           <w:i w:val="0"/>
           <w:sz w:val="19"/>
         </w:rPr>
-        <w:t>Sanders-Report (Oktober 2025) und Nachtrag April 2026:</w:t>
-      </w:r>
-      <w:r>
-        <w:rPr>
-          <w:rFonts w:ascii="Arial" w:hAnsi="Arial"/>
-          <w:b w:val="0"/>
-          <w:i w:val="0"/>
-          <w:sz w:val="19"/>
-        </w:rPr>
-        <w:t xml:space="preserve"> US-Senator Bernie Sanders, ranghöchstes Mitglied im HELP-Ausschuss des US-Senats, veröffentlichte am 6. Oktober 2025 den Bericht „The Big Tech Oligarchs' War Against Workers: AI and Automation Could Destroy Nearly 100 Million U.S. Jobs in a Decade". Darin fordert er eine „Robotersteuer" — konzipiert als direkte Verbrauchsteuer auf automatisierende Technologie — für Großunternehmen, die Arbeit durch KI oder Robotik ersetzen; das Aufkommen soll an verdrängte Arbeitskräfte umverteilt werden. Flankiert wird die Robotersteuer durch eine 32-Stunden-Woche ohne Lohnausgleich-Senkung, eine verpflichtende Gewinnbeteiligung, Mitbestimmung im Aufsichtsrat, ein nationales Employee Ownership Bank-Modell, ein Verbot von Aktienrückkäufen und eine Wiederbelebung leistungsdefinierter Rentenpläne. Am 16. April 2026 hat Sanders die Linie mit einem Namensbeitrag („Artificial intelligence is coming for the working class. We must fight back.") erneuert und parallel zur HELP-Anhörung ein ergänzendes Gesetzespaket angekündigt, das neben der Robotersteuer ein bundesweites Moratorium für neue KI-Rechenzentren vorsieht, bis Schutzmaßnahmen für Beschäftigte in Kraft sind. Der Bericht und seine Folgeinitiativen sind der bislang konkreteste politische Vorstoß auf US-Bundesebene.</w:t>
+        <w:t>Sanders-Report (Oktober 2025) und Folgeinitiativen 2026:</w:t>
+      </w:r>
+      <w:r>
+        <w:rPr>
+          <w:rFonts w:ascii="Arial" w:hAnsi="Arial"/>
+          <w:b w:val="0"/>
+          <w:i w:val="0"/>
+          <w:sz w:val="19"/>
+        </w:rPr>
+        <w:t xml:space="preserve"> US-Senator Bernie Sanders, ranghöchstes Mitglied im HELP-Ausschuss des US-Senats, veröffentlichte am 6. Oktober 2025 den Bericht „The Big Tech Oligarchs' War Against Workers: AI and Automation Could Destroy Nearly 100 Million U.S. Jobs in a Decade". Darin fordert er eine „Robotersteuer" — konzipiert als direkte Verbrauchsteuer auf automatisierende Technologie — für Großunternehmen, die Arbeit durch KI oder Robotik ersetzen; das Aufkommen soll an verdrängte Arbeitskräfte umverteilt werden. Flankiert wird die Robotersteuer durch eine 32-Stunden-Woche ohne Lohnausgleich-Senkung, eine verpflichtende Gewinnbeteiligung, Mitbestimmung im Aufsichtsrat, ein nationales Employee Ownership Bank-Modell, ein Verbot von Aktienrückkäufen und eine Wiederbelebung leistungsdefinierter Rentenpläne. Am 25. März 2026 haben Sanders und die Abgeordnete Alexandria Ocasio-Cortez (D-NY) den </w:t>
+      </w:r>
+      <w:r>
+        <w:rPr>
+          <w:rFonts w:ascii="Arial" w:hAnsi="Arial"/>
+          <w:b w:val="0"/>
+          <w:i/>
+          <w:sz w:val="19"/>
+        </w:rPr>
+        <w:t>Artificial Intelligence Data Center Moratorium Act</w:t>
+      </w:r>
+      <w:r>
+        <w:rPr>
+          <w:rFonts w:ascii="Arial" w:hAnsi="Arial"/>
+          <w:b w:val="0"/>
+          <w:i w:val="0"/>
+          <w:sz w:val="19"/>
+        </w:rPr>
+        <w:t xml:space="preserve"> (S. 4214, 119. Kongress) eingebracht, der ein bundesweites Moratorium für neue und aufgerüstete KI-Rechenzentren oberhalb definierter Stromschwellen vorsieht, bis der Gesetzgeber Mindeststandards in den Bereichen Umwelt, Energie, Arbeit und Bürgerrechte verabschiedet; der Gesetzentwurf formuliert ausdrücklich, die „wirtschaftlichen Gewinne aus künstlicher Intelligenz und Robotik" sollten „Beschäftigten, nicht nur wohlhabenden Big-Tech-Eigentümern" zugutekommen. Am 16. April 2026 hat Sanders die Linie mit einem Namensbeitrag („Artificial intelligence is coming for the working class. We must fight back.") erneuert und die HELP-Anhörung genutzt, um für Robotersteuer und Moratorium zu werben. Die Aussicht auf Annahme des Entwurfs in einem republikanisch geführten Kongress gilt als gering; als Signalgebung ist er jedoch der bislang konkreteste politische Vorstoß auf US-Bundesebene.</w:t>
+      </w:r>
+    </w:p>
+    <w:p>
+      <w:pPr>
+        <w:jc w:val="both"/>
+      </w:pPr>
+      <w:r>
+        <w:rPr>
+          <w:rFonts w:ascii="Arial" w:hAnsi="Arial"/>
+          <w:b/>
+          <w:i w:val="0"/>
+          <w:sz w:val="19"/>
+        </w:rPr>
+        <w:t>Sub-föderale Parallele — Maine (April 2026):</w:t>
+      </w:r>
+      <w:r>
+        <w:rPr>
+          <w:rFonts w:ascii="Arial" w:hAnsi="Arial"/>
+          <w:b w:val="0"/>
+          <w:i w:val="0"/>
+          <w:sz w:val="19"/>
+        </w:rPr>
+        <w:t xml:space="preserve"> Als erster US-Bundesstaat hat die Legislative in Maine Anfang April 2026 ein landesweites Moratorium für große KI-Rechenzentren (Last ≥ 20 Megawatt) bis zum 1. November 2027 beschlossen und ein „Maine Data Center Coordination Council" zur Vorbereitung einer Dauerregulierung eingesetzt. Gouverneurin Janet Mills signalisierte Prüfungsbedarf — insbesondere im Hinblick auf eine Ausnahme für einen industriepolitisch motivierten Standort in Jay — und hat bis 25. April 2026 Zeit, zu unterzeichnen, ihr Veto einzulegen oder das Gesetz ohne Unterschrift in Kraft treten zu lassen. Der Vorgang illustriert, dass parallel zur ausstehenden Bundesgesetzgebung eine staatliche Ebene bereits beginnt, regulatorische Fakten zu schaffen — ein Muster, das aus der Digitalsteuer- und Datenschutzgesetzgebung bekannt ist und für KI-spezifische steuerliche Anknüpfungspunkte (etwa Nutzungs- oder Standortsabgaben auf Rechenzentren) einen Präzedenzraum öffnet.</w:t>
+      </w:r>
+    </w:p>
+    <w:p>
+      <w:pPr>
+        <w:jc w:val="both"/>
+      </w:pPr>
+      <w:r>
+        <w:rPr>
+          <w:rFonts w:ascii="Arial" w:hAnsi="Arial"/>
+          <w:b/>
+          <w:i w:val="0"/>
+          <w:sz w:val="19"/>
+        </w:rPr>
+        <w:t>Gegenmodell Bundesregierung — Trump-AI-Action-Plan (Juli 2025):</w:t>
+      </w:r>
+      <w:r>
+        <w:rPr>
+          <w:rFonts w:ascii="Arial" w:hAnsi="Arial"/>
+          <w:b w:val="0"/>
+          <w:i w:val="0"/>
+          <w:sz w:val="19"/>
+        </w:rPr>
+        <w:t xml:space="preserve"> Parallel zur progressiven Agenda Sanders/AOC verfolgt die seit Januar 2025 amtierende US-Bundesregierung eine gegenläufige Stoßrichtung. Der am 23. Juli 2025 veröffentlichte </w:t>
+      </w:r>
+      <w:r>
+        <w:rPr>
+          <w:rFonts w:ascii="Arial" w:hAnsi="Arial"/>
+          <w:b w:val="0"/>
+          <w:i/>
+          <w:sz w:val="19"/>
+        </w:rPr>
+        <w:t>America's AI Action Plan</w:t>
+      </w:r>
+      <w:r>
+        <w:rPr>
+          <w:rFonts w:ascii="Arial" w:hAnsi="Arial"/>
+          <w:b w:val="0"/>
+          <w:i w:val="0"/>
+          <w:sz w:val="19"/>
+        </w:rPr>
+        <w:t xml:space="preserve"> und drei begleitende Executive Orders setzen auf Deregulierung, beschleunigten Infrastrukturausbau und privatwirtschaftliche Führung. Für die Arbeitsmarktfrage hat das US-Arbeitsministerium unter dem Plan einen </w:t>
+      </w:r>
+      <w:r>
+        <w:rPr>
+          <w:rFonts w:ascii="Arial" w:hAnsi="Arial"/>
+          <w:b w:val="0"/>
+          <w:i/>
+          <w:sz w:val="19"/>
+        </w:rPr>
+        <w:t>AI Workforce Research Hub</w:t>
+      </w:r>
+      <w:r>
+        <w:rPr>
+          <w:rFonts w:ascii="Arial" w:hAnsi="Arial"/>
+          <w:b w:val="0"/>
+          <w:i w:val="0"/>
+          <w:sz w:val="19"/>
+        </w:rPr>
+        <w:t xml:space="preserve"> eingerichtet, der KI-Arbeitsmarkteffekte fortlaufend auswertet und Umschulungsmaßnahmen für durch KI verdrängte Beschäftigte bündelt; eine fiskalische Umverteilungskomponente oder eine Abgabe auf automatisierende Unternehmen ist nicht vorgesehen. Für die Debatte über die Besteuerung von KI ist dieser Rahmen relevant, weil er die fiskalische Stellschraube bewusst nicht adressiert — und damit den Handlungsspielraum in der laufenden Legislatur einengt. Europäische und deutsche Reformoptionen werden dadurch nicht präjudiziert, die internationale Koordination über OECD Pillar 2 wird aber voraussichtlich weiter auf technische Umsetzungsfragen begrenzt bleiben.</w:t>
       </w:r>
     </w:p>
     <w:p>
@@ -5550,6 +5668,38 @@
     </w:p>
     <w:p>
       <w:pPr>
+        <w:jc w:val="both"/>
+      </w:pPr>
+      <w:r>
+        <w:rPr>
+          <w:rFonts w:ascii="Arial" w:hAnsi="Arial"/>
+          <w:b w:val="0"/>
+          <w:i w:val="0"/>
+          <w:sz w:val="19"/>
+        </w:rPr>
+        <w:t xml:space="preserve">Anthropic. (März 2026). </w:t>
+      </w:r>
+      <w:r>
+        <w:rPr>
+          <w:rFonts w:ascii="Arial" w:hAnsi="Arial"/>
+          <w:b w:val="0"/>
+          <w:i/>
+          <w:sz w:val="19"/>
+        </w:rPr>
+        <w:t>Anthropic Economic Index Report — Economic Primitives and Observed Exposure.</w:t>
+      </w:r>
+      <w:r>
+        <w:rPr>
+          <w:rFonts w:ascii="Arial" w:hAnsi="Arial"/>
+          <w:b w:val="0"/>
+          <w:i w:val="0"/>
+          <w:sz w:val="19"/>
+        </w:rPr>
+        <w:t xml:space="preserve"> Report (enthält Kennzahlen zu theoretischer vs. beobachteter KI-Abdeckung nach Berufsgruppen und zur Verdoppelung der Workflows in den Aufgabenfeldern Business Sales/Outreach und Automated Trading zwischen November 2025 und Februar 2026). https://www.anthropic.com/research/anthropic-economic-index-january-2026-report</w:t>
+      </w:r>
+    </w:p>
+    <w:p>
+      <w:pPr>
         <w:spacing w:before="120" w:after="80"/>
       </w:pPr>
       <w:r>
@@ -5962,6 +6112,198 @@
           <w:sz w:val="19"/>
         </w:rPr>
         <w:t xml:space="preserve"> (Einbringer: Suzanne Bonamici et al.). https://www.congress.gov/bill/119th-congress/house-bill/6371</w:t>
+      </w:r>
+    </w:p>
+    <w:p>
+      <w:pPr>
+        <w:jc w:val="both"/>
+      </w:pPr>
+      <w:r>
+        <w:rPr>
+          <w:rFonts w:ascii="Arial" w:hAnsi="Arial"/>
+          <w:b w:val="0"/>
+          <w:i w:val="0"/>
+          <w:sz w:val="19"/>
+        </w:rPr>
+        <w:t xml:space="preserve">US Senate, 119th Congress. (25. März 2026). </w:t>
+      </w:r>
+      <w:r>
+        <w:rPr>
+          <w:rFonts w:ascii="Arial" w:hAnsi="Arial"/>
+          <w:b w:val="0"/>
+          <w:i/>
+          <w:sz w:val="19"/>
+        </w:rPr>
+        <w:t>S. 4214 — Artificial Intelligence Data Center Moratorium Act</w:t>
+      </w:r>
+      <w:r>
+        <w:rPr>
+          <w:rFonts w:ascii="Arial" w:hAnsi="Arial"/>
+          <w:b w:val="0"/>
+          <w:i w:val="0"/>
+          <w:sz w:val="19"/>
+        </w:rPr>
+        <w:t xml:space="preserve"> (Einbringer: Bernie Sanders; komplementärer Entwurf im Repräsentantenhaus: Alexandria Ocasio-Cortez). https://www.congress.gov/bill/119th-congress/senate-bill/4214</w:t>
+      </w:r>
+    </w:p>
+    <w:p>
+      <w:pPr>
+        <w:jc w:val="both"/>
+      </w:pPr>
+      <w:r>
+        <w:rPr>
+          <w:rFonts w:ascii="Arial" w:hAnsi="Arial"/>
+          <w:b w:val="0"/>
+          <w:i w:val="0"/>
+          <w:sz w:val="19"/>
+        </w:rPr>
+        <w:t xml:space="preserve">Sanders, B., &amp; Ocasio-Cortez, A. (25. März 2026). </w:t>
+      </w:r>
+      <w:r>
+        <w:rPr>
+          <w:rFonts w:ascii="Arial" w:hAnsi="Arial"/>
+          <w:b w:val="0"/>
+          <w:i/>
+          <w:sz w:val="19"/>
+        </w:rPr>
+        <w:t>Sanders, Ocasio-Cortez Announce AI Data Center Moratorium Act.</w:t>
+      </w:r>
+      <w:r>
+        <w:rPr>
+          <w:rFonts w:ascii="Arial" w:hAnsi="Arial"/>
+          <w:b w:val="0"/>
+          <w:i w:val="0"/>
+          <w:sz w:val="19"/>
+        </w:rPr>
+        <w:t xml:space="preserve"> Pressemitteilung. https://www.sanders.senate.gov/press-releases/news-sanders-ocasio-cortez-announce-ai-data-center-moratorium-act/</w:t>
+      </w:r>
+    </w:p>
+    <w:p>
+      <w:pPr>
+        <w:jc w:val="both"/>
+      </w:pPr>
+      <w:r>
+        <w:rPr>
+          <w:rFonts w:ascii="Arial" w:hAnsi="Arial"/>
+          <w:b w:val="0"/>
+          <w:i w:val="0"/>
+          <w:sz w:val="19"/>
+        </w:rPr>
+        <w:t xml:space="preserve">The White House. (23. Juli 2025). </w:t>
+      </w:r>
+      <w:r>
+        <w:rPr>
+          <w:rFonts w:ascii="Arial" w:hAnsi="Arial"/>
+          <w:b w:val="0"/>
+          <w:i/>
+          <w:sz w:val="19"/>
+        </w:rPr>
+        <w:t>Winning the Race — America's AI Action Plan.</w:t>
+      </w:r>
+      <w:r>
+        <w:rPr>
+          <w:rFonts w:ascii="Arial" w:hAnsi="Arial"/>
+          <w:b w:val="0"/>
+          <w:i w:val="0"/>
+          <w:sz w:val="19"/>
+        </w:rPr>
+        <w:t xml:space="preserve"> https://www.whitehouse.gov/wp-content/uploads/2025/07/Americas-AI-Action-Plan.pdf</w:t>
+      </w:r>
+    </w:p>
+    <w:p>
+      <w:pPr>
+        <w:jc w:val="both"/>
+      </w:pPr>
+      <w:r>
+        <w:rPr>
+          <w:rFonts w:ascii="Arial" w:hAnsi="Arial"/>
+          <w:b w:val="0"/>
+          <w:i w:val="0"/>
+          <w:sz w:val="19"/>
+        </w:rPr>
+        <w:t xml:space="preserve">U.S. Department of Labor. (24. November 2025). </w:t>
+      </w:r>
+      <w:r>
+        <w:rPr>
+          <w:rFonts w:ascii="Arial" w:hAnsi="Arial"/>
+          <w:b w:val="0"/>
+          <w:i/>
+          <w:sz w:val="19"/>
+        </w:rPr>
+        <w:t>The Trump Administration's AI Action Plan is bringing agility to America's workforce.</w:t>
+      </w:r>
+      <w:r>
+        <w:rPr>
+          <w:rFonts w:ascii="Arial" w:hAnsi="Arial"/>
+          <w:b w:val="0"/>
+          <w:i w:val="0"/>
+          <w:sz w:val="19"/>
+        </w:rPr>
+        <w:t xml:space="preserve"> DOL Blog / AI Workforce Research Hub. https://blog.dol.gov/2025/11/24/the-trump-administrations-ai-action-plan-is-bringing-agility-to-americas-workforce</w:t>
+      </w:r>
+    </w:p>
+    <w:p>
+      <w:pPr>
+        <w:jc w:val="both"/>
+      </w:pPr>
+      <w:r>
+        <w:rPr>
+          <w:rFonts w:ascii="Arial" w:hAnsi="Arial"/>
+          <w:b w:val="0"/>
+          <w:i w:val="0"/>
+          <w:sz w:val="19"/>
+        </w:rPr>
+        <w:t xml:space="preserve">Maine State Legislature. (April 2026). </w:t>
+      </w:r>
+      <w:r>
+        <w:rPr>
+          <w:rFonts w:ascii="Arial" w:hAnsi="Arial"/>
+          <w:b w:val="0"/>
+          <w:i/>
+          <w:sz w:val="19"/>
+        </w:rPr>
+        <w:t>An Act Establishing a Moratorium on Large-Scale Data Centers and Creating the Maine Data Center Coordination Council.</w:t>
+      </w:r>
+      <w:r>
+        <w:rPr>
+          <w:rFonts w:ascii="Arial" w:hAnsi="Arial"/>
+          <w:b w:val="0"/>
+          <w:i w:val="0"/>
+          <w:sz w:val="19"/>
+        </w:rPr>
+        <w:t xml:space="preserve"> Gesetzentwurf; Anschreiben an die Gouverneurin zum 15. April 2026.</w:t>
+      </w:r>
+    </w:p>
+    <w:p>
+      <w:pPr>
+        <w:jc w:val="both"/>
+      </w:pPr>
+      <w:r>
+        <w:rPr>
+          <w:rFonts w:ascii="Arial" w:hAnsi="Arial"/>
+          <w:b w:val="0"/>
+          <w:i w:val="0"/>
+          <w:sz w:val="19"/>
+        </w:rPr>
+        <w:t xml:space="preserve">Europäisches Parlament / Rat der EU. (April 2026). </w:t>
+      </w:r>
+      <w:r>
+        <w:rPr>
+          <w:rFonts w:ascii="Arial" w:hAnsi="Arial"/>
+          <w:b w:val="0"/>
+          <w:i/>
+          <w:sz w:val="19"/>
+        </w:rPr>
+        <w:t>Trilog zu Digital Omnibus on AI — Verhandlungsstand.</w:t>
+      </w:r>
+      <w:r>
+        <w:rPr>
+          <w:rFonts w:ascii="Arial" w:hAnsi="Arial"/>
+          <w:b w:val="0"/>
+          <w:i w:val="0"/>
+          <w:sz w:val="19"/>
+        </w:rPr>
+        <w:t xml:space="preserve"> Legislative Train Schedule. https://www.europarl.europa.eu/legislative-train/package-digital-package/file-digital-omnibus-on-ai</w:t>
       </w:r>
     </w:p>
     <w:p>
@@ -6665,7 +7007,7 @@
         <w:color w:val="999999"/>
         <w:sz w:val="15"/>
       </w:rPr>
-      <w:t>Version 7.0 — April 2026 — CC BY 4.0</w:t>
+      <w:t>Version 8.0 — April 2026 — CC BY 4.0</w:t>
       <w:tab/>
       <w:t xml:space="preserve">Seite </w:t>
     </w:r>

</xml_diff>

<commit_message>
Version 13.0 -> 14.0: Maine Executive Order 5 + LD 713, Tech-Layoffs Stand 2. Mai 2026, Goldman-Sachs Datenpunkt, GKV Bundesrat 8. Mai, OpenAI Worker Participation Forum
https://claude.ai/code/session_01VLkY4cut3DMpT8uCQNduz8
</commit_message>
<xml_diff>
--- a/Arbeitspapier_KI_Robotik_Besteuerung.docx
+++ b/Arbeitspapier_KI_Robotik_Besteuerung.docx
@@ -112,7 +112,7 @@
           <w:color w:val="666666"/>
           <w:sz w:val="18"/>
         </w:rPr>
-        <w:t>Version 13.0</w:t>
+        <w:t>Version 14.0</w:t>
       </w:r>
     </w:p>
     <w:p>
@@ -202,7 +202,25 @@
           <w:i w:val="0"/>
           <w:sz w:val="19"/>
         </w:rPr>
-        <w:t xml:space="preserve"> der Konzerngeschichte und zielt — bei rund 125.000 US-Beschäftigten — auf bis zu 8.750 mögliche Austritte. Eligible sind Beschäftigte, deren Summe aus Lebensalter und Betriebszugehörigkeit mindestens 70 erreicht; die Benachrichtigung läuft am 7. Mai 2026 mit einer 30-Tage-Annahmefrist. Im Zusammenspiel mit den am selben Tag bekräftigten Meta-Streichungen ordneten Wirtschaftsmedien (CNBC, 24. April 2026) die Welle erstmals als „AI-driven labor crisis" ein — ein Begriff, der den Übergang von Einzelfällen zu einer kumulativen Branchenerzählung markiert. Bis zur Wochenmitte des 25. April 2026 weisen Branchen-Tracker einen kumulierten Bestand von über 92.000 Tech-Stellenstreichungen für das laufende Jahr 2026 aus; eine Aktualisierung zum 1. Mai 2026 hebt die Marke nach Tracker-Methodik des SkillSyncer auf 100.443 betroffene Beschäftigte aus 155 erfassten Layoff-Ereignissen, während TrueUp parallel 95.878 Personen aus 249 Einzelmeldungen zählt; die Methodikspanne erklärt die unterschiedlichen Größenordnungen, das Niveau einer sechsstelligen Tech-Reduktion innerhalb von vier Monaten ist über alle Tracker hinweg konsistent. Rechnet man die seit Oktober 2025 angekündigten Amazon-Reduktionen (≥ 30.000 Stellen, etwa zehn Prozent der Konzern- und Tech-Belegschaft) ein, hat allein dieser Hyperscaler binnen eines halben Jahres größere Personalanpassungen vorgenommen als die meisten DAX-Konzerne in einem Jahrzehnt. Zugleich stiegen KI-bezogene Stellenausschreibungen im selben Zeitraum deutlich an, was auf einen strukturellen Umbau der Beschäftigungszusammensetzung hindeutet. Eine analytische Gegenposition zu dieser KI-zentrischen Lesart hat die </w:t>
+        <w:t xml:space="preserve"> der Konzerngeschichte und zielt — bei rund 125.000 US-Beschäftigten — auf bis zu 8.750 mögliche Austritte. Eligible sind Beschäftigte, deren Summe aus Lebensalter und Betriebszugehörigkeit mindestens 70 erreicht; die Benachrichtigung läuft am 7. Mai 2026 mit einer 30-Tage-Annahmefrist. Im Zusammenspiel mit den am selben Tag bekräftigten Meta-Streichungen ordneten Wirtschaftsmedien (CNBC, 24. April 2026) die Welle erstmals als „AI-driven labor crisis" ein — ein Begriff, der den Übergang von Einzelfällen zu einer kumulativen Branchenerzählung markiert. Bis zur Wochenmitte des 25. April 2026 weisen Branchen-Tracker einen kumulierten Bestand von über 92.000 Tech-Stellenstreichungen für das laufende Jahr 2026 aus; eine Aktualisierung zum 2. Mai 2026 hebt die Marke nach Tracker-Methodik des SkillSyncer auf 113.863 betroffene Beschäftigte aus 179 erfassten Layoff-Ereignissen (durchschnittlich rund 933 Stellen pro Tag), während TrueUp parallel 95.878 Personen aus 249 Einzelmeldungen zählt; die Methodikspanne erklärt die unterschiedlichen Größenordnungen, das Niveau einer sechsstelligen Tech-Reduktion innerhalb von vier Monaten ist über alle Tracker hinweg konsistent. Eine ergänzende Auswertung von Goldman Sachs (Anfang April 2026) schätzt den US-weiten KI-Verdrängungseffekt auf rund 16.000 Stellen pro Monat, mit überproportionaler Betroffenheit von Berufseinsteigerinnen und -einsteigern (Gen Z) in routinisierten Bürotätigkeiten — diese Größenordnung stützt die in § 3.5 referierten Beobachtungen aus dem </w:t>
+      </w:r>
+      <w:r>
+        <w:rPr>
+          <w:rFonts w:ascii="Arial" w:hAnsi="Arial"/>
+          <w:b w:val="0"/>
+          <w:i/>
+          <w:sz w:val="19"/>
+        </w:rPr>
+        <w:t>Anthropic Economic Index</w:t>
+      </w:r>
+      <w:r>
+        <w:rPr>
+          <w:rFonts w:ascii="Arial" w:hAnsi="Arial"/>
+          <w:b w:val="0"/>
+          <w:i w:val="0"/>
+          <w:sz w:val="19"/>
+        </w:rPr>
+        <w:t xml:space="preserve"> zu sektoralen Frühwirkungen, ohne den aggregiert moderaten Befund umzukehren. Rechnet man die seit Oktober 2025 angekündigten Amazon-Reduktionen (≥ 30.000 Stellen, etwa zehn Prozent der Konzern- und Tech-Belegschaft) ein, hat allein dieser Hyperscaler binnen eines halben Jahres größere Personalanpassungen vorgenommen als die meisten DAX-Konzerne in einem Jahrzehnt. Zugleich stiegen KI-bezogene Stellenausschreibungen im selben Zeitraum deutlich an, was auf einen strukturellen Umbau der Beschäftigungszusammensetzung hindeutet. Eine analytische Gegenposition zu dieser KI-zentrischen Lesart hat die </w:t>
       </w:r>
       <w:r>
         <w:rPr>
@@ -1814,7 +1832,133 @@
           <w:i w:val="0"/>
           <w:sz w:val="19"/>
         </w:rPr>
-        <w:t xml:space="preserve"> Als erster US-Bundesstaat hatte die Legislative in Maine Anfang April 2026 ein landesweites Moratorium für große KI-Rechenzentren (Last ≥ 20 Megawatt) bis zum 1. November 2027 beschlossen und ein „Maine Data Center Coordination Council" zur Vorbereitung einer Dauerregulierung vorgesehen. Gouverneurin Janet Mills hat den Entwurf (LD 307) am 24. April 2026 jedoch mit ihrem Veto blockiert; sie hatte zuvor erklärt, sie würde unterzeichnen, wenn der Gesetzgeber eine Ausnahme für ein laufendes 550-Millionen-US-Dollar-Rechenzentrumsvorhaben am ehemaligen Androscoggin-Mill-Standort in Jay aufnähme — der Carve-out wurde im Repräsentantenhaus aber mit 115 zu 29 Stimmen abgelehnt. Eine Veto-Überschreibung erfordert eine Zwei-Drittel-Mehrheit in beiden Kammern; das Repräsentantenhaus hat am 29. April 2026 mit 72 zu 65 Stimmen für eine Überschreibung gestimmt und die erforderliche Zwei-Drittel-Hürde damit klar verfehlt — der Veto bleibt bestehen, Mills bleibt von der demokratisch dominierten Legislative weiterhin nicht überstimmt, und Maine etabliert zunächst kein wirksames landesweites Rechenzentren-Moratorium. Der Vorgang illustriert, dass parallel zur ausstehenden Bundesgesetzgebung eine staatliche Ebene begonnen hat, regulatorische Fakten zu schaffen — und dass selbst dort, wo eine Legislative ein Moratorium beschließt, die exekutive Ebene mit industriepolitischen Erwägungen gegenhalten kann. Für KI-spezifische steuerliche Anknüpfungspunkte (etwa Nutzungs- oder Standortsabgaben auf Rechenzentren) bleibt der Vorstoß ein Präzedenzraum, weil er das politische Vokabular (Strom­schwellen, Coordination Council, Carve-outs) in den US-bundesstaatlichen Diskurs eingeführt hat.</w:t>
+        <w:t xml:space="preserve"> Als erster US-Bundesstaat hatte die Legislative in Maine Anfang April 2026 ein landesweites Moratorium für große KI-Rechenzentren (Last ≥ 20 Megawatt) bis zum 1. November 2027 beschlossen und ein „Maine Data Center Coordination Council" zur Vorbereitung einer Dauerregulierung vorgesehen. Gouverneurin Janet Mills hat den Entwurf (LD 307) am 24. April 2026 jedoch mit ihrem Veto blockiert; sie hatte zuvor erklärt, sie würde unterzeichnen, wenn der Gesetzgeber eine Ausnahme für ein laufendes 550-Millionen-US-Dollar-Rechenzentrumsvorhaben am ehemaligen Androscoggin-Mill-Standort in Jay aufnähme — der Carve-out wurde im Repräsentantenhaus aber mit 115 zu 29 Stimmen abgelehnt. Eine Veto-Überschreibung erfordert eine Zwei-Drittel-Mehrheit in beiden Kammern; das Repräsentantenhaus hat am 29. April 2026 mit 72 zu 65 Stimmen für eine Überschreibung gestimmt und die erforderliche Zwei-Drittel-Hürde damit klar verfehlt — der Veto bleibt bestehen, Mills bleibt von der demokratisch dominierten Legislative weiterhin nicht überstimmt, und Maine etabliert zunächst kein wirksames landesweites Rechenzentren-Moratorium. Mills hat den Vorgang am selben Tag durch zwei flankierende exekutive Akte ergänzt: Mit </w:t>
+      </w:r>
+      <w:r>
+        <w:rPr>
+          <w:rFonts w:ascii="Arial" w:hAnsi="Arial"/>
+          <w:b w:val="0"/>
+          <w:i/>
+          <w:sz w:val="19"/>
+        </w:rPr>
+        <w:t>Executive Order Nr. 5</w:t>
+      </w:r>
+      <w:r>
+        <w:rPr>
+          <w:rFonts w:ascii="Arial" w:hAnsi="Arial"/>
+          <w:b w:val="0"/>
+          <w:i w:val="0"/>
+          <w:sz w:val="19"/>
+        </w:rPr>
+        <w:t xml:space="preserve"> vom 29. April 2026 wird ein 15-köpfiges </w:t>
+      </w:r>
+      <w:r>
+        <w:rPr>
+          <w:rFonts w:ascii="Arial" w:hAnsi="Arial"/>
+          <w:b w:val="0"/>
+          <w:i/>
+          <w:sz w:val="19"/>
+        </w:rPr>
+        <w:t>Maine Data Center Advisory Council</w:t>
+      </w:r>
+      <w:r>
+        <w:rPr>
+          <w:rFonts w:ascii="Arial" w:hAnsi="Arial"/>
+          <w:b w:val="0"/>
+          <w:i w:val="0"/>
+          <w:sz w:val="19"/>
+        </w:rPr>
+        <w:t xml:space="preserve"> eingesetzt, das bis zum 29. Januar 2027 Empfehlungen zu Verbraucherschutz, Netzstabilität, Umweltauswirkungen und wirtschaftlicher Entwicklung großer Datenzentren erarbeiten soll; parallel weist die Order das </w:t>
+      </w:r>
+      <w:r>
+        <w:rPr>
+          <w:rFonts w:ascii="Arial" w:hAnsi="Arial"/>
+          <w:b w:val="0"/>
+          <w:i/>
+          <w:sz w:val="19"/>
+        </w:rPr>
+        <w:t>Department of Energy Resources</w:t>
+      </w:r>
+      <w:r>
+        <w:rPr>
+          <w:rFonts w:ascii="Arial" w:hAnsi="Arial"/>
+          <w:b w:val="0"/>
+          <w:i w:val="0"/>
+          <w:sz w:val="19"/>
+        </w:rPr>
+        <w:t xml:space="preserve"> gemeinsam mit der </w:t>
+      </w:r>
+      <w:r>
+        <w:rPr>
+          <w:rFonts w:ascii="Arial" w:hAnsi="Arial"/>
+          <w:b w:val="0"/>
+          <w:i/>
+          <w:sz w:val="19"/>
+        </w:rPr>
+        <w:t>Public Utilities Commission</w:t>
+      </w:r>
+      <w:r>
+        <w:rPr>
+          <w:rFonts w:ascii="Arial" w:hAnsi="Arial"/>
+          <w:b w:val="0"/>
+          <w:i w:val="0"/>
+          <w:sz w:val="19"/>
+        </w:rPr>
+        <w:t xml:space="preserve"> an, Mechanismen zum Schutz der Stromtarife vor zusätzlichen Kosten durch Datenzentren zu prüfen. Bereits am 24. April 2026 hatte die Gouverneurin </w:t>
+      </w:r>
+      <w:r>
+        <w:rPr>
+          <w:rFonts w:ascii="Arial" w:hAnsi="Arial"/>
+          <w:b w:val="0"/>
+          <w:i/>
+          <w:sz w:val="19"/>
+        </w:rPr>
+        <w:t>LD 713</w:t>
+      </w:r>
+      <w:r>
+        <w:rPr>
+          <w:rFonts w:ascii="Arial" w:hAnsi="Arial"/>
+          <w:b w:val="0"/>
+          <w:i w:val="0"/>
+          <w:sz w:val="19"/>
+        </w:rPr>
+        <w:t xml:space="preserve"> unterzeichnet, das Datenzentren ab dem 1. Juli 2026 von Maines Förderprogrammen — der </w:t>
+      </w:r>
+      <w:r>
+        <w:rPr>
+          <w:rFonts w:ascii="Arial" w:hAnsi="Arial"/>
+          <w:b w:val="0"/>
+          <w:i/>
+          <w:sz w:val="19"/>
+        </w:rPr>
+        <w:t>Business Equipment Tax Exemption</w:t>
+      </w:r>
+      <w:r>
+        <w:rPr>
+          <w:rFonts w:ascii="Arial" w:hAnsi="Arial"/>
+          <w:b w:val="0"/>
+          <w:i w:val="0"/>
+          <w:sz w:val="19"/>
+        </w:rPr>
+        <w:t xml:space="preserve"> (BETE) und dem </w:t>
+      </w:r>
+      <w:r>
+        <w:rPr>
+          <w:rFonts w:ascii="Arial" w:hAnsi="Arial"/>
+          <w:b w:val="0"/>
+          <w:i/>
+          <w:sz w:val="19"/>
+        </w:rPr>
+        <w:t>Dirigo Business Incentives Program</w:t>
+      </w:r>
+      <w:r>
+        <w:rPr>
+          <w:rFonts w:ascii="Arial" w:hAnsi="Arial"/>
+          <w:b w:val="0"/>
+          <w:i w:val="0"/>
+          <w:sz w:val="19"/>
+        </w:rPr>
+        <w:t xml:space="preserve"> — ausschließt und das Department of Economic and Community Development verpflichtet, bis zum 4. November 2026 dem zuständigen Steuerausschuss eine Analyse möglicher weiterer Anreiztatbestände vorzulegen. Der Vorgang illustriert, dass parallel zur ausstehenden Bundesgesetzgebung eine staatliche Ebene begonnen hat, regulatorische Fakten zu schaffen — und dass selbst dort, wo eine Legislative ein Moratorium beschließt, die exekutive Ebene mit industriepolitischen Erwägungen gegenhalten kann. Maine geht damit nicht den Weg eines Hard-Stop-Moratoriums, sondern eines Mix aus Beratungsstruktur und gezieltem Subventionsabbau — was für die in § 6.1 (Südkorea) skizzierte Logik eines Rückbaus von Investitionsanreizen ein zweites US-bundesstaatliches Anschauungsbeispiel liefert. Für KI-spezifische steuerliche Anknüpfungspunkte (etwa Nutzungs- oder Standortsabgaben auf Rechenzentren) bleibt der Vorstoß ein Präzedenzraum, weil er das politische Vokabular (Strom­schwellen, Advisory Council, Carve-outs, Subventionsausschluss) in den US-bundesstaatlichen Diskurs eingeführt hat.</w:t>
       </w:r>
     </w:p>
     <w:p>
@@ -2095,7 +2239,61 @@
           <w:i w:val="0"/>
           <w:sz w:val="19"/>
         </w:rPr>
-        <w:t>, der im Mai 2026 in Washington, D.C. eröffnet und den OpenAI nach eigenen Angaben als ständigen Konvent für Regierungen, Unternehmen und Zivilgesellschaft anlegt — neben dem im April 2026 angekündigten neuen OpenAI-Büro in Washington.</w:t>
+        <w:t xml:space="preserve">, der im Mai 2026 in Washington, D.C. eröffnet und den OpenAI nach eigenen Angaben als ständigen Konvent für Regierungen, Unternehmen und Zivilgesellschaft anlegt — neben dem im April 2026 angekündigten neuen OpenAI-Büro in Washington. Vorgelagert hat OpenAI bereits am 18. März 2026 in Washington ein </w:t>
+      </w:r>
+      <w:r>
+        <w:rPr>
+          <w:rFonts w:ascii="Arial" w:hAnsi="Arial"/>
+          <w:b w:val="0"/>
+          <w:i/>
+          <w:sz w:val="19"/>
+        </w:rPr>
+        <w:t>Worker Participation Forum</w:t>
+      </w:r>
+      <w:r>
+        <w:rPr>
+          <w:rFonts w:ascii="Arial" w:hAnsi="Arial"/>
+          <w:b w:val="0"/>
+          <w:i w:val="0"/>
+          <w:sz w:val="19"/>
+        </w:rPr>
+        <w:t xml:space="preserve"> ausgerichtet, an dem unter anderem Randi Weingarten (Präsidentin der </w:t>
+      </w:r>
+      <w:r>
+        <w:rPr>
+          <w:rFonts w:ascii="Arial" w:hAnsi="Arial"/>
+          <w:b w:val="0"/>
+          <w:i/>
+          <w:sz w:val="19"/>
+        </w:rPr>
+        <w:t>American Federation of Teachers</w:t>
+      </w:r>
+      <w:r>
+        <w:rPr>
+          <w:rFonts w:ascii="Arial" w:hAnsi="Arial"/>
+          <w:b w:val="0"/>
+          <w:i w:val="0"/>
+          <w:sz w:val="19"/>
+        </w:rPr>
+        <w:t xml:space="preserve">) und Sean McGarvey (Präsident der </w:t>
+      </w:r>
+      <w:r>
+        <w:rPr>
+          <w:rFonts w:ascii="Arial" w:hAnsi="Arial"/>
+          <w:b w:val="0"/>
+          <w:i/>
+          <w:sz w:val="19"/>
+        </w:rPr>
+        <w:t>North America's Building Trades Unions</w:t>
+      </w:r>
+      <w:r>
+        <w:rPr>
+          <w:rFonts w:ascii="Arial" w:hAnsi="Arial"/>
+          <w:b w:val="0"/>
+          <w:i w:val="0"/>
+          <w:sz w:val="19"/>
+        </w:rPr>
+        <w:t>) teilnahmen; der Konvent dient als Plattform, über die Gewerkschaften und Bildungsorganisationen in die Politikbildungsprozesse rund um Steuerverlagerung und Workforce-Transformation eingebunden werden.</w:t>
       </w:r>
     </w:p>
     <w:p>
@@ -2686,7 +2884,7 @@
           <w:i w:val="0"/>
           <w:sz w:val="19"/>
         </w:rPr>
-        <w:t xml:space="preserve"> beschlossen; im Verlauf der Ressortabstimmung wurde das Sparvolumen je nach Berichterstattung mit rund 16,3 Milliarden Euro (Frühberichterstattung) bzw. rund 19,6 Milliarden Euro (BMG-Tabellen Stand Anfang Mai 2026, gegliedert in 4,9 Milliarden einnahmen­seitige und rund 15 Milliarden ausgaben­seitige Komponenten) für 2027 angegeben; bis 2030 sieht das BMG eine Steigerung des Konsolidierungseffekts auf rund 42,8 Milliarden Euro vor. Die parlamentarische Behandlung soll laut BMG-Zeitplan vor der Sommerpause 2026 abgeschlossen werden — der Kabinettentwurf liegt am 2. Mai 2026 dem Bundesrat im ersten Durchgang vor, die erste Bundestagslesung ist im weiteren Verlauf des Mai/Juni 2026 vorgesehen. Die Reform belastet Krankenhäuser, pharmazeutische Industrie, Apotheken, Ärzteschaft, Versicherte, Arbeitgeber und Krankenkassen gemeinsam; sie folgt dem Leitsatz „Ausgaben an Einnahmen koppeln" und greift damit fiskalisch genau die Logik auf, die § 5.1 in der Beitrags­seite spiegelbildlich zu erweitern vorschlägt. Auch wenn die GKV-Reform primär ausgaben- und strukturseitig ansetzt, bestätigt sie den in § 5.1 angerissenen finanzpolitischen Befund: Die lohnbasierten Sicherungszweige geraten gleichzeitig durch demografischen Druck und durch die in § 1.1 dokumentierten KI-induzierten Beschäftigungsverschiebungen unter Spannung — eine Verbreiterung der Bemessungsgrundlage gewinnt damit zusätzlich an Plausibilität.</w:t>
+        <w:t xml:space="preserve"> beschlossen; im Verlauf der Ressortabstimmung wurde das Sparvolumen je nach Berichterstattung mit rund 16,3 Milliarden Euro (Frühberichterstattung) bzw. rund 19,6 Milliarden Euro (BMG-Tabellen Stand Anfang Mai 2026, gegliedert in 4,9 Milliarden einnahmen­seitige und rund 15 Milliarden ausgaben­seitige Komponenten) für 2027 angegeben; bis 2030 sieht das BMG eine Steigerung des Konsolidierungseffekts auf rund 42,8 Milliarden Euro vor. Die parlamentarische Behandlung soll laut BMG-Zeitplan vor der Sommerpause 2026 abgeschlossen werden — der Kabinettentwurf wird dem Bundesrat im ersten Durchgang am 8. Mai 2026 zugeleitet, die erste Bundestagslesung ist im weiteren Verlauf des Mai/Juni 2026 vorgesehen. Die Reform belastet Krankenhäuser, pharmazeutische Industrie, Apotheken, Ärzteschaft, Versicherte, Arbeitgeber und Krankenkassen gemeinsam; sie folgt dem Leitsatz „Ausgaben an Einnahmen koppeln" und greift damit fiskalisch genau die Logik auf, die § 5.1 in der Beitrags­seite spiegelbildlich zu erweitern vorschlägt. Auch wenn die GKV-Reform primär ausgaben- und strukturseitig ansetzt, bestätigt sie den in § 5.1 angerissenen finanzpolitischen Befund: Die lohnbasierten Sicherungszweige geraten gleichzeitig durch demografischen Druck und durch die in § 1.1 dokumentierten KI-induzierten Beschäftigungsverschiebungen unter Spannung — eine Verbreiterung der Bemessungsgrundlage gewinnt damit zusätzlich an Plausibilität.</w:t>
       </w:r>
     </w:p>
     <w:p>
@@ -7142,6 +7340,106 @@
           <w:i w:val="0"/>
           <w:sz w:val="19"/>
         </w:rPr>
+        <w:t xml:space="preserve">Office of the Governor of Maine. (29. April 2026). </w:t>
+      </w:r>
+      <w:r>
+        <w:rPr>
+          <w:rFonts w:ascii="Arial" w:hAnsi="Arial"/>
+          <w:b w:val="0"/>
+          <w:i/>
+          <w:sz w:val="19"/>
+        </w:rPr>
+        <w:t>Executive Order 5 — An Order Establishing the Maine Data Center Advisory Council.</w:t>
+      </w:r>
+      <w:r>
+        <w:rPr>
+          <w:rFonts w:ascii="Arial" w:hAnsi="Arial"/>
+          <w:b w:val="0"/>
+          <w:i w:val="0"/>
+          <w:sz w:val="19"/>
+        </w:rPr>
+        <w:t xml:space="preserve"> 15-köpfiger Beirat mit Vorlagepflicht zum 29. Januar 2027; Direktive an Department of Energy Resources und Public Utilities Commission zum Schutz der Stromtarife. https://www.maine.gov/governor/mills/official_documents/executive-orders/2026-04-executive-order-5-order-establishing-maine-data-center | https://www.maine.gov/governor/mills/news/governor-mills-signs-executive-order-establish-maine-data-center-advisory-council-2026-04-29</w:t>
+      </w:r>
+    </w:p>
+    <w:p>
+      <w:pPr>
+        <w:jc w:val="both"/>
+      </w:pPr>
+      <w:r>
+        <w:rPr>
+          <w:rFonts w:ascii="Arial" w:hAnsi="Arial"/>
+          <w:b w:val="0"/>
+          <w:i w:val="0"/>
+          <w:sz w:val="19"/>
+        </w:rPr>
+        <w:t xml:space="preserve">Maine State Legislature / Office of the Governor. (24. April 2026). </w:t>
+      </w:r>
+      <w:r>
+        <w:rPr>
+          <w:rFonts w:ascii="Arial" w:hAnsi="Arial"/>
+          <w:b w:val="0"/>
+          <w:i/>
+          <w:sz w:val="19"/>
+        </w:rPr>
+        <w:t>LD 713 — An Act to Address the Tax Treatment of Data Centers.</w:t>
+      </w:r>
+      <w:r>
+        <w:rPr>
+          <w:rFonts w:ascii="Arial" w:hAnsi="Arial"/>
+          <w:b w:val="0"/>
+          <w:i w:val="0"/>
+          <w:sz w:val="19"/>
+        </w:rPr>
+        <w:t xml:space="preserve"> Ausschluss von Datenzentren ab dem 1. Juli 2026 von der </w:t>
+      </w:r>
+      <w:r>
+        <w:rPr>
+          <w:rFonts w:ascii="Arial" w:hAnsi="Arial"/>
+          <w:b w:val="0"/>
+          <w:i/>
+          <w:sz w:val="19"/>
+        </w:rPr>
+        <w:t>Business Equipment Tax Exemption</w:t>
+      </w:r>
+      <w:r>
+        <w:rPr>
+          <w:rFonts w:ascii="Arial" w:hAnsi="Arial"/>
+          <w:b w:val="0"/>
+          <w:i w:val="0"/>
+          <w:sz w:val="19"/>
+        </w:rPr>
+        <w:t xml:space="preserve"> (BETE) und vom </w:t>
+      </w:r>
+      <w:r>
+        <w:rPr>
+          <w:rFonts w:ascii="Arial" w:hAnsi="Arial"/>
+          <w:b w:val="0"/>
+          <w:i/>
+          <w:sz w:val="19"/>
+        </w:rPr>
+        <w:t>Dirigo Business Incentives Program</w:t>
+      </w:r>
+      <w:r>
+        <w:rPr>
+          <w:rFonts w:ascii="Arial" w:hAnsi="Arial"/>
+          <w:b w:val="0"/>
+          <w:i w:val="0"/>
+          <w:sz w:val="19"/>
+        </w:rPr>
+        <w:t>; Berichtspflicht des Department of Economic and Community Development bis 4. November 2026.</w:t>
+      </w:r>
+    </w:p>
+    <w:p>
+      <w:pPr>
+        <w:jc w:val="both"/>
+      </w:pPr>
+      <w:r>
+        <w:rPr>
+          <w:rFonts w:ascii="Arial" w:hAnsi="Arial"/>
+          <w:b w:val="0"/>
+          <w:i w:val="0"/>
+          <w:sz w:val="19"/>
+        </w:rPr>
         <w:t xml:space="preserve">Maine House of Representatives. (29. April 2026). </w:t>
       </w:r>
       <w:r>
@@ -8351,7 +8649,7 @@
           <w:i w:val="0"/>
           <w:sz w:val="19"/>
         </w:rPr>
-        <w:t xml:space="preserve">SkillSyncer / TrueUp / BusinessToday. (Stand 1. Mai 2026). </w:t>
+        <w:t xml:space="preserve">SkillSyncer / TrueUp / BusinessToday. (Stand 1./2. Mai 2026). </w:t>
       </w:r>
       <w:r>
         <w:rPr>
@@ -8360,7 +8658,7 @@
           <w:i/>
           <w:sz w:val="19"/>
         </w:rPr>
-        <w:t>Tech Layoffs Tracker — kumulierte Tech-Stellenstreichungen 2026: SkillSyncer 100.443 Personen aus 155 Layoff-Ereignissen; TrueUp 95.878 Personen aus 249 Layoff-Meldungen; allein April 2026 mehr als 40.000 Stellen (u. a. Oracle, Meta, Snap).</w:t>
+        <w:t>Tech Layoffs Tracker — kumulierte Tech-Stellenstreichungen 2026: SkillSyncer 113.863 Personen aus 179 Layoff-Ereignissen (Stand 2. Mai 2026, durchschnittlich 933 Personen pro Tag); TrueUp 95.878 Personen aus 249 Layoff-Meldungen; allein April 2026 mehr als 40.000 Stellen (u. a. Oracle, Meta, Snap).</w:t>
       </w:r>
       <w:r>
         <w:rPr>
@@ -8383,6 +8681,70 @@
           <w:i w:val="0"/>
           <w:sz w:val="19"/>
         </w:rPr>
+        <w:t xml:space="preserve">Goldman Sachs / Fortune. (6. April 2026). </w:t>
+      </w:r>
+      <w:r>
+        <w:rPr>
+          <w:rFonts w:ascii="Arial" w:hAnsi="Arial"/>
+          <w:b w:val="0"/>
+          <w:i/>
+          <w:sz w:val="19"/>
+        </w:rPr>
+        <w:t>AI is cutting 16,000 U.S. jobs a month — and Gen Z is taking the brunt, Goldman Sachs says.</w:t>
+      </w:r>
+      <w:r>
+        <w:rPr>
+          <w:rFonts w:ascii="Arial" w:hAnsi="Arial"/>
+          <w:b w:val="0"/>
+          <w:i w:val="0"/>
+          <w:sz w:val="19"/>
+        </w:rPr>
+        <w:t xml:space="preserve"> Schätzung des US-weiten KI-Verdrängungseffekts auf rund 16.000 Stellen pro Monat mit überproportionaler Wirkung auf Berufseinsteiger in routinisierten Bürotätigkeiten. https://fortune.com/2026/04/06/ai-tech-displacement-effect-gen-z-16000-jobs-per-month/</w:t>
+      </w:r>
+    </w:p>
+    <w:p>
+      <w:pPr>
+        <w:jc w:val="both"/>
+      </w:pPr>
+      <w:r>
+        <w:rPr>
+          <w:rFonts w:ascii="Arial" w:hAnsi="Arial"/>
+          <w:b w:val="0"/>
+          <w:i w:val="0"/>
+          <w:sz w:val="19"/>
+        </w:rPr>
+        <w:t xml:space="preserve">OpenAI Global Affairs / EdTech Innovation Hub. (18. März 2026 / Folgeberichterstattung). </w:t>
+      </w:r>
+      <w:r>
+        <w:rPr>
+          <w:rFonts w:ascii="Arial" w:hAnsi="Arial"/>
+          <w:b w:val="0"/>
+          <w:i/>
+          <w:sz w:val="19"/>
+        </w:rPr>
+        <w:t>OpenAI Worker Participation Forum / Participation Economy Forum (Washington, D.C.) — Konvent mit Randi Weingarten (American Federation of Teachers) und Sean McGarvey (North America's Building Trades Unions).</w:t>
+      </w:r>
+      <w:r>
+        <w:rPr>
+          <w:rFonts w:ascii="Arial" w:hAnsi="Arial"/>
+          <w:b w:val="0"/>
+          <w:i w:val="0"/>
+          <w:sz w:val="19"/>
+        </w:rPr>
+        <w:t xml:space="preserve"> https://www.edtechinnovationhub.com/news/openai-convenes-labor-leaders-to-address-ai-impact-on-jobs-and-skills</w:t>
+      </w:r>
+    </w:p>
+    <w:p>
+      <w:pPr>
+        <w:jc w:val="both"/>
+      </w:pPr>
+      <w:r>
+        <w:rPr>
+          <w:rFonts w:ascii="Arial" w:hAnsi="Arial"/>
+          <w:b w:val="0"/>
+          <w:i w:val="0"/>
+          <w:sz w:val="19"/>
+        </w:rPr>
         <w:t xml:space="preserve">Washington Post. (1. Mai 2026). </w:t>
       </w:r>
       <w:r>
@@ -8424,7 +8786,7 @@
           <w:i w:val="0"/>
           <w:sz w:val="19"/>
         </w:rPr>
-        <w:t xml:space="preserve"> Dieses Arbeitspapier gibt den Stand Anfang Mai 2026 (Schnitt am 2. Mai 2026) wieder. Die Debatte entwickelt sich dynamisch, insbesondere im Zuge der OpenAI-Strategiepapiere und der Eröffnung des OpenAI Workshop in Washington, D.C. im Mai 2026, des GKV-Beitragssatzstabilisierungsgesetzes (Kabinettsbeschluss 29. April 2026, parlamentarische Behandlung vor der Sommerpause 2026 angekündigt), der laufenden Trilog-Verhandlungen zum Digital Omnibus on AI (zweite Runde 28. April 2026 ohne Einigung; nächste Runde 13. Mai 2026), der für den 5. Mai 2026 angesetzten Arraignment-Verhandlung im Altman-Verfahren, der bis zum 6. Mai 2026 laufenden regulären Sitzungsperiode der Connecticut General Assembly (Schicksal von Raised Bill 515) sowie der Tech-Layoff-Trackerstände vom 1. Mai 2026 (SkillSyncer ≥ 100.443 Beschäftigte, TrueUp 95.878). Eine regelmäßige Aktualisierung ist vorgesehen.</w:t>
+        <w:t xml:space="preserve"> Dieses Arbeitspapier gibt den Stand Anfang Mai 2026 (Schnitt am 3. Mai 2026) wieder. Die Debatte entwickelt sich dynamisch, insbesondere im Zuge der OpenAI-Strategiepapiere und der Eröffnung des OpenAI Workshop in Washington, D.C. im Mai 2026, der ersten Bundesratslesung des GKV-Beitragssatzstabilisierungsgesetzes am 8. Mai 2026 (Kabinettsbeschluss 29. April 2026, parlamentarische Behandlung vor der Sommerpause 2026 angekündigt), der laufenden Trilog-Verhandlungen zum Digital Omnibus on AI (zweite Runde 28. April 2026 ohne Einigung; nächste Runde 13. Mai 2026), der für den 5. Mai 2026 angesetzten Arraignment-Verhandlung im Altman-Verfahren, der bis zum 6. Mai 2026 laufenden regulären Sitzungsperiode der Connecticut General Assembly (Schicksal von Raised Bill 515), der parallelen exekutiven Maine-Maßnahmen (Executive Order Nr. 5 zum Data Center Advisory Council vom 29. April 2026, LD 713 zum Subventionsausschluss vom 24. April 2026) sowie der Tech-Layoff-Trackerstände vom 2. Mai 2026 (SkillSyncer 113.863 Beschäftigte aus 179 Layoff-Ereignissen, TrueUp 95.878 Personen aus 249 Meldungen). Eine regelmäßige Aktualisierung ist vorgesehen.</w:t>
       </w:r>
     </w:p>
     <w:p>
@@ -8504,7 +8866,7 @@
         <w:color w:val="999999"/>
         <w:sz w:val="15"/>
       </w:rPr>
-      <w:t>Version 13.0 — Mai 2026 — CC BY 4.0</w:t>
+      <w:t>Version 14.0 — Mai 2026 — CC BY 4.0</w:t>
       <w:tab/>
       <w:t xml:space="preserve">Seite </w:t>
     </w:r>

</xml_diff>

<commit_message>
Version 14.0 -> 15.0: Connecticut SB 5 Hausabstimmung 1. Mai 2026, IAB-Prognose-Korrektur 24. März 2026
Zwei belegbare Entwicklungen mit Schnitt am 4. Mai 2026:

1. Connecticut SB 5 (Connecticut Artificial Intelligence Responsibility and
   Transparency Act): Hausabstimmung 131-17 am 1. Mai 2026, Lamont kündigt
   Unterzeichnung an. Erstmals US-bundesstaatliche Disclosure-Pflicht für
   KI-bezogene Beschäftigungsentscheidungen und KI-Layoffs (relevant für
   Typ-5-Mess-/Anknüpfungsproblematik in § 9.1). Korrektur SB 2 -> SB 5.

2. IAB-Frühjahrsprognose 24. März 2026 ("Fiskalpolitischer Rückenwind trifft
   auf geopolitischen Gegenwind"): Erwerbstätigkeit -90.000 (statt -20.000),
   svp. Beschäftigung -30.000 (erstmals seit 2009 nicht wachsend), BIP-Wachstum
   um 0,2 bis 0,3 Pp. durch Iran-Krieg gedämpft, sektoral Industrie -140.000 /
   öffentliche Dienste/Erziehung/Gesundheit +180.000.
</commit_message>
<xml_diff>
--- a/Arbeitspapier_KI_Robotik_Besteuerung.docx
+++ b/Arbeitspapier_KI_Robotik_Besteuerung.docx
@@ -112,7 +112,7 @@
           <w:color w:val="666666"/>
           <w:sz w:val="18"/>
         </w:rPr>
-        <w:t>Version 14.0</w:t>
+        <w:t>Version 15.0</w:t>
       </w:r>
     </w:p>
     <w:p>
@@ -184,7 +184,7 @@
           <w:i w:val="0"/>
           <w:sz w:val="19"/>
         </w:rPr>
-        <w:t xml:space="preserve">Der Einsatz von KI-Systemen und Robotik in produktiven und dienstleistenden Tätigkeiten beschleunigt sich. Zwei parallele Entwicklungen erzeugen politischen Handlungsdruck: Einerseits warnen Studien vor erheblichen Verschiebungen auf dem Arbeitsmarkt — das IAB (Institut für Arbeitsmarkt- und Berufsforschung) rechnet im KI-Szenario für Deutschland mit einem Wegfall oder Neuentstehen von rund 1,6 Millionen Stellen in den nächsten 15 Jahren bei gleichzeitigem Wertschöpfungszuwachs von 4,5 Billionen Euro; kurzfristig erwartet das IAB in seiner Prognose für 2025/2026 (Fassung vom 24. März 2026) bei einem Wachstum des Bruttoinlandsprodukts von 0,8 % einen leichten Rückgang der Erwerbstätigkeit um etwa 20.000 Personen und in dreizehn der sechzehn Bundesländer einen weiteren Anstieg der Arbeitslosigkeit. Das Erwerbspersonenpotenzial sinkt nach der aktualisierten Prognose erstmals um 40.000 auf 48,62 Millionen Personen — eine strukturelle Kenngröße, die das Finanzierungsproblem der lohnbasierten Sozialversicherung unabhängig von KI-Effekten verschärft. Parallel dazu dokumentiert eine Branchenauswertung für das erste Quartal 2026 rund 78.500 Stellenstreichungen in der weltweiten Tech-Industrie, davon etwa 48 % explizit als KI- oder Automatisierungsmaßnahmen begründet; im April 2026 traten Oracle (20.000 – 30.000 Stellen mit Bezug zur AI-Rechenzentrumsinfrastruktur), Meta (rund 8.000 Stellen ab 20. Mai 2026) und Amazon (rund 16.000 Stellen im Zuge einer KI-induzierten Umstrukturierung) hinzu; Branchen-Tracker weisen für 2026 bis Mitte April einen kumulierten Bestand von über 150.000 Tech-Stellenstreichungen aus. Am 24. April 2026 hat Microsoft zusätzlich Buyout-Programme für rund sieben Prozent seiner länger beschäftigten US-Belegschaft angekündigt; das Programm gilt nach Berichterstattung als das erste </w:t>
+        <w:t xml:space="preserve">Der Einsatz von KI-Systemen und Robotik in produktiven und dienstleistenden Tätigkeiten beschleunigt sich. Zwei parallele Entwicklungen erzeugen politischen Handlungsdruck: Einerseits warnen Studien vor erheblichen Verschiebungen auf dem Arbeitsmarkt — das IAB (Institut für Arbeitsmarkt- und Berufsforschung) rechnet im KI-Szenario für Deutschland mit einem Wegfall oder Neuentstehen von rund 1,6 Millionen Stellen in den nächsten 15 Jahren bei gleichzeitigem Wertschöpfungszuwachs von 4,5 Billionen Euro; kurzfristig hat das IAB seine Prognose für 2026 mit der Fassung vom 24. März 2026 („Fiskalpolitischer Rückenwind trifft auf geopolitischen Gegenwind") gegenüber dem IAB-Kurzbericht 19/2025 (24. September 2025, damals: −20.000 Erwerbstätigkeit) deutlich nach unten revidiert: Bei einem Wachstum des Bruttoinlandsprodukts von 0,8 % — laut IAB infolge des Iran-Krieges um 0,2 bis 0,3 Prozentpunkte gedämpft — wird nun ein Rückgang der Erwerbstätigkeit um 90.000 auf 45,89 Millionen Personen erwartet, ein erstmals seit der Finanzkrise 2009 nicht mehr wachsender Bestand sozialversicherungspflichtiger Beschäftigung (−30.000 auf 34,93 Millionen) sowie ein Anstieg der Arbeitslosigkeit um 40.000; in dreizehn der sechzehn Bundesländer ist nach der parallelen IAB-Regionalprognose mit einem weiteren Anstieg der Arbeitslosigkeit zu rechnen. Sektoral fällt der Befund zweigeteilt aus: Der Industriesektor verliert rund 140.000 Stellen, während öffentliche Dienste, Erziehung und Gesundheit zusammen rund 180.000 Stellen aufbauen. Das Erwerbspersonenpotenzial sinkt nach der aktualisierten Prognose erstmals um 40.000 auf 48,62 Millionen Personen — eine strukturelle Kenngröße, die das Finanzierungsproblem der lohnbasierten Sozialversicherung unabhängig von KI-Effekten verschärft. Parallel dazu dokumentiert eine Branchenauswertung für das erste Quartal 2026 rund 78.500 Stellenstreichungen in der weltweiten Tech-Industrie, davon etwa 48 % explizit als KI- oder Automatisierungsmaßnahmen begründet; im April 2026 traten Oracle (20.000 – 30.000 Stellen mit Bezug zur AI-Rechenzentrumsinfrastruktur), Meta (rund 8.000 Stellen ab 20. Mai 2026) und Amazon (rund 16.000 Stellen im Zuge einer KI-induzierten Umstrukturierung) hinzu; Branchen-Tracker weisen für 2026 bis Mitte April einen kumulierten Bestand von über 150.000 Tech-Stellenstreichungen aus. Am 24. April 2026 hat Microsoft zusätzlich Buyout-Programme für rund sieben Prozent seiner länger beschäftigten US-Belegschaft angekündigt; das Programm gilt nach Berichterstattung als das erste </w:t>
       </w:r>
       <w:r>
         <w:rPr>
@@ -2053,7 +2053,7 @@
           <w:i w:val="0"/>
           <w:sz w:val="19"/>
         </w:rPr>
-        <w:t xml:space="preserve">, der Umschulung, technische Aus- und Weiterbildung sowie Übergangsmaßnahmen für verdrängte Beschäftigte finanzieren soll. Spiegelbildlich enthält der Entwurf eine Ausnahme für „augmented productivity": Steigt die Wertschöpfung pro Beschäftigtem ohne Personalabbau, soll keine zusätzliche Belastung greifen. Parallel hat der Connecticut-Senat am 21./24. April 2026 mit dem umfassenderen </w:t>
+        <w:t xml:space="preserve">, der Umschulung, technische Aus- und Weiterbildung sowie Übergangsmaßnahmen für verdrängte Beschäftigte finanzieren soll. Spiegelbildlich enthält der Entwurf eine Ausnahme für „augmented productivity": Steigt die Wertschöpfung pro Beschäftigtem ohne Personalabbau, soll keine zusätzliche Belastung greifen. Parallel hat der Connecticut-Senat am 21. April 2026 mit dem umfassenderen </w:t>
       </w:r>
       <w:r>
         <w:rPr>
@@ -2062,16 +2062,88 @@
           <w:i/>
           <w:sz w:val="19"/>
         </w:rPr>
-        <w:t>SB 2</w:t>
-      </w:r>
-      <w:r>
-        <w:rPr>
-          <w:rFonts w:ascii="Arial" w:hAnsi="Arial"/>
-          <w:b w:val="0"/>
-          <w:i w:val="0"/>
-          <w:sz w:val="19"/>
-        </w:rPr>
-        <w:t xml:space="preserve"> (Senatsabstimmung 32 zu 4) einen Rahmen für Frontier-AI-Modelle, ein staatliches AI-Sandbox-Modell und eine Beratungsstruktur beschlossen, der inhaltlich neben — nicht in — dem Bill 515 steht. Für die hier geführte Steuerdebatte ist Connecticut deshalb relevant, weil der Bill-515-Mechanismus erstmals einen US-bundesstaatlichen Vorschlag formuliert, der dem in § 2.1 als Typ 5 typisierten </w:t>
+        <w:t>Senate Bill 5</w:t>
+      </w:r>
+      <w:r>
+        <w:rPr>
+          <w:rFonts w:ascii="Arial" w:hAnsi="Arial"/>
+          <w:b w:val="0"/>
+          <w:i w:val="0"/>
+          <w:sz w:val="19"/>
+        </w:rPr>
+        <w:t xml:space="preserve"> (offizieller Titel: </w:t>
+      </w:r>
+      <w:r>
+        <w:rPr>
+          <w:rFonts w:ascii="Arial" w:hAnsi="Arial"/>
+          <w:b w:val="0"/>
+          <w:i/>
+          <w:sz w:val="19"/>
+        </w:rPr>
+        <w:t>Connecticut Artificial Intelligence Responsibility and Transparency Act</w:t>
+      </w:r>
+      <w:r>
+        <w:rPr>
+          <w:rFonts w:ascii="Arial" w:hAnsi="Arial"/>
+          <w:b w:val="0"/>
+          <w:i w:val="0"/>
+          <w:sz w:val="19"/>
+        </w:rPr>
+        <w:t xml:space="preserve">; Senatsabstimmung 32 zu 4) einen Rahmen für Frontier-AI-Modelle, ein staatliches AI-Sandbox-Modell und eine Beratungsstruktur beschlossen, der inhaltlich neben — nicht in — dem Bill 515 steht; das Repräsentantenhaus hat </w:t>
+      </w:r>
+      <w:r>
+        <w:rPr>
+          <w:rFonts w:ascii="Arial" w:hAnsi="Arial"/>
+          <w:b w:val="0"/>
+          <w:i/>
+          <w:sz w:val="19"/>
+        </w:rPr>
+        <w:t>SB 5</w:t>
+      </w:r>
+      <w:r>
+        <w:rPr>
+          <w:rFonts w:ascii="Arial" w:hAnsi="Arial"/>
+          <w:b w:val="0"/>
+          <w:i w:val="0"/>
+          <w:sz w:val="19"/>
+        </w:rPr>
+        <w:t xml:space="preserve"> am 1. Mai 2026 mit 131 zu 17 Stimmen verabschiedet, Gouverneur Ned Lamont hat seine Unterzeichnung angekündigt. Für die Steuerdebatte ist neben Frontier- und Sandbox-Komponenten vor allem ein arbeitsrechtlicher Baustein bemerkenswert: </w:t>
+      </w:r>
+      <w:r>
+        <w:rPr>
+          <w:rFonts w:ascii="Arial" w:hAnsi="Arial"/>
+          <w:b w:val="0"/>
+          <w:i/>
+          <w:sz w:val="19"/>
+        </w:rPr>
+        <w:t>SB 5</w:t>
+      </w:r>
+      <w:r>
+        <w:rPr>
+          <w:rFonts w:ascii="Arial" w:hAnsi="Arial"/>
+          <w:b w:val="0"/>
+          <w:i w:val="0"/>
+          <w:sz w:val="19"/>
+        </w:rPr>
+        <w:t xml:space="preserve"> verpflichtet Arbeitgeber ab Geltungsbeginn dazu, Beschäftigte und Bewerber zu informieren, wenn KI-Systeme als „substantieller Faktor" in Beschäftigungsentscheidungen einfließen, und — komplementär dazu — Stellenstreichungen offenzulegen, die mit dem Einsatz von KI in Zusammenhang stehen. Damit wird auf US-bundesstaatlicher Ebene erstmals eine </w:t>
+      </w:r>
+      <w:r>
+        <w:rPr>
+          <w:rFonts w:ascii="Arial" w:hAnsi="Arial"/>
+          <w:b w:val="0"/>
+          <w:i/>
+          <w:sz w:val="19"/>
+        </w:rPr>
+        <w:t>Disclosure</w:t>
+      </w:r>
+      <w:r>
+        <w:rPr>
+          <w:rFonts w:ascii="Arial" w:hAnsi="Arial"/>
+          <w:b w:val="0"/>
+          <w:i w:val="0"/>
+          <w:sz w:val="19"/>
+        </w:rPr>
+        <w:t xml:space="preserve">-Pflicht kodifiziert, die genau jene Kausalitätsmessung adressiert, an der eine zielgerichtete Ersatzabgabe (Typ 5 nach § 2.1, vgl. § 9.1) bislang scheitert: Der gesetzgeberische Pfad wandert von der unmittelbar fiskalischen Anknüpfung (Bill 515) zur informationsrechtlichen Vorbereitung einer späteren Anknüpfung (SB 5), ohne den Mess-/Umgehungsproblemen Auflösungen anzubieten. Für die hier geführte Steuerdebatte ist Connecticut deshalb relevant, weil der Bill-515-Mechanismus erstmals einen US-bundesstaatlichen Vorschlag formuliert, der dem in § 2.1 als Typ 5 typisierten </w:t>
       </w:r>
       <w:r>
         <w:rPr>
@@ -6604,6 +6676,70 @@
           <w:i w:val="0"/>
           <w:sz w:val="19"/>
         </w:rPr>
+        <w:t xml:space="preserve">IAB. (24. September 2025). </w:t>
+      </w:r>
+      <w:r>
+        <w:rPr>
+          <w:rFonts w:ascii="Arial" w:hAnsi="Arial"/>
+          <w:b w:val="0"/>
+          <w:i/>
+          <w:sz w:val="19"/>
+        </w:rPr>
+        <w:t>IAB-Prognose 2025/2026: Arbeitsmarkt profitiert von Fiskalpaketen, wird aber durch den demografischen Wandel gebremst</w:t>
+      </w:r>
+      <w:r>
+        <w:rPr>
+          <w:rFonts w:ascii="Arial" w:hAnsi="Arial"/>
+          <w:b w:val="0"/>
+          <w:i w:val="0"/>
+          <w:sz w:val="19"/>
+        </w:rPr>
+        <w:t xml:space="preserve"> (IAB-Kurzbericht 19/2025). Ursprungsfassung mit Erwerbstätigkeit −20.000 für 2026 vor Iran-Krieg-Revision. https://iab.de/presseinfo/iab-prognose-fuer-2025-2026-arbeitsmarkt-profitiert-von-fiskalpaketen-wird-aber-durch-den-demografischen-wandel-gebremst/</w:t>
+      </w:r>
+    </w:p>
+    <w:p>
+      <w:pPr>
+        <w:jc w:val="both"/>
+      </w:pPr>
+      <w:r>
+        <w:rPr>
+          <w:rFonts w:ascii="Arial" w:hAnsi="Arial"/>
+          <w:b w:val="0"/>
+          <w:i w:val="0"/>
+          <w:sz w:val="19"/>
+        </w:rPr>
+        <w:t xml:space="preserve">IAB. (24. März 2026). </w:t>
+      </w:r>
+      <w:r>
+        <w:rPr>
+          <w:rFonts w:ascii="Arial" w:hAnsi="Arial"/>
+          <w:b w:val="0"/>
+          <w:i/>
+          <w:sz w:val="19"/>
+        </w:rPr>
+        <w:t>IAB-Prognose für 2026: Fiskalpolitischer Rückenwind trifft auf geopolitischen Gegenwind.</w:t>
+      </w:r>
+      <w:r>
+        <w:rPr>
+          <w:rFonts w:ascii="Arial" w:hAnsi="Arial"/>
+          <w:b w:val="0"/>
+          <w:i w:val="0"/>
+          <w:sz w:val="19"/>
+        </w:rPr>
+        <w:t xml:space="preserve"> Aktualisierte Frühjahrs­prognose; BIP +0,8 % (−0,2 bis −0,3 Pp. infolge Iran-Krieg), Erwerbstätigkeit −90.000 auf 45,89 Mio., sozialversicherungspflichtige Beschäftigung −30.000 auf 34,93 Mio., Arbeitslosigkeit +40.000, Erwerbspersonenpotenzial −40.000 auf 48,62 Mio.; Sektoral: Industrie −140.000, öffentliche Dienste/Erziehung/Gesundheit +180.000. https://iab.de/presseinfo/iab-prognose-fuer-2026-fiskalpolitischer-rueckenwind-trifft-auf-geopolitischen-gegenwind/</w:t>
+      </w:r>
+    </w:p>
+    <w:p>
+      <w:pPr>
+        <w:jc w:val="both"/>
+      </w:pPr>
+      <w:r>
+        <w:rPr>
+          <w:rFonts w:ascii="Arial" w:hAnsi="Arial"/>
+          <w:b w:val="0"/>
+          <w:i w:val="0"/>
+          <w:sz w:val="19"/>
+        </w:rPr>
         <w:t xml:space="preserve">IAB. (März 2026). </w:t>
       </w:r>
       <w:r>
@@ -6613,16 +6749,16 @@
           <w:i/>
           <w:sz w:val="19"/>
         </w:rPr>
-        <w:t>IAB-Prognose 2025/2026: Arbeitsmarkt profitiert von Fiskalpaketen, wird aber durch den demografischen Wandel gebremst.</w:t>
-      </w:r>
-      <w:r>
-        <w:rPr>
-          <w:rFonts w:ascii="Arial" w:hAnsi="Arial"/>
-          <w:b w:val="0"/>
-          <w:i w:val="0"/>
-          <w:sz w:val="19"/>
-        </w:rPr>
-        <w:t xml:space="preserve"> Presseinformation und Kurzbericht (Fassung vom 24. März 2026; BIP-Wachstum +0,8 %, Erwerbspersonenpotenzial sinkt um 40.000 auf 48,62 Mio.). https://iab.de/presseinfo/iab-prognose-fuer-2025-2026-arbeitsmarkt-profitiert-von-fiskalpaketen-wird-aber-durch-den-demografischen-wandel-gebremst/</w:t>
+        <w:t>IAB-Regionalprognose 2026: In den meisten Bundesländern sinkt die Beschäftigung</w:t>
+      </w:r>
+      <w:r>
+        <w:rPr>
+          <w:rFonts w:ascii="Arial" w:hAnsi="Arial"/>
+          <w:b w:val="0"/>
+          <w:i w:val="0"/>
+          <w:sz w:val="19"/>
+        </w:rPr>
+        <w:t xml:space="preserve"> (IAB-Kurzbericht 6/2026). Anstieg der Arbeitslosigkeit in 13 von 16 Bundesländern; höchste relative Anstiege Berlin +3,3 %, Sachsen +3,0 %; Rückgänge Schleswig-Holstein −0,5 %, Niedersachsen −0,4 %, Saarland −0,3 %. https://doku.iab.de/kurzber/2026/kb2026-06.pdf</w:t>
       </w:r>
     </w:p>
     <w:p>
@@ -6828,7 +6964,7 @@
           <w:i w:val="0"/>
           <w:sz w:val="19"/>
         </w:rPr>
-        <w:t xml:space="preserve">Connecticut General Assembly. (24. April 2026). </w:t>
+        <w:t xml:space="preserve">Connecticut General Assembly. (April–Mai 2026). </w:t>
       </w:r>
       <w:r>
         <w:rPr>
@@ -6837,16 +6973,16 @@
           <w:i/>
           <w:sz w:val="19"/>
         </w:rPr>
-        <w:t>Senate Bill 2 — An Act Concerning Artificial Intelligence (Frontier Models, AI Sandbox, Advisory Council).</w:t>
-      </w:r>
-      <w:r>
-        <w:rPr>
-          <w:rFonts w:ascii="Arial" w:hAnsi="Arial"/>
-          <w:b w:val="0"/>
-          <w:i w:val="0"/>
-          <w:sz w:val="19"/>
-        </w:rPr>
-        <w:t xml:space="preserve"> Senatsabstimmung 32 zu 4. https://legiscan.com/CT/bill/SB00002/2025</w:t>
+        <w:t>Senate Bill 5 (2026) — Connecticut Artificial Intelligence Responsibility and Transparency Act</w:t>
+      </w:r>
+      <w:r>
+        <w:rPr>
+          <w:rFonts w:ascii="Arial" w:hAnsi="Arial"/>
+          <w:b w:val="0"/>
+          <w:i w:val="0"/>
+          <w:sz w:val="19"/>
+        </w:rPr>
+        <w:t xml:space="preserve"> (Frontier Models, AI-Sandbox, Beratungsstruktur, AI-Layoff-Disclosure). Senatsabstimmung 21. April 2026: 32 zu 4; Hausabstimmung 1. Mai 2026: 131 zu 17. https://www.cga.ct.gov/asp/cgabillstatus/cgabillstatus.asp?selBillType=Bill&amp;bill_num=SB5&amp;which_year=2026 | https://legiscan.com/CT/bill/SB00005/2026</w:t>
       </w:r>
     </w:p>
     <w:p>
@@ -8539,7 +8675,7 @@
           <w:i w:val="0"/>
           <w:sz w:val="19"/>
         </w:rPr>
-        <w:t xml:space="preserve"> Bericht zur Senatsabstimmung über SB 2. https://ctmirror.org/2026/04/21/artificial-intelligence-regulation-senate-ct/</w:t>
+        <w:t xml:space="preserve"> Bericht zur Senatsabstimmung über SB 5. https://ctmirror.org/2026/04/21/artificial-intelligence-regulation-senate-ct/</w:t>
       </w:r>
     </w:p>
     <w:p>
@@ -8553,6 +8689,88 @@
           <w:i w:val="0"/>
           <w:sz w:val="19"/>
         </w:rPr>
+        <w:t xml:space="preserve">CT Mirror. (1./2. Mai 2026). </w:t>
+      </w:r>
+      <w:r>
+        <w:rPr>
+          <w:rFonts w:ascii="Arial" w:hAnsi="Arial"/>
+          <w:b w:val="0"/>
+          <w:i/>
+          <w:sz w:val="19"/>
+        </w:rPr>
+        <w:t>Connecticut passes AI regulations after years in development.</w:t>
+      </w:r>
+      <w:r>
+        <w:rPr>
+          <w:rFonts w:ascii="Arial" w:hAnsi="Arial"/>
+          <w:b w:val="0"/>
+          <w:i w:val="0"/>
+          <w:sz w:val="19"/>
+        </w:rPr>
+        <w:t xml:space="preserve"> Bericht zur Hausabstimmung über </w:t>
+      </w:r>
+      <w:r>
+        <w:rPr>
+          <w:rFonts w:ascii="Arial" w:hAnsi="Arial"/>
+          <w:b w:val="0"/>
+          <w:i/>
+          <w:sz w:val="19"/>
+        </w:rPr>
+        <w:t>SB 5</w:t>
+      </w:r>
+      <w:r>
+        <w:rPr>
+          <w:rFonts w:ascii="Arial" w:hAnsi="Arial"/>
+          <w:b w:val="0"/>
+          <w:i w:val="0"/>
+          <w:sz w:val="19"/>
+        </w:rPr>
+        <w:t xml:space="preserve"> (131 zu 17) und zur Ankündigung Lamonts, das Gesetz zu unterzeichnen. https://ctmirror.org/2026/05/01/artificial-intelligence-house-regulation-passage-ct/</w:t>
+      </w:r>
+    </w:p>
+    <w:p>
+      <w:pPr>
+        <w:jc w:val="both"/>
+      </w:pPr>
+      <w:r>
+        <w:rPr>
+          <w:rFonts w:ascii="Arial" w:hAnsi="Arial"/>
+          <w:b w:val="0"/>
+          <w:i w:val="0"/>
+          <w:sz w:val="19"/>
+        </w:rPr>
+        <w:t xml:space="preserve">Pluribus News. (1. Mai 2026). </w:t>
+      </w:r>
+      <w:r>
+        <w:rPr>
+          <w:rFonts w:ascii="Arial" w:hAnsi="Arial"/>
+          <w:b w:val="0"/>
+          <w:i/>
+          <w:sz w:val="19"/>
+        </w:rPr>
+        <w:t>Connecticut legislators pass sweeping AI bill.</w:t>
+      </w:r>
+      <w:r>
+        <w:rPr>
+          <w:rFonts w:ascii="Arial" w:hAnsi="Arial"/>
+          <w:b w:val="0"/>
+          <w:i w:val="0"/>
+          <w:sz w:val="19"/>
+        </w:rPr>
+        <w:t xml:space="preserve"> Berichterstattung zu Frontier-Modell-Aufsicht, AI-Sandbox, Whistleblower-Schutz, Disclosure-Pflichten bei AI-bezogenen Beschäftigungsentscheidungen und AI-Layoffs sowie Connecticut AI Academy. https://pluribusnews.com/news-and-events/connecticut-legislators-pass-sweeping-ai-bill/</w:t>
+      </w:r>
+    </w:p>
+    <w:p>
+      <w:pPr>
+        <w:jc w:val="both"/>
+      </w:pPr>
+      <w:r>
+        <w:rPr>
+          <w:rFonts w:ascii="Arial" w:hAnsi="Arial"/>
+          <w:b w:val="0"/>
+          <w:i w:val="0"/>
+          <w:sz w:val="19"/>
+        </w:rPr>
         <w:t xml:space="preserve">Hartford Business Journal. (April 2026). </w:t>
       </w:r>
       <w:r>
@@ -8786,7 +9004,25 @@
           <w:i w:val="0"/>
           <w:sz w:val="19"/>
         </w:rPr>
-        <w:t xml:space="preserve"> Dieses Arbeitspapier gibt den Stand Anfang Mai 2026 (Schnitt am 3. Mai 2026) wieder. Die Debatte entwickelt sich dynamisch, insbesondere im Zuge der OpenAI-Strategiepapiere und der Eröffnung des OpenAI Workshop in Washington, D.C. im Mai 2026, der ersten Bundesratslesung des GKV-Beitragssatzstabilisierungsgesetzes am 8. Mai 2026 (Kabinettsbeschluss 29. April 2026, parlamentarische Behandlung vor der Sommerpause 2026 angekündigt), der laufenden Trilog-Verhandlungen zum Digital Omnibus on AI (zweite Runde 28. April 2026 ohne Einigung; nächste Runde 13. Mai 2026), der für den 5. Mai 2026 angesetzten Arraignment-Verhandlung im Altman-Verfahren, der bis zum 6. Mai 2026 laufenden regulären Sitzungsperiode der Connecticut General Assembly (Schicksal von Raised Bill 515), der parallelen exekutiven Maine-Maßnahmen (Executive Order Nr. 5 zum Data Center Advisory Council vom 29. April 2026, LD 713 zum Subventionsausschluss vom 24. April 2026) sowie der Tech-Layoff-Trackerstände vom 2. Mai 2026 (SkillSyncer 113.863 Beschäftigte aus 179 Layoff-Ereignissen, TrueUp 95.878 Personen aus 249 Meldungen). Eine regelmäßige Aktualisierung ist vorgesehen.</w:t>
+        <w:t xml:space="preserve"> Dieses Arbeitspapier gibt den Stand Anfang Mai 2026 (Schnitt am 4. Mai 2026) wieder. Die Debatte entwickelt sich dynamisch, insbesondere im Zuge der OpenAI-Strategiepapiere und der Eröffnung des OpenAI Workshop in Washington, D.C. im Mai 2026, der ersten Bundesratslesung des GKV-Beitragssatzstabilisierungsgesetzes am 8. Mai 2026 (Kabinettsbeschluss 29. April 2026, parlamentarische Behandlung vor der Sommerpause 2026 angekündigt), der laufenden Trilog-Verhandlungen zum Digital Omnibus on AI (zweite Runde 28. April 2026 ohne Einigung; nächste Runde 13. Mai 2026), der für den 5. Mai 2026 angesetzten Arraignment-Verhandlung im Altman-Verfahren, des am 1. Mai 2026 vom Connecticut-Repräsentantenhaus mit 131 zu 17 Stimmen verabschiedeten </w:t>
+      </w:r>
+      <w:r>
+        <w:rPr>
+          <w:rFonts w:ascii="Arial" w:hAnsi="Arial"/>
+          <w:b w:val="0"/>
+          <w:i/>
+          <w:sz w:val="19"/>
+        </w:rPr>
+        <w:t>SB 5 — Connecticut Artificial Intelligence Responsibility and Transparency Act</w:t>
+      </w:r>
+      <w:r>
+        <w:rPr>
+          <w:rFonts w:ascii="Arial" w:hAnsi="Arial"/>
+          <w:b w:val="0"/>
+          <w:i w:val="0"/>
+          <w:sz w:val="19"/>
+        </w:rPr>
+        <w:t xml:space="preserve"> mit angekündigter Unterzeichnung durch Gouverneur Lamont, der bis zum 6. Mai 2026 laufenden regulären Sitzungsperiode der Connecticut General Assembly (Schicksal von Raised Bill 515), der parallelen exekutiven Maine-Maßnahmen (Executive Order Nr. 5 zum Data Center Advisory Council vom 29. April 2026, LD 713 zum Subventionsausschluss vom 24. April 2026), der revidierten IAB-Frühjahrsprognose vom 24. März 2026 (Erwerbstätigkeit −90.000, BIP +0,8 % bei 0,2 bis 0,3 Pp. Iran-Krieg-Dämpfung) sowie der Tech-Layoff-Trackerstände vom 2. Mai 2026 (SkillSyncer 113.863 Beschäftigte aus 179 Layoff-Ereignissen, TrueUp 95.878 Personen aus 249 Meldungen). Eine regelmäßige Aktualisierung ist vorgesehen.</w:t>
       </w:r>
     </w:p>
     <w:p>
@@ -8866,7 +9102,7 @@
         <w:color w:val="999999"/>
         <w:sz w:val="15"/>
       </w:rPr>
-      <w:t>Version 14.0 — Mai 2026 — CC BY 4.0</w:t>
+      <w:t>Version 15.0 — Mai 2026 — CC BY 4.0</w:t>
       <w:tab/>
       <w:t xml:space="preserve">Seite </w:t>
     </w:r>

</xml_diff>

<commit_message>
Version 16.0 -> 17.0: Massenkoff/McCrory Labor Market Impacts, Anthropic Economic Index Survey, Altman-Arraignment 5. Mai, Tech-Layoff-Stand 6. Mai, Cypriot-Presidency-Frist
</commit_message>
<xml_diff>
--- a/Arbeitspapier_KI_Robotik_Besteuerung.docx
+++ b/Arbeitspapier_KI_Robotik_Besteuerung.docx
@@ -202,7 +202,7 @@
           <w:i w:val="0"/>
           <w:sz w:val="19"/>
         </w:rPr>
-        <w:t xml:space="preserve"> der Konzerngeschichte und zielt — bei rund 125.000 US-Beschäftigten — auf bis zu 8.750 mögliche Austritte. Eligible sind Beschäftigte, deren Summe aus Lebensalter und Betriebszugehörigkeit mindestens 70 erreicht; die Benachrichtigung läuft am 7. Mai 2026 mit einer 30-Tage-Annahmefrist. Im Zusammenspiel mit den am selben Tag bekräftigten Meta-Streichungen ordneten Wirtschaftsmedien (CNBC, 24. April 2026) die Welle erstmals als „AI-driven labor crisis" ein — ein Begriff, der den Übergang von Einzelfällen zu einer kumulativen Branchenerzählung markiert. Bis zur Wochenmitte des 25. April 2026 weisen Branchen-Tracker einen kumulierten Bestand von über 92.000 Tech-Stellenstreichungen für das laufende Jahr 2026 aus; eine Aktualisierung zum 2. Mai 2026 hebt die Marke nach Tracker-Methodik des SkillSyncer auf 113.863 betroffene Beschäftigte aus 179 erfassten Layoff-Ereignissen (durchschnittlich rund 933 Stellen pro Tag), während TrueUp parallel 95.878 Personen aus 249 Einzelmeldungen zählt; die Methodikspanne erklärt die unterschiedlichen Größenordnungen, das Niveau einer sechsstelligen Tech-Reduktion innerhalb von vier Monaten ist über alle Tracker hinweg konsistent. Eine ergänzende Auswertung von Goldman Sachs (Anfang April 2026) schätzt den US-weiten KI-Verdrängungseffekt auf rund 16.000 Stellen pro Monat, mit überproportionaler Betroffenheit von Berufseinsteigerinnen und -einsteigern (Gen Z) in routinisierten Bürotätigkeiten — diese Größenordnung stützt die in § 3.5 referierten Beobachtungen aus dem </w:t>
+        <w:t xml:space="preserve"> der Konzerngeschichte und zielt — bei rund 125.000 US-Beschäftigten — auf bis zu 8.750 mögliche Austritte. Eligible sind Beschäftigte, deren Summe aus Lebensalter und Betriebszugehörigkeit mindestens 70 erreicht; die Benachrichtigung läuft am 7. Mai 2026 mit einer 30-Tage-Annahmefrist. Im Zusammenspiel mit den am selben Tag bekräftigten Meta-Streichungen ordneten Wirtschaftsmedien (CNBC, 24. April 2026) die Welle erstmals als „AI-driven labor crisis" ein — ein Begriff, der den Übergang von Einzelfällen zu einer kumulativen Branchenerzählung markiert. Bis zur Wochenmitte des 25. April 2026 weisen Branchen-Tracker einen kumulierten Bestand von über 92.000 Tech-Stellenstreichungen für das laufende Jahr 2026 aus; eine Aktualisierung zum 2. Mai 2026 hebt die Marke nach Tracker-Methodik des SkillSyncer auf 113.863 betroffene Beschäftigte aus 179 erfassten Layoff-Ereignissen (durchschnittlich rund 933 Stellen pro Tag), während TrueUp parallel 95.878 Personen aus 249 Einzelmeldungen zählt; die Methodikspanne erklärt die unterschiedlichen Größenordnungen, das Niveau einer sechsstelligen Tech-Reduktion innerhalb von vier Monaten ist über alle Tracker hinweg konsistent. Eine erneute Aktualisierung zum 6. Mai 2026 zeigt, dass die TrueUp-Zählung weiter auf 119.721 betroffene Personen aus 265 Layoff-Meldungen gestiegen ist (rund 958 Stellen pro Tag), während SkillSyncer mit 113.863 Personen aus 179 Ereignissen weitgehend unverändert bleibt; der parallele Lauf der Branchen-AI-Capex-Programme (Q1-2026-Investitionen der Hyperscaler von rund 130,65 Milliarden US-Dollar; Konsens-Schätzung für 2026 zwischen 660 und 700 Milliarden US-Dollar; Ausblick auf über 1 Billion US-Dollar im Jahr 2027) verdeutlicht die Asymmetrie zwischen Personalreduktion und Infrastrukturausbau, die die Steuerdebatte über die Anknüpfung an Maschinenkapital (§ 5.1, § 8.3) zusätzlich strukturiert. Eine ergänzende Auswertung von Goldman Sachs (Anfang April 2026) schätzt den US-weiten KI-Verdrängungseffekt auf rund 16.000 Stellen pro Monat, mit überproportionaler Betroffenheit von Berufseinsteigerinnen und -einsteigern (Gen Z) in routinisierten Bürotätigkeiten — diese Größenordnung stützt die in § 3.5 referierten Beobachtungen aus dem </w:t>
       </w:r>
       <w:r>
         <w:rPr>
@@ -1368,7 +1368,79 @@
           <w:i w:val="0"/>
           <w:sz w:val="19"/>
         </w:rPr>
-        <w:t xml:space="preserve"> vom 24. März 2026 wertet erstmals die Februar-2026-Nutzung aus und liefert drei zusätzliche Befunde: Erstens haben rund 49 % aller Berufe inzwischen mindestens ein Viertel ihrer Tätigkeiten mit Claude bearbeiten lassen — ein Hinweis darauf, dass die Adoptionsbreite das ursprünglich erwartete Tempo übersteigt. Zweitens flacht die geografische Konzentration der Nutzung ab: Der Anteil der fünf nutzungsstärksten US-Bundesstaaten ist zwischen August 2025 und Februar 2026 von 30 auf 24 % gefallen, der Gini-Koeffizient sinkt — die Konvergenz auf gleichmäßige Pro-Kopf-Nutzung verläuft jedoch langsamer als zuvor angenommen (geschätzt 5–9 Jahre). Drittens diversifiziert sich der Anwendungsmix in der Verbraucher-Oberfläche: Der Anteil der Top-10-Aufgaben sinkt, parallel steigt der Augmentations-Anteil (kollaborative Nutzung) leicht an. Für die hier geführte Steuerdebatte stützt das Bild die in Kapitel 8 entwickelte szenariorobuste Linie — schnelle Adoption (Breite) ohne klar messbare aggregierte Beschäftigungseinbrüche, aber mit erkennbaren sektoralen und altersspezifischen Frühwirkungen. Das bedeutet nicht, dass die Finanzierungsfrage des Sozialstaats damit entschärft wäre — sektorale Verschiebungen können trotz moderater aggregierter Effekte erheblich sein —, es spricht aber dafür, das steuerpolitische Instrumentarium </w:t>
+        <w:t xml:space="preserve"> vom 24. März 2026 wertet erstmals die Februar-2026-Nutzung aus und liefert drei zusätzliche Befunde: Erstens haben rund 49 % aller Berufe inzwischen mindestens ein Viertel ihrer Tätigkeiten mit Claude bearbeiten lassen — ein Hinweis darauf, dass die Adoptionsbreite das ursprünglich erwartete Tempo übersteigt. Zweitens flacht die geografische Konzentration der Nutzung ab: Der Anteil der fünf nutzungsstärksten US-Bundesstaaten ist zwischen August 2025 und Februar 2026 von 30 auf 24 % gefallen, der Gini-Koeffizient sinkt — die Konvergenz auf gleichmäßige Pro-Kopf-Nutzung verläuft jedoch langsamer als zuvor angenommen (geschätzt 5–9 Jahre). Drittens diversifiziert sich der Anwendungsmix in der Verbraucher-Oberfläche: Der Anteil der Top-10-Aufgaben sinkt, parallel steigt der Augmentations-Anteil (kollaborative Nutzung) leicht an. Komplementär zur Index-Reihe haben Maxim Massenkoff und Peter McCrory am 5. März 2026 mit </w:t>
+      </w:r>
+      <w:r>
+        <w:rPr>
+          <w:rFonts w:ascii="Arial" w:hAnsi="Arial"/>
+          <w:b w:val="0"/>
+          <w:i/>
+          <w:sz w:val="19"/>
+        </w:rPr>
+        <w:t>„Labor market impacts of AI: A new measure and early evidence"</w:t>
+      </w:r>
+      <w:r>
+        <w:rPr>
+          <w:rFonts w:ascii="Arial" w:hAnsi="Arial"/>
+          <w:b w:val="0"/>
+          <w:i w:val="0"/>
+          <w:sz w:val="19"/>
+        </w:rPr>
+        <w:t xml:space="preserve"> eine eigenständige Studie vorgelegt, die das von Anthropic eingeführte Konzept der </w:t>
+      </w:r>
+      <w:r>
+        <w:rPr>
+          <w:rFonts w:ascii="Arial" w:hAnsi="Arial"/>
+          <w:b w:val="0"/>
+          <w:i/>
+          <w:sz w:val="19"/>
+        </w:rPr>
+        <w:t>observed exposure</w:t>
+      </w:r>
+      <w:r>
+        <w:rPr>
+          <w:rFonts w:ascii="Arial" w:hAnsi="Arial"/>
+          <w:b w:val="0"/>
+          <w:i w:val="0"/>
+          <w:sz w:val="19"/>
+        </w:rPr>
+        <w:t xml:space="preserve"> — die tatsächlich gemessene KI-Nutzung im Verhältnis zur theoretischen Substitutionsfähigkeit — auf den US-Arbeitsmarkt anwendet. Die höchsten beobachteten Expositionswerte erreichen Computer-Programmierer (74,5 %), Customer-Service-Beschäftigte (70,1 %) und Dateneingabe-Tätigkeiten (67,1 %); die Autoren finden trotz dieser Werte </w:t>
+      </w:r>
+      <w:r>
+        <w:rPr>
+          <w:rFonts w:ascii="Arial" w:hAnsi="Arial"/>
+          <w:b w:val="0"/>
+          <w:i/>
+          <w:sz w:val="19"/>
+        </w:rPr>
+        <w:t>„keine systematische Erhöhung der Arbeitslosigkeit für hoch exponierte Beschäftigte seit Ende 2022"</w:t>
+      </w:r>
+      <w:r>
+        <w:rPr>
+          <w:rFonts w:ascii="Arial" w:hAnsi="Arial"/>
+          <w:b w:val="0"/>
+          <w:i w:val="0"/>
+          <w:sz w:val="19"/>
+        </w:rPr>
+        <w:t>, jedoch tentative Hinweise auf eine verlangsamte Einstellung in der Altersgruppe 22 bis 25 Jahre in stark exponierten Berufen. Hoch exponierte Beschäftigte sind im Durchschnitt älter, häufiger weiblich, formal höher qualifiziert und besser bezahlt als die Vergleichsgruppe ohne Exposition — eine Verteilung, die die in § 1.1 referierten Goldman-Sachs-Beobachtungen (Gen-Z-Berufseinsteigerinnen und -einsteiger als überproportional Betroffene) auf Mikroebene bestätigt. Am 22. April 2026 hat Anthropic zusätzlich ein monatliches qualitatives Survey-Format gestartet (</w:t>
+      </w:r>
+      <w:r>
+        <w:rPr>
+          <w:rFonts w:ascii="Arial" w:hAnsi="Arial"/>
+          <w:b w:val="0"/>
+          <w:i/>
+          <w:sz w:val="19"/>
+        </w:rPr>
+        <w:t>Anthropic Economic Index Survey</w:t>
+      </w:r>
+      <w:r>
+        <w:rPr>
+          <w:rFonts w:ascii="Arial" w:hAnsi="Arial"/>
+          <w:b w:val="0"/>
+          <w:i w:val="0"/>
+          <w:sz w:val="19"/>
+        </w:rPr>
+        <w:t xml:space="preserve">), das ergänzend zu den nutzungsdatenbasierten Index-Berichten die subjektive Erfahrung der KI-Nutzung — Aufgabendelegation, Produktivitätserwartung, Wahrnehmung von Hire-/Fire-Veränderungen — über zufällig gezogene Claude-Nutzerinnen und -Nutzer erhebt; die ersten Ergebnisse sollen in nachfolgenden Index-Berichten publiziert werden. Für die hier geführte Steuerdebatte stützt das Bild die in Kapitel 8 entwickelte szenariorobuste Linie — schnelle Adoption (Breite) ohne klar messbare aggregierte Beschäftigungseinbrüche, aber mit erkennbaren sektoralen und altersspezifischen Frühwirkungen. Das bedeutet nicht, dass die Finanzierungsfrage des Sozialstaats damit entschärft wäre — sektorale Verschiebungen können trotz moderater aggregierter Effekte erheblich sein —, es spricht aber dafür, das steuerpolitische Instrumentarium </w:t>
       </w:r>
       <w:r>
         <w:rPr>
@@ -1732,7 +1804,7 @@
           <w:i w:val="0"/>
           <w:sz w:val="19"/>
         </w:rPr>
-        <w:t xml:space="preserve"> Eine rein nationale Lösung kann mit der Warenverkehrsfreiheit, der Dienstleistungsfreiheit und der Niederlassungsfreiheit in Konflikt geraten. Eine Regelung, die nur inländische Roboterbetreiber trifft, während grenzüberschreitende KI-Dienstleistungen unbesteuert bleiben, wäre diskriminierungsrechtlich problematisch und praktisch kaum durchsetzbar. Der EU AI Act (Verordnung 2024/1689) schafft ab dem 2. August 2026 einen unionsweit einheitlichen Regulierungsrahmen für KI-Systeme (Hochrisiko-Systeme gemäß Anhang III, Transparenzpflichten nach Art. 50, Durchsetzungsregime); dies legt einen einheitlichen Definitionsrahmen, der steuerpolitische Anknüpfungen an KI-Systemklassen mittelfristig erleichtern kann, ohne selbst steuerrechtliche Wirkung zu entfalten. Die Europäische Kommission hat am 19. November 2025 mit dem „Digital Omnibus on AI" einen Vereinfachungsvorschlag vorgelegt, den das Europäische Parlament am 16. März 2026 im Ausschuss und am 23. März 2026 im Plenum unterstützt hat. Er sieht eine Verschiebung der Hochrisiko-Pflichten vor — je nach Systemtyp bis maximal zum 2. Dezember 2027 bzw. 2. August 2028 — und koppelt ihre Anwendbarkeit an die Verfügbarkeit harmonisierter Normen; zudem wird die Kennzeichnungspflicht für KI-generierte Inhalte (Art. 50) bis zum 2. November 2026 verlängert. Die Kommissionsdurchsetzungsbefugnisse gegenüber Anbietern von Allzweck-KI-Modellen (GPAI) treten wie vorgesehen am 2. August 2026 in Kraft. Parlament und Rat haben die Trilogverhandlungen aufgenommen; der zweite Trilogtermin am 28. April 2026 endete nach Berichterstattung von IAPP und A&amp;O Shearman ohne Einigung — Streitpunkt war primär das Verhältnis zwischen AI Act und sektorspezifischen EU-Regelungen für eingebettete KI-Systeme (Anhang I) sowie die Rechtsgrundlage für die Verarbeitung personenbezogener Daten zur Bias-Erkennung. Beide Institutionen konvergieren auf Stichtage 2. Dezember 2027 (Anhang III) und 2. August 2028 (Anhang I) für die Hochrisiko-Pflichten. Die nächste Trilogrunde ist auf den 13. Mai 2026 terminiert; Ziel bleibt eine förmliche Verabschiedung vor dem ursprünglichen Stichtag am 2. August 2026. Scheitert die Einigung bis dahin, würden die Hochrisiko-Pflichten in ihrer ursprünglich vorgesehenen Fassung anwendbar. Für die Steuerdebatte folgt daraus, dass der zeitliche Vorlauf für KI-Definitionen aus dem AI Act enger als ursprünglich gedacht ist — eine mittelfristige Anknüpfung steuerlicher Tatbestände an AI-Act-Kategorien bleibt möglich, setzt aber voraus, dass die Normenlandschaft nach 2027 verlässlich vorliegt.</w:t>
+        <w:t xml:space="preserve"> Eine rein nationale Lösung kann mit der Warenverkehrsfreiheit, der Dienstleistungsfreiheit und der Niederlassungsfreiheit in Konflikt geraten. Eine Regelung, die nur inländische Roboterbetreiber trifft, während grenzüberschreitende KI-Dienstleistungen unbesteuert bleiben, wäre diskriminierungsrechtlich problematisch und praktisch kaum durchsetzbar. Der EU AI Act (Verordnung 2024/1689) schafft ab dem 2. August 2026 einen unionsweit einheitlichen Regulierungsrahmen für KI-Systeme (Hochrisiko-Systeme gemäß Anhang III, Transparenzpflichten nach Art. 50, Durchsetzungsregime); dies legt einen einheitlichen Definitionsrahmen, der steuerpolitische Anknüpfungen an KI-Systemklassen mittelfristig erleichtern kann, ohne selbst steuerrechtliche Wirkung zu entfalten. Die Europäische Kommission hat am 19. November 2025 mit dem „Digital Omnibus on AI" einen Vereinfachungsvorschlag vorgelegt, den das Europäische Parlament am 16. März 2026 im Ausschuss und am 23. März 2026 im Plenum unterstützt hat. Er sieht eine Verschiebung der Hochrisiko-Pflichten vor — je nach Systemtyp bis maximal zum 2. Dezember 2027 bzw. 2. August 2028 — und koppelt ihre Anwendbarkeit an die Verfügbarkeit harmonisierter Normen; zudem wird die Kennzeichnungspflicht für KI-generierte Inhalte (Art. 50) bis zum 2. November 2026 verlängert. Die Kommissionsdurchsetzungsbefugnisse gegenüber Anbietern von Allzweck-KI-Modellen (GPAI) treten wie vorgesehen am 2. August 2026 in Kraft. Parlament und Rat haben die Trilogverhandlungen aufgenommen; der zweite Trilogtermin am 28. April 2026 endete nach Berichterstattung von IAPP und A&amp;O Shearman ohne Einigung — Streitpunkt war primär das Verhältnis zwischen AI Act und sektorspezifischen EU-Regelungen für eingebettete KI-Systeme (Anhang I) sowie die Rechtsgrundlage für die Verarbeitung personenbezogener Daten zur Bias-Erkennung. Beide Institutionen konvergieren auf Stichtage 2. Dezember 2027 (Anhang III) und 2. August 2028 (Anhang I) für die Hochrisiko-Pflichten. Die nächste Trilogrunde ist auf den 13. Mai 2026 terminiert; Ziel bleibt eine förmliche Verabschiedung vor dem ursprünglichen Stichtag am 2. August 2026. Die zypriotische Ratspräsidentschaft hat sich vorgenommen, das Dossier vor Ablauf ihrer Amtszeit am 30. Juni 2026 abzuschließen; gelingt das nicht, übernimmt zur zweiten Jahreshälfte 2026 die irische Präsidentschaft. Scheitert die Einigung bis zum 2. August 2026, würden die Hochrisiko-Pflichten in ihrer ursprünglich vorgesehenen Fassung anwendbar. Für die Steuerdebatte folgt daraus, dass der zeitliche Vorlauf für KI-Definitionen aus dem AI Act enger als ursprünglich gedacht ist — eine mittelfristige Anknüpfung steuerlicher Tatbestände an AI-Act-Kategorien bleibt möglich, setzt aber voraus, dass die Normenlandschaft nach 2027 verlässlich vorliegt.</w:t>
       </w:r>
     </w:p>
     <w:p>
@@ -4653,7 +4725,7 @@
           <w:i w:val="0"/>
           <w:sz w:val="19"/>
         </w:rPr>
-        <w:t>Dass dieses Argument keinen rein akademischen Status hat, zeigt ein Vorfall wenige Tage nach der OpenAI-Veröffentlichung: In der Nacht zum 10. April 2026 griff ein mutmaßlicher Einzeltäter das Haus des OpenAI-Vorstandsvorsitzenden Sam Altman in San Francisco mit einem Molotowcocktail an und steuerte anschließend die OpenAI-Zentrale an; der Tatverdächtige — Daniel Moreno-Gama, 20 Jahre alt, aus dem Großraum Houston — wurde mit Schriften aufgegriffen, die sich auf befürchtete KI-bedingte Arbeitsplatzverluste und eine „drohende Auslöschung" bezogen. Laut Anklage führte er eine Liste mit Namen und Adressen von Vorständen und Investoren mehrerer KI-Unternehmen mit sich; er wurde am 13./14. April 2026 u. a. wegen versuchten Mordes (an Altman und einem Sicherheitsbeamten) und versuchter Brandstiftung sowie bundesrechtlich wegen versuchter Sachbeschädigung mit Sprengmitteln und Besitzes einer nicht registrierten Feuerwaffe angeklagt und ohne Kaution in Haft genommen; eine weitere Anklage wegen inländischen Terrorismus steht im Raum. Die Arraignment-Verhandlung ist auf den 5. Mai 2026 terminiert; die Pflichtverteidigung führt Autismus und eine akute psychische Ausnahmesituation an. In der Nacht zum 12. April 2026 kam es zu einem weiteren Vorfall an Altmans Haus, bei dem ein Schuss aus einem vorbeifahrenden Fahrzeug fiel; zwei kurz darauf festgenommene Personen wurden am 16. April 2026 ohne Anklageerhebung freigelassen. Die beiden Vorfälle sind als Einzeltaten kein Beleg für eine breite Bewegung, sie illustrieren aber, wie nah die Debatte um Automatisierung und soziale Sicherung inzwischen an Emotionen gerückt ist, die historisch Transformationskonflikte begleitet haben — und damit den Preis, den ausgebliebene politische Antworten auch in stabilen Demokratien kosten können.</w:t>
+        <w:t>Dass dieses Argument keinen rein akademischen Status hat, zeigt ein Vorfall wenige Tage nach der OpenAI-Veröffentlichung: In der Nacht zum 10. April 2026 griff ein mutmaßlicher Einzeltäter das Haus des OpenAI-Vorstandsvorsitzenden Sam Altman in San Francisco mit einem Molotowcocktail an und steuerte anschließend die OpenAI-Zentrale an; der Tatverdächtige — Daniel Moreno-Gama, 20 Jahre alt, aus dem Großraum Houston — wurde mit Schriften aufgegriffen, die sich auf befürchtete KI-bedingte Arbeitsplatzverluste und eine „drohende Auslöschung" bezogen. Laut Anklage führte er eine Liste mit Namen und Adressen von Vorständen und Investoren mehrerer KI-Unternehmen mit sich; er wurde am 13./14. April 2026 u. a. wegen versuchten Mordes (an Altman und einem Sicherheitsbeamten) und versuchter Brandstiftung sowie bundesrechtlich wegen versuchter Sachbeschädigung mit Sprengmitteln und Besitzes einer nicht registrierten Feuerwaffe angeklagt und ohne Kaution in Haft genommen; eine weitere Anklage wegen inländischen Terrorismus steht im Raum. Bei der Arraignment-Verhandlung am 5. Mai 2026 hat Moreno-Gama auf nicht schuldig plädiert; das Gericht ordnete eine psychiatrische Begutachtung an und setzte einen Folgetermin im Mai 2026 zur Vorlage des Gutachtens fest. Die Pflichtverteidigung führt Autismus und eine akute psychische Ausnahmesituation an und bewertet die Anklagepunkte als überzogen. In der Nacht zum 12. April 2026 kam es zu einem weiteren Vorfall an Altmans Haus, bei dem ein Schuss aus einem vorbeifahrenden Fahrzeug fiel; zwei kurz darauf festgenommene Personen wurden am 16. April 2026 ohne Anklageerhebung freigelassen. Die beiden Vorfälle sind als Einzeltaten kein Beleg für eine breite Bewegung, sie illustrieren aber, wie nah die Debatte um Automatisierung und soziale Sicherung inzwischen an Emotionen gerückt ist, die historisch Transformationskonflikte begleitet haben — und damit den Preis, den ausgebliebene politische Antworten auch in stabilen Demokratien kosten können.</w:t>
       </w:r>
     </w:p>
     <w:p>
@@ -6534,6 +6606,70 @@
     </w:p>
     <w:p>
       <w:pPr>
+        <w:jc w:val="both"/>
+      </w:pPr>
+      <w:r>
+        <w:rPr>
+          <w:rFonts w:ascii="Arial" w:hAnsi="Arial"/>
+          <w:b w:val="0"/>
+          <w:i w:val="0"/>
+          <w:sz w:val="19"/>
+        </w:rPr>
+        <w:t xml:space="preserve">Massenkoff, M., &amp; McCrory, P. (5. März 2026). </w:t>
+      </w:r>
+      <w:r>
+        <w:rPr>
+          <w:rFonts w:ascii="Arial" w:hAnsi="Arial"/>
+          <w:b w:val="0"/>
+          <w:i/>
+          <w:sz w:val="19"/>
+        </w:rPr>
+        <w:t>Labor market impacts of AI: A new measure and early evidence.</w:t>
+      </w:r>
+      <w:r>
+        <w:rPr>
+          <w:rFonts w:ascii="Arial" w:hAnsi="Arial"/>
+          <w:b w:val="0"/>
+          <w:i w:val="0"/>
+          <w:sz w:val="19"/>
+        </w:rPr>
+        <w:t xml:space="preserve"> Anthropic Research. Beobachtete Exposition Computer-Programmierer 74,5 %, Customer-Service 70,1 %, Dateneingabe 67,1 %; keine systematische Arbeitslosigkeitserhöhung für hoch exponierte Beschäftigte seit Ende 2022, tentative Hinweise auf verlangsamte Einstellung der Altersgruppe 22–25 in exponierten Berufen. https://www.anthropic.com/research/labor-market-impacts</w:t>
+      </w:r>
+    </w:p>
+    <w:p>
+      <w:pPr>
+        <w:jc w:val="both"/>
+      </w:pPr>
+      <w:r>
+        <w:rPr>
+          <w:rFonts w:ascii="Arial" w:hAnsi="Arial"/>
+          <w:b w:val="0"/>
+          <w:i w:val="0"/>
+          <w:sz w:val="19"/>
+        </w:rPr>
+        <w:t xml:space="preserve">Anthropic. (22. April 2026). </w:t>
+      </w:r>
+      <w:r>
+        <w:rPr>
+          <w:rFonts w:ascii="Arial" w:hAnsi="Arial"/>
+          <w:b w:val="0"/>
+          <w:i/>
+          <w:sz w:val="19"/>
+        </w:rPr>
+        <w:t>Announcing the Anthropic Economic Index Survey.</w:t>
+      </w:r>
+      <w:r>
+        <w:rPr>
+          <w:rFonts w:ascii="Arial" w:hAnsi="Arial"/>
+          <w:b w:val="0"/>
+          <w:i w:val="0"/>
+          <w:sz w:val="19"/>
+        </w:rPr>
+        <w:t xml:space="preserve"> Monatliche qualitative Befragung über Anthropic Interviewer; randomisierte Stichprobe von Claude-Nutzerinnen und -Nutzern zu Aufgabendelegation, Produktivitätserwartung und Hire-/Fire-Wahrnehmung; Veröffentlichung der ersten Ergebnisse in Folge-Index-Berichten vorgesehen. https://www.anthropic.com/research/economic-index-survey-announcement</w:t>
+      </w:r>
+    </w:p>
+    <w:p>
+      <w:pPr>
         <w:spacing w:before="120" w:after="80"/>
       </w:pPr>
       <w:r>
@@ -9150,6 +9286,102 @@
           <w:i w:val="0"/>
           <w:sz w:val="19"/>
         </w:rPr>
+        <w:t xml:space="preserve">SkillSyncer / TrueUp. (Stand 6. Mai 2026). </w:t>
+      </w:r>
+      <w:r>
+        <w:rPr>
+          <w:rFonts w:ascii="Arial" w:hAnsi="Arial"/>
+          <w:b w:val="0"/>
+          <w:i/>
+          <w:sz w:val="19"/>
+        </w:rPr>
+        <w:t>Tech Layoffs Tracker — Aktualisierung: TrueUp 119.721 Personen aus 265 Layoff-Meldungen (rund 958 Stellen pro Tag); SkillSyncer weitgehend unverändert bei 113.863 Personen aus 179 Ereignissen.</w:t>
+      </w:r>
+      <w:r>
+        <w:rPr>
+          <w:rFonts w:ascii="Arial" w:hAnsi="Arial"/>
+          <w:b w:val="0"/>
+          <w:i w:val="0"/>
+          <w:sz w:val="19"/>
+        </w:rPr>
+        <w:t xml:space="preserve"> https://skillsyncer.com/layoffs-tracker | https://www.trueup.io/layoffs</w:t>
+      </w:r>
+    </w:p>
+    <w:p>
+      <w:pPr>
+        <w:jc w:val="both"/>
+      </w:pPr>
+      <w:r>
+        <w:rPr>
+          <w:rFonts w:ascii="Arial" w:hAnsi="Arial"/>
+          <w:b w:val="0"/>
+          <w:i w:val="0"/>
+          <w:sz w:val="19"/>
+        </w:rPr>
+        <w:t xml:space="preserve">Fortune / Investor's Business Daily / Futurum. (April–Mai 2026). </w:t>
+      </w:r>
+      <w:r>
+        <w:rPr>
+          <w:rFonts w:ascii="Arial" w:hAnsi="Arial"/>
+          <w:b w:val="0"/>
+          <w:i/>
+          <w:sz w:val="19"/>
+        </w:rPr>
+        <w:t>Big-Tech-AI-Capex 2026: Q1-Investitionen rund 130,65 Mrd. USD; Konsens-Schätzung für 2026 bei 660–700 Mrd. USD (Microsoft, Alphabet, Amazon, Meta, Oracle); Wall-Street-Analysten erwarten 2027 mehr als 1 Bio. USD.</w:t>
+      </w:r>
+      <w:r>
+        <w:rPr>
+          <w:rFonts w:ascii="Arial" w:hAnsi="Arial"/>
+          <w:b w:val="0"/>
+          <w:i w:val="0"/>
+          <w:sz w:val="19"/>
+        </w:rPr>
+        <w:t xml:space="preserve"> https://fortune.com/2026/04/30/big-tech-hyperscalers-will-spend-700-billion-on-ai-infrastructure-this-year-with-no-clear-end-in-sight-eye-on-ai/ | https://www.cnbc.com/2026/04/30/ai-boom-big-tech-capital-expenditures-now-seen-topping-1-trillion-in-2027-.html | https://futurumgroup.com/insights/ai-capex-2026-the-690b-infrastructure-sprint/</w:t>
+      </w:r>
+    </w:p>
+    <w:p>
+      <w:pPr>
+        <w:jc w:val="both"/>
+      </w:pPr>
+      <w:r>
+        <w:rPr>
+          <w:rFonts w:ascii="Arial" w:hAnsi="Arial"/>
+          <w:b w:val="0"/>
+          <w:i w:val="0"/>
+          <w:sz w:val="19"/>
+        </w:rPr>
+        <w:t xml:space="preserve">Washington Times / WSLS / Boston Globe / Las Vegas Sun / Local10 / Greenfield Reporter. (5. Mai 2026). </w:t>
+      </w:r>
+      <w:r>
+        <w:rPr>
+          <w:rFonts w:ascii="Arial" w:hAnsi="Arial"/>
+          <w:b w:val="0"/>
+          <w:i/>
+          <w:sz w:val="19"/>
+        </w:rPr>
+        <w:t>Man accused of attacking OpenAI CEO Sam Altman's home pleads not guilty to attempted murder.</w:t>
+      </w:r>
+      <w:r>
+        <w:rPr>
+          <w:rFonts w:ascii="Arial" w:hAnsi="Arial"/>
+          <w:b w:val="0"/>
+          <w:i w:val="0"/>
+          <w:sz w:val="19"/>
+        </w:rPr>
+        <w:t xml:space="preserve"> AP-Berichterstattung zur Arraignment-Verhandlung am 5. Mai 2026 (Plädoyer „nicht schuldig", Anordnung psychiatrischer Begutachtung, Folgetermin im Mai 2026). https://www.washingtontimes.com/news/2026/may/5/man-accused-attacking-home-openai-ceo-sam-altman-pleads-not-guilty/ | https://www.bostonglobe.com/2026/05/05/nation/sam-altman-alleged-attacker-pleads-not-guilty-attempted-murder/</w:t>
+      </w:r>
+    </w:p>
+    <w:p>
+      <w:pPr>
+        <w:jc w:val="both"/>
+      </w:pPr>
+      <w:r>
+        <w:rPr>
+          <w:rFonts w:ascii="Arial" w:hAnsi="Arial"/>
+          <w:b w:val="0"/>
+          <w:i w:val="0"/>
+          <w:sz w:val="19"/>
+        </w:rPr>
         <w:t xml:space="preserve">Goldman Sachs / Fortune. (6. April 2026). </w:t>
       </w:r>
       <w:r>
@@ -9255,7 +9487,7 @@
           <w:i w:val="0"/>
           <w:sz w:val="19"/>
         </w:rPr>
-        <w:t xml:space="preserve"> Dieses Arbeitspapier gibt den Stand Anfang Mai 2026 (Schnitt am 5. Mai 2026) wieder. Die Debatte entwickelt sich dynamisch, insbesondere im Zuge der OpenAI-Strategiepapiere und der Eröffnung des OpenAI Workshop in Washington, D.C. im Mai 2026, des Erstdurchgangs des GKV-Beitragssatzstabilisierungsgesetzes in der 1065. Bundesratssitzung am 8. Mai 2026 mit 79 Tagesordnungspunkten (Kabinettsbeschluss 29. April 2026, parlamentarische Behandlung vor der Sommerpause 2026 angekündigt), der laufenden Trilog-Verhandlungen zum Digital Omnibus on AI (zweite Runde 28. April 2026 ohne Einigung; nächste Runde 13. Mai 2026 — Knackpunkt ist nicht die Verschiebung der Hochrisiko-Pflichten, sondern die Konformitätsbewertungs-Architektur für Anhang I), der für den 5. Mai 2026 angesetzten Arraignment-Verhandlung im Altman-Verfahren, des am 1. Mai 2026 vom Connecticut-Repräsentantenhaus mit 131 zu 17 Stimmen verabschiedeten </w:t>
+        <w:t xml:space="preserve"> Dieses Arbeitspapier gibt den Stand Anfang Mai 2026 (Schnitt am 6. Mai 2026) wieder. Die Debatte entwickelt sich dynamisch, insbesondere im Zuge der OpenAI-Strategiepapiere und der Eröffnung des OpenAI Workshop in Washington, D.C. im Mai 2026, des Erstdurchgangs des GKV-Beitragssatzstabilisierungsgesetzes in der 1065. Bundesratssitzung am 8. Mai 2026 mit 79 Tagesordnungspunkten (Kabinettsbeschluss 29. April 2026, parlamentarische Behandlung vor der Sommerpause 2026 angekündigt), der laufenden Trilog-Verhandlungen zum Digital Omnibus on AI (zweite Runde 28. April 2026 ohne Einigung; nächste Runde 13. Mai 2026 — Knackpunkt ist nicht die Verschiebung der Hochrisiko-Pflichten, sondern die Konformitätsbewertungs-Architektur für Anhang I; die zypriotische Ratspräsidentschaft strebt einen Abschluss vor Ablauf ihrer Amtszeit am 30. Juni 2026 an, andernfalls übernimmt die irische Präsidentschaft), der am 5. Mai 2026 erfolgten Arraignment-Verhandlung im Altman-Verfahren mit „nicht schuldig"-Plädoyer und angeordneter psychiatrischer Begutachtung, des am 1. Mai 2026 vom Connecticut-Repräsentantenhaus mit 131 zu 17 Stimmen verabschiedeten </w:t>
       </w:r>
       <w:r>
         <w:rPr>
@@ -9291,7 +9523,7 @@
           <w:i w:val="0"/>
           <w:sz w:val="19"/>
         </w:rPr>
-        <w:t xml:space="preserve">, des am 24. März 2026 erschienenen </w:t>
+        <w:t xml:space="preserve">, des am 5. März 2026 publizierten Anthropic-Papiers von Massenkoff &amp; McCrory zu </w:t>
       </w:r>
       <w:r>
         <w:rPr>
@@ -9300,6 +9532,42 @@
           <w:i/>
           <w:sz w:val="19"/>
         </w:rPr>
+        <w:t>„Labor market impacts of AI"</w:t>
+      </w:r>
+      <w:r>
+        <w:rPr>
+          <w:rFonts w:ascii="Arial" w:hAnsi="Arial"/>
+          <w:b w:val="0"/>
+          <w:i w:val="0"/>
+          <w:sz w:val="19"/>
+        </w:rPr>
+        <w:t xml:space="preserve"> (Computer-Programmierer 74,5 % beobachtete Exposition; keine systematische Arbeitslosigkeitserhöhung, tentative Hire-Verlangsamung 22–25-Jährige), des am 22. April 2026 gestarteten </w:t>
+      </w:r>
+      <w:r>
+        <w:rPr>
+          <w:rFonts w:ascii="Arial" w:hAnsi="Arial"/>
+          <w:b w:val="0"/>
+          <w:i/>
+          <w:sz w:val="19"/>
+        </w:rPr>
+        <w:t>Anthropic Economic Index Survey</w:t>
+      </w:r>
+      <w:r>
+        <w:rPr>
+          <w:rFonts w:ascii="Arial" w:hAnsi="Arial"/>
+          <w:b w:val="0"/>
+          <w:i w:val="0"/>
+          <w:sz w:val="19"/>
+        </w:rPr>
+        <w:t xml:space="preserve"> als monatliche qualitative Ergänzung zur nutzungsdatenbasierten Index-Reihe, des am 24. März 2026 erschienenen </w:t>
+      </w:r>
+      <w:r>
+        <w:rPr>
+          <w:rFonts w:ascii="Arial" w:hAnsi="Arial"/>
+          <w:b w:val="0"/>
+          <w:i/>
+          <w:sz w:val="19"/>
+        </w:rPr>
         <w:t>Anthropic-Economic-Index</w:t>
       </w:r>
       <w:r>
@@ -9345,7 +9613,7 @@
           <w:i w:val="0"/>
           <w:sz w:val="19"/>
         </w:rPr>
-        <w:t xml:space="preserve"> auf 100 % bei zugleich ablehnender Position des Finanzministeriums, der revidierten IAB-Frühjahrsprognose vom 24. März 2026 (Erwerbstätigkeit −90.000, BIP +0,8 % bei 0,2 bis 0,3 Pp. Iran-Krieg-Dämpfung) sowie der Tech-Layoff-Trackerstände vom 2. Mai 2026 (SkillSyncer 113.863 Beschäftigte aus 179 Layoff-Ereignissen, TrueUp 95.878 Personen aus 249 Meldungen). Eine regelmäßige Aktualisierung ist vorgesehen.</w:t>
+        <w:t xml:space="preserve"> auf 100 % bei zugleich ablehnender Position des Finanzministeriums, der revidierten IAB-Frühjahrsprognose vom 24. März 2026 (Erwerbstätigkeit −90.000, BIP +0,8 % bei 0,2 bis 0,3 Pp. Iran-Krieg-Dämpfung), der aktualisierten Tech-Layoff-Trackerstände zum 6. Mai 2026 (TrueUp 119.721 Personen aus 265 Layoff-Meldungen, SkillSyncer 113.863 Personen aus 179 Ereignissen) sowie des Big-Tech-AI-Capex-Programms 2026 mit einem Q1-Volumen von rund 130,65 Milliarden US-Dollar und einer Konsens-Schätzung von 660–700 Milliarden US-Dollar für das Gesamtjahr. Eine regelmäßige Aktualisierung ist vorgesehen.</w:t>
       </w:r>
     </w:p>
     <w:p>

</xml_diff>

<commit_message>
Daily-Update 2026-05-07 (Folgelauf) — Version 19.0 (Cluster A, F)
Drei belegbare Cluster mit sechs Datenpunkten ergänzt:
- § 1.1: Coinbase 14% (~700 Stellen, AI-native restructuring), PayPal 20%
  über 2-3 Jahre (~4.760 Stellen), Freshworks 11% (~500 Stellen) und
  Cognizant 12.000-15.000 Stellen unter "Project Leap" (5./6. Mai 2026);
  TrueUp-Tagesfortschreibung auf 121.111 Personen / 273 Meldungen am
  7. Mai 2026; Microsoft VRSAR Separation Date 2. Juli 2026 mit ~8.500
  angebotsberechtigten Beschäftigten.
- § 3.5: Yale Budget Lab Tracking-Reihe (März-CPS-Update April 2026,
  keine Disruption außerhalb des historischen Korridors) sowie Mai-2026-
  Modellrechnung (39 Bio. USD US-Schulden, 88 Mrd. USD monatlicher
  Zinsdienst gegen 5.500-42.400 USD Übergangshilfe pro Verdrängtem;
  fiskalisch-ethisches Dilemma als Beleg für § 8.4-Stabilitätslinie).

Versionssprung 18.0 -> 19.0 in Hauptdokument, README.md und
Validierung-Ergebnisse.md eingetragen; PDF und DOCX neu gebaut.
</commit_message>
<xml_diff>
--- a/Arbeitspapier_KI_Robotik_Besteuerung.docx
+++ b/Arbeitspapier_KI_Robotik_Besteuerung.docx
@@ -220,7 +220,97 @@
           <w:i w:val="0"/>
           <w:sz w:val="19"/>
         </w:rPr>
-        <w:t xml:space="preserve"> (VRSAR) erfolgt zwischen 9. und 22. Juni 2026; das Paket umfasst eine Cash-Einmalzahlung sowie eine bis zu fünfjährige Krankenversicherungs-Verlängerung und enthält keine Wettbewerbs- oder Beschäftigungsverbote. Im Zusammenspiel mit den am selben Tag bekräftigten Meta-Streichungen ordneten Wirtschaftsmedien (CNBC, 24. April 2026) die Welle erstmals als „AI-driven labor crisis" ein — ein Begriff, der den Übergang von Einzelfällen zu einer kumulativen Branchenerzählung markiert. Bis zur Wochenmitte des 25. April 2026 weisen Branchen-Tracker einen kumulierten Bestand von über 92.000 Tech-Stellenstreichungen für das laufende Jahr 2026 aus; eine Aktualisierung zum 2. Mai 2026 hebt die Marke nach Tracker-Methodik des SkillSyncer auf 113.863 betroffene Beschäftigte aus 179 erfassten Layoff-Ereignissen (durchschnittlich rund 933 Stellen pro Tag), während TrueUp parallel 95.878 Personen aus 249 Einzelmeldungen zählt; die Methodikspanne erklärt die unterschiedlichen Größenordnungen, das Niveau einer sechsstelligen Tech-Reduktion innerhalb von vier Monaten ist über alle Tracker hinweg konsistent. Eine erneute Aktualisierung zum 6. Mai 2026 zeigt, dass die TrueUp-Zählung weiter auf 119.721 betroffene Personen aus 265 Layoff-Meldungen gestiegen ist (rund 958 Stellen pro Tag), während SkillSyncer mit 113.863 Personen aus 179 Ereignissen weitgehend unverändert bleibt; der parallele Lauf der Branchen-AI-Capex-Programme (Q1-2026-Investitionen der Hyperscaler von rund 130,65 Milliarden US-Dollar; Konsens-Schätzung für 2026 zwischen 660 und 700 Milliarden US-Dollar; Ausblick auf über 1 Billion US-Dollar im Jahr 2027) verdeutlicht die Asymmetrie zwischen Personalreduktion und Infrastrukturausbau, die die Steuerdebatte über die Anknüpfung an Maschinenkapital (§ 5.1, § 8.3) zusätzlich strukturiert. Eine ergänzende Auswertung von Goldman Sachs (Anfang April 2026) schätzt den US-weiten KI-Verdrängungseffekt auf rund 16.000 Stellen pro Monat, mit überproportionaler Betroffenheit von Berufseinsteigerinnen und -einsteigern (Gen Z) in routinisierten Bürotätigkeiten — diese Größenordnung stützt die in § 3.5 referierten Beobachtungen aus dem </w:t>
+        <w:t xml:space="preserve"> (VRSAR) erfolgt zwischen 9. und 22. Juni 2026, die regulär verbindliche </w:t>
+      </w:r>
+      <w:r>
+        <w:rPr>
+          <w:rFonts w:ascii="Arial" w:hAnsi="Arial"/>
+          <w:b w:val="0"/>
+          <w:i/>
+          <w:sz w:val="19"/>
+        </w:rPr>
+        <w:t>Separation Date</w:t>
+      </w:r>
+      <w:r>
+        <w:rPr>
+          <w:rFonts w:ascii="Arial" w:hAnsi="Arial"/>
+          <w:b w:val="0"/>
+          <w:i w:val="0"/>
+          <w:sz w:val="19"/>
+        </w:rPr>
+        <w:t xml:space="preserve"> fällt auf den 2. Juli 2026; nach den am 7. Mai 2026 publizierten Programmkonditionen sind rund 8.500 Beschäftigte angebotsberechtigt, das Paket umfasst eine Cash-Einmalzahlung sowie eine bis zu fünfjährige Krankenversicherungs-Verlängerung und enthält keine Wettbewerbs- oder Beschäftigungsverbote. Im Zusammenspiel mit den am selben Tag bekräftigten Meta-Streichungen ordneten Wirtschaftsmedien (CNBC, 24. April 2026) die Welle erstmals als „AI-driven labor crisis" ein — ein Begriff, der den Übergang von Einzelfällen zu einer kumulativen Branchenerzählung markiert. Bis zur Wochenmitte des 25. April 2026 weisen Branchen-Tracker einen kumulierten Bestand von über 92.000 Tech-Stellenstreichungen für das laufende Jahr 2026 aus; eine Aktualisierung zum 2. Mai 2026 hebt die Marke nach Tracker-Methodik des SkillSyncer auf 113.863 betroffene Beschäftigte aus 179 erfassten Layoff-Ereignissen (durchschnittlich rund 933 Stellen pro Tag), während TrueUp parallel 95.878 Personen aus 249 Einzelmeldungen zählt; die Methodikspanne erklärt die unterschiedlichen Größenordnungen, das Niveau einer sechsstelligen Tech-Reduktion innerhalb von vier Monaten ist über alle Tracker hinweg konsistent. Eine erneute Aktualisierung zum 6. Mai 2026 zeigt, dass die TrueUp-Zählung weiter auf 119.721 betroffene Personen aus 265 Layoff-Meldungen gestiegen ist (rund 958 Stellen pro Tag), während SkillSyncer mit 113.863 Personen aus 179 Ereignissen weitgehend unverändert bleibt; eine Tagesfortschreibung der TrueUp-Methodik weist zum 7. Mai 2026 bereits 121.111 Personen aus 273 Layoff-Meldungen aus (rund 961 Personen pro Tag), wobei die zusätzlichen Meldungen primär aus den am 5./6. Mai 2026 angekündigten Stellenstreichungen bei </w:t>
+      </w:r>
+      <w:r>
+        <w:rPr>
+          <w:rFonts w:ascii="Arial" w:hAnsi="Arial"/>
+          <w:b w:val="0"/>
+          <w:i/>
+          <w:sz w:val="19"/>
+        </w:rPr>
+        <w:t>Coinbase</w:t>
+      </w:r>
+      <w:r>
+        <w:rPr>
+          <w:rFonts w:ascii="Arial" w:hAnsi="Arial"/>
+          <w:b w:val="0"/>
+          <w:i w:val="0"/>
+          <w:sz w:val="19"/>
+        </w:rPr>
+        <w:t xml:space="preserve"> (rund 700 Stellen, 14 % der Belegschaft, ausdrücklich begründet mit dem Übergang zu einer „AI-native"-Organisation; Restrukturierungsaufwand 50 bis 60 Millionen US-Dollar, weitgehender Abschluss im zweiten Quartal 2026), </w:t>
+      </w:r>
+      <w:r>
+        <w:rPr>
+          <w:rFonts w:ascii="Arial" w:hAnsi="Arial"/>
+          <w:b w:val="0"/>
+          <w:i/>
+          <w:sz w:val="19"/>
+        </w:rPr>
+        <w:t>PayPal</w:t>
+      </w:r>
+      <w:r>
+        <w:rPr>
+          <w:rFonts w:ascii="Arial" w:hAnsi="Arial"/>
+          <w:b w:val="0"/>
+          <w:i w:val="0"/>
+          <w:sz w:val="19"/>
+        </w:rPr>
+        <w:t xml:space="preserve"> (rund 4.760 Stellen, 20 % der Belegschaft über zwei bis drei Jahre, mit erwarteten Einsparungen von mindestens 1,5 Milliarden US-Dollar und ausdrücklicher Strategie, „wieder ein Technologieunternehmen zu werden" durch aggressive KI-Adoption und Cloud-Migration), </w:t>
+      </w:r>
+      <w:r>
+        <w:rPr>
+          <w:rFonts w:ascii="Arial" w:hAnsi="Arial"/>
+          <w:b w:val="0"/>
+          <w:i/>
+          <w:sz w:val="19"/>
+        </w:rPr>
+        <w:t>Freshworks</w:t>
+      </w:r>
+      <w:r>
+        <w:rPr>
+          <w:rFonts w:ascii="Arial" w:hAnsi="Arial"/>
+          <w:b w:val="0"/>
+          <w:i w:val="0"/>
+          <w:sz w:val="19"/>
+        </w:rPr>
+        <w:t xml:space="preserve"> (rund 500 Stellen, 11 % der Belegschaft, mit dem Hinweis des Vorstandsvorsitzenden, „über die Hälfte des Codes" werde inzwischen von KI geschrieben) und </w:t>
+      </w:r>
+      <w:r>
+        <w:rPr>
+          <w:rFonts w:ascii="Arial" w:hAnsi="Arial"/>
+          <w:b w:val="0"/>
+          <w:i/>
+          <w:sz w:val="19"/>
+        </w:rPr>
+        <w:t>Cognizant</w:t>
+      </w:r>
+      <w:r>
+        <w:rPr>
+          <w:rFonts w:ascii="Arial" w:hAnsi="Arial"/>
+          <w:b w:val="0"/>
+          <w:i w:val="0"/>
+          <w:sz w:val="19"/>
+        </w:rPr>
+        <w:t xml:space="preserve"> (12.000 bis 15.000 Stellen weltweit unter dem internen Programm „Project Leap", Abfindungsaufwand 230 bis 320 Millionen US-Dollar; bei rund 357.000 Beschäftigten weltweit und 250.000 in Indien dürfte der Großteil der Streichungen den dortigen Standort treffen) gespeist sind; der parallele Lauf der Branchen-AI-Capex-Programme (Q1-2026-Investitionen der Hyperscaler von rund 130,65 Milliarden US-Dollar; Konsens-Schätzung für 2026 zwischen 660 und 700 Milliarden US-Dollar; Ausblick auf über 1 Billion US-Dollar im Jahr 2027) verdeutlicht die Asymmetrie zwischen Personalreduktion und Infrastrukturausbau, die die Steuerdebatte über die Anknüpfung an Maschinenkapital (§ 5.1, § 8.3) zusätzlich strukturiert. Eine ergänzende Auswertung von Goldman Sachs (Anfang April 2026) schätzt den US-weiten KI-Verdrängungseffekt auf rund 16.000 Stellen pro Monat, mit überproportionaler Betroffenheit von Berufseinsteigerinnen und -einsteigern (Gen Z) in routinisierten Bürotätigkeiten — diese Größenordnung stützt die in § 3.5 referierten Beobachtungen aus dem </w:t>
       </w:r>
       <w:r>
         <w:rPr>
@@ -1494,7 +1584,61 @@
           <w:i w:val="0"/>
           <w:sz w:val="19"/>
         </w:rPr>
-        <w:t xml:space="preserve">: Wer die größten Geschwindigkeitsgewinne berichtet, äußert zugleich überdurchschnittlich häufig Verdrängungssorgen — ein Hinweis darauf, dass Produktivitätsgewinn und Beschäftigungssicherheit subjektiv nicht gleichlaufen. Für die Steuerdebatte ist dieser Befund relevant, weil er die in § 8.4 entwickelte Stabilitätslinie mikroökonomisch unterfüttert: Eine Reform, die Produktivitätsgewinne sichtbar abschöpft und teilbar zurückgibt, hat einen psychologisch realen Adressatenkreis. Für die hier geführte Steuerdebatte stützt das Bild die in Kapitel 8 entwickelte szenariorobuste Linie — schnelle Adoption (Breite) ohne klar messbare aggregierte Beschäftigungseinbrüche, aber mit erkennbaren sektoralen und altersspezifischen Frühwirkungen. Das bedeutet nicht, dass die Finanzierungsfrage des Sozialstaats damit entschärft wäre — sektorale Verschiebungen können trotz moderater aggregierter Effekte erheblich sein —, es spricht aber dafür, das steuerpolitische Instrumentarium </w:t>
+        <w:t xml:space="preserve">: Wer die größten Geschwindigkeitsgewinne berichtet, äußert zugleich überdurchschnittlich häufig Verdrängungssorgen — ein Hinweis darauf, dass Produktivitätsgewinn und Beschäftigungssicherheit subjektiv nicht gleichlaufen. Für die Steuerdebatte ist dieser Befund relevant, weil er die in § 8.4 entwickelte Stabilitätslinie mikroökonomisch unterfüttert: Eine Reform, die Produktivitätsgewinne sichtbar abschöpft und teilbar zurückgibt, hat einen psychologisch realen Adressatenkreis. Eine unabhängige Bestätigung dieses Befundes liefert das </w:t>
+      </w:r>
+      <w:r>
+        <w:rPr>
+          <w:rFonts w:ascii="Arial" w:hAnsi="Arial"/>
+          <w:b w:val="0"/>
+          <w:i/>
+          <w:sz w:val="19"/>
+        </w:rPr>
+        <w:t>Yale Budget Lab</w:t>
+      </w:r>
+      <w:r>
+        <w:rPr>
+          <w:rFonts w:ascii="Arial" w:hAnsi="Arial"/>
+          <w:b w:val="0"/>
+          <w:i w:val="0"/>
+          <w:sz w:val="19"/>
+        </w:rPr>
+        <w:t xml:space="preserve">, das mit der laufenden Reihe </w:t>
+      </w:r>
+      <w:r>
+        <w:rPr>
+          <w:rFonts w:ascii="Arial" w:hAnsi="Arial"/>
+          <w:b w:val="0"/>
+          <w:i/>
+          <w:sz w:val="19"/>
+        </w:rPr>
+        <w:t>„Tracking the Impact of AI on the Labor Market"</w:t>
+      </w:r>
+      <w:r>
+        <w:rPr>
+          <w:rFonts w:ascii="Arial" w:hAnsi="Arial"/>
+          <w:b w:val="0"/>
+          <w:i w:val="0"/>
+          <w:sz w:val="19"/>
+        </w:rPr>
+        <w:t xml:space="preserve"> die </w:t>
+      </w:r>
+      <w:r>
+        <w:rPr>
+          <w:rFonts w:ascii="Arial" w:hAnsi="Arial"/>
+          <w:b w:val="0"/>
+          <w:i/>
+          <w:sz w:val="19"/>
+        </w:rPr>
+        <w:t>Current Population Survey</w:t>
+      </w:r>
+      <w:r>
+        <w:rPr>
+          <w:rFonts w:ascii="Arial" w:hAnsi="Arial"/>
+          <w:b w:val="0"/>
+          <w:i w:val="0"/>
+          <w:sz w:val="19"/>
+        </w:rPr>
+        <w:t xml:space="preserve"> (CPS) gegen die Anthropic-Nutzungsdaten spiegelt: Auch nach Einarbeitung der März-2026-CPS-Welle und der Februar-2026-Anthropic-Daten zeigen sich weder in der Berufsstrukturmischung (occupational mix) noch in den Industrie- und Expositionskennziffern Abweichungen außerhalb der historischen Bandbreite — der breite US-Arbeitsmarkt erfährt 33 Monate nach ChatGPT-Veröffentlichung keine erkennbare aggregierte Disruption. Auffällig bleibt allein eine leichte Zunahme der Berufsstruktur-Differenz zwischen älteren und jüngeren Hochschulabsolventinnen und -absolventen, die jedoch noch im oberen Bereich des historischen Korridors liegt. Mit einer ergänzenden Analyse vom 6. Mai 2026 hat das Yale Budget Lab den Bogen erstmals zur Fiskalpolitik geschlagen: Bei 39 Billionen US-Dollar Schuldenstand (rund 100 % des BIP, Stand April 2026) und einem monatlichen Zinsdienst von rund 88 Milliarden US-Dollar könnte ein KI-induzierter Produktivitätspfad von etwa 2,5 % pro Jahr theoretisch einen erheblichen Konsolidierungseffekt freisetzen — allerdings nur unter der Annahme, dass der Staat verdrängte Beschäftigte nicht nennenswert auffängt. Das Yale Budget Lab beziffert eine plausible Bandbreite individueller Übergangshilfen mit 5.500 bis 42.400 US-Dollar pro Person; eine Sozialhilfe in dieser Größenordnung würde den Schuldenabbau-Effekt weitgehend neutralisieren. Damit wird der politisch-ethische Kern der Debatte sichtbar: Die fiskalischen Vorteile der KI-Adoption sind systematisch nur dann „kostenlos", wenn sie Verteilungsfolgen externalisieren — eine Position, die mit dem in § 8.4 entwickelten Stabilitätsargument unvereinbar ist. Für die hier geführte Steuerdebatte stützt das Bild die in Kapitel 8 entwickelte szenariorobuste Linie — schnelle Adoption (Breite) ohne klar messbare aggregierte Beschäftigungseinbrüche, aber mit erkennbaren sektoralen und altersspezifischen Frühwirkungen. Das bedeutet nicht, dass die Finanzierungsfrage des Sozialstaats damit entschärft wäre — sektorale Verschiebungen können trotz moderater aggregierter Effekte erheblich sein —, es spricht aber dafür, das steuerpolitische Instrumentarium </w:t>
       </w:r>
       <w:r>
         <w:rPr>
@@ -6787,6 +6931,70 @@
           <w:i w:val="0"/>
           <w:sz w:val="19"/>
         </w:rPr>
+        <w:t xml:space="preserve">The Budget Lab at Yale. (April 2026). </w:t>
+      </w:r>
+      <w:r>
+        <w:rPr>
+          <w:rFonts w:ascii="Arial" w:hAnsi="Arial"/>
+          <w:b w:val="0"/>
+          <w:i/>
+          <w:sz w:val="19"/>
+        </w:rPr>
+        <w:t>Tracking the Impact of AI on the Labor Market — March CPS Update.</w:t>
+      </w:r>
+      <w:r>
+        <w:rPr>
+          <w:rFonts w:ascii="Arial" w:hAnsi="Arial"/>
+          <w:b w:val="0"/>
+          <w:i w:val="0"/>
+          <w:sz w:val="19"/>
+        </w:rPr>
+        <w:t xml:space="preserve"> Laufende Aktualisierung der Reihe „Evaluating the Impact of AI on the Labor Market"; Befund: keine substanzielle Abweichung von Berufsstrukturmischung, Industrie­diversität und Expositions­kennziffern aus dem historischen Korridor; leichte Zunahme der Differenz zwischen älteren und jüngeren Hochschulabsolventinnen und -absolventen. https://budgetlab.yale.edu/research/tracking-impact-ai-labor-market</w:t>
+      </w:r>
+    </w:p>
+    <w:p>
+      <w:pPr>
+        <w:jc w:val="both"/>
+      </w:pPr>
+      <w:r>
+        <w:rPr>
+          <w:rFonts w:ascii="Arial" w:hAnsi="Arial"/>
+          <w:b w:val="0"/>
+          <w:i w:val="0"/>
+          <w:sz w:val="19"/>
+        </w:rPr>
+        <w:t xml:space="preserve">The Budget Lab at Yale / Fortune. (6. Mai 2026). </w:t>
+      </w:r>
+      <w:r>
+        <w:rPr>
+          <w:rFonts w:ascii="Arial" w:hAnsi="Arial"/>
+          <w:b w:val="0"/>
+          <w:i/>
+          <w:sz w:val="19"/>
+        </w:rPr>
+        <w:t>AI could solve America's $39 trillion debt crisis — but only if Washington abandons displaced workers.</w:t>
+      </w:r>
+      <w:r>
+        <w:rPr>
+          <w:rFonts w:ascii="Arial" w:hAnsi="Arial"/>
+          <w:b w:val="0"/>
+          <w:i w:val="0"/>
+          <w:sz w:val="19"/>
+        </w:rPr>
+        <w:t xml:space="preserve"> Fiskalische Modellrechnung: 39 Bio. USD Schulden, rund 100 % des BIP, 88 Mrd. USD monatlicher Zinsdienst, 2,5 %/Jahr KI-Produktivitäts­pfad; Übergangshilfe pro Verdrängtem 5.500 bis 42.400 USD; Sozialhilfen in dieser Größenordnung neutralisieren den Schulden­abbau-Effekt weitgehend. https://fortune.com/2026/05/06/39-trillion-national-debt-fix-ai-productivity-yale-budget-lab/</w:t>
+      </w:r>
+    </w:p>
+    <w:p>
+      <w:pPr>
+        <w:jc w:val="both"/>
+      </w:pPr>
+      <w:r>
+        <w:rPr>
+          <w:rFonts w:ascii="Arial" w:hAnsi="Arial"/>
+          <w:b w:val="0"/>
+          <w:i w:val="0"/>
+          <w:sz w:val="19"/>
+        </w:rPr>
         <w:t xml:space="preserve">Anthropic. (23. April 2026). </w:t>
       </w:r>
       <w:r>
@@ -9540,6 +9748,166 @@
           <w:i w:val="0"/>
           <w:sz w:val="19"/>
         </w:rPr>
+        <w:t xml:space="preserve">TrueUp. (Stand 7. Mai 2026). </w:t>
+      </w:r>
+      <w:r>
+        <w:rPr>
+          <w:rFonts w:ascii="Arial" w:hAnsi="Arial"/>
+          <w:b w:val="0"/>
+          <w:i/>
+          <w:sz w:val="19"/>
+        </w:rPr>
+        <w:t>Tech Layoffs Tracker — Tagesfortschreibung: 121.111 Personen aus 273 Layoff-Meldungen (rund 961 Personen pro Tag).</w:t>
+      </w:r>
+      <w:r>
+        <w:rPr>
+          <w:rFonts w:ascii="Arial" w:hAnsi="Arial"/>
+          <w:b w:val="0"/>
+          <w:i w:val="0"/>
+          <w:sz w:val="19"/>
+        </w:rPr>
+        <w:t xml:space="preserve"> https://www.trueup.io/layoffs</w:t>
+      </w:r>
+    </w:p>
+    <w:p>
+      <w:pPr>
+        <w:jc w:val="both"/>
+      </w:pPr>
+      <w:r>
+        <w:rPr>
+          <w:rFonts w:ascii="Arial" w:hAnsi="Arial"/>
+          <w:b w:val="0"/>
+          <w:i w:val="0"/>
+          <w:sz w:val="19"/>
+        </w:rPr>
+        <w:t xml:space="preserve">CNBC / Engadget / Coindesk / Fortune. (5. Mai 2026). </w:t>
+      </w:r>
+      <w:r>
+        <w:rPr>
+          <w:rFonts w:ascii="Arial" w:hAnsi="Arial"/>
+          <w:b w:val="0"/>
+          <w:i/>
+          <w:sz w:val="19"/>
+        </w:rPr>
+        <w:t>Coinbase cuts headcount by 14% citing AI acceleration / Coinbase lays off nearly 700 workers in „AI-native" restructuring / Coinbase didn't just lay off 14% of its staff due to AI.</w:t>
+      </w:r>
+      <w:r>
+        <w:rPr>
+          <w:rFonts w:ascii="Arial" w:hAnsi="Arial"/>
+          <w:b w:val="0"/>
+          <w:i w:val="0"/>
+          <w:sz w:val="19"/>
+        </w:rPr>
+        <w:t xml:space="preserve"> Restrukturierungsaufwand 50–60 Mio. USD, Q2-2026-Abschluss; Vorstandschef Brian Armstrong skizziert „AI-native pods" mit reduzierten Managementebenen. https://www.cnbc.com/2026/05/05/coinbase-cuts-headcount-by-14percent-citing-ai-acceleration-the-shares-are-gaining.html | https://www.engadget.com/2165157/coinbase-lays-off-nearly-700-workers-in-ai-native-restructuring/ | https://www.coindesk.com/business/2026/05/05/coinbase-cuts-14-of-staff-as-ai-reshapes-how-crypto-companies-operate | https://fortune.com/2026/05/05/coinbase-layoffs-14-of-employees-ai-tech-ai-job-anxiety-crypto/</w:t>
+      </w:r>
+    </w:p>
+    <w:p>
+      <w:pPr>
+        <w:jc w:val="both"/>
+      </w:pPr>
+      <w:r>
+        <w:rPr>
+          <w:rFonts w:ascii="Arial" w:hAnsi="Arial"/>
+          <w:b w:val="0"/>
+          <w:i w:val="0"/>
+          <w:sz w:val="19"/>
+        </w:rPr>
+        <w:t xml:space="preserve">Bloomberg / TechCrunch / Yahoo Finance. (5. Mai 2026). </w:t>
+      </w:r>
+      <w:r>
+        <w:rPr>
+          <w:rFonts w:ascii="Arial" w:hAnsi="Arial"/>
+          <w:b w:val="0"/>
+          <w:i/>
+          <w:sz w:val="19"/>
+        </w:rPr>
+        <w:t>PayPal Plans Job Cuts as Fintech's New CEO Pursues Turnaround Strategy / PayPal says it's „becoming a technology company again" — that means AI / PayPal layoffs: New CEO cuts 20% of workforce in Q1 2026.</w:t>
+      </w:r>
+      <w:r>
+        <w:rPr>
+          <w:rFonts w:ascii="Arial" w:hAnsi="Arial"/>
+          <w:b w:val="0"/>
+          <w:i w:val="0"/>
+          <w:sz w:val="19"/>
+        </w:rPr>
+        <w:t xml:space="preserve"> Programm umfasst rund 4.760 Stellen (20 % von 23.800 Beschäftigten) über zwei bis drei Jahre, mindestens 1,5 Mrd. USD erwartete Einsparung; CEO Enrique Lores Q1-2026-Earnings-Call. https://www.bloomberg.com/news/articles/2026-05-05/paypal-plans-job-cuts-as-fintech-s-new-ceo-pursues-turnaround-strategy | https://techcrunch.com/2026/05/05/paypal-says-its-becoming-a-technology-company-again-that-means-ai/ | https://finance.yahoo.com/markets/stocks/articles/paypal-layoffs-ceo-cuts-20-154944985.html</w:t>
+      </w:r>
+    </w:p>
+    <w:p>
+      <w:pPr>
+        <w:jc w:val="both"/>
+      </w:pPr>
+      <w:r>
+        <w:rPr>
+          <w:rFonts w:ascii="Arial" w:hAnsi="Arial"/>
+          <w:b w:val="0"/>
+          <w:i w:val="0"/>
+          <w:sz w:val="19"/>
+        </w:rPr>
+        <w:t xml:space="preserve">TechRadar / Storyboard18. (5./6. Mai 2026). </w:t>
+      </w:r>
+      <w:r>
+        <w:rPr>
+          <w:rFonts w:ascii="Arial" w:hAnsi="Arial"/>
+          <w:b w:val="0"/>
+          <w:i/>
+          <w:sz w:val="19"/>
+        </w:rPr>
+        <w:t>Freshworks and Coinbase announce more than 1 in 10 jobs to go as companies replace workforce with AI technologies / Freshworks Layoffs 2026: „Over half of our code is written by AI," says CEO as firm cuts 500 jobs.</w:t>
+      </w:r>
+      <w:r>
+        <w:rPr>
+          <w:rFonts w:ascii="Arial" w:hAnsi="Arial"/>
+          <w:b w:val="0"/>
+          <w:i w:val="0"/>
+          <w:sz w:val="19"/>
+        </w:rPr>
+        <w:t xml:space="preserve"> https://www.techradar.com/pro/freshworks-and-coinbase-announce-more-than-1-in-10-jobs-to-go-as-companies-replace-workforce-with-ai-technologies-tech-company-layoffs-near-100k-in-2026-alone | https://www.storyboard18.com/brand-marketing/freshworks-layoffs-over-half-of-our-code-is-written-by-ai-says-ceo-as-firm-cuts-500-jobs-97275.htm</w:t>
+      </w:r>
+    </w:p>
+    <w:p>
+      <w:pPr>
+        <w:jc w:val="both"/>
+      </w:pPr>
+      <w:r>
+        <w:rPr>
+          <w:rFonts w:ascii="Arial" w:hAnsi="Arial"/>
+          <w:b w:val="0"/>
+          <w:i w:val="0"/>
+          <w:sz w:val="19"/>
+        </w:rPr>
+        <w:t xml:space="preserve">American Bazaar / TechResearchOnline / Goodreturns. (Mai 2026). </w:t>
+      </w:r>
+      <w:r>
+        <w:rPr>
+          <w:rFonts w:ascii="Arial" w:hAnsi="Arial"/>
+          <w:b w:val="0"/>
+          <w:i/>
+          <w:sz w:val="19"/>
+        </w:rPr>
+        <w:t>Cognizant eyes up to 15,000 layoffs, India set to bear the brunt / Cognizant Layoffs 2026 Signal AI Shift in IT Services / Layoffs 2026: Cognizant May Cut Up to 15,000 Jobs Globally Under „Project Leap".</w:t>
+      </w:r>
+      <w:r>
+        <w:rPr>
+          <w:rFonts w:ascii="Arial" w:hAnsi="Arial"/>
+          <w:b w:val="0"/>
+          <w:i w:val="0"/>
+          <w:sz w:val="19"/>
+        </w:rPr>
+        <w:t xml:space="preserve"> Programm „Project Leap"; Abfindungs­aufwand 230 bis 320 Mio. USD; rund 250.000 der weltweit 357.000 Beschäftigten in Indien. https://americanbazaaronline.com/2026/05/06/cognizant-eyes-up-to-15000-layoffs-india-set-to-bear-the-brunt-480243/ | https://techresearchonline.com/news/cognizant-layoffs-2026-ai-restructuring-project-leap/ | https://www.goodreturns.in/news/cognizant-layoffs-2026-it-company-may-cut-12000-15000-jobs-globally-major-impact-expected-in-india-1506427.html</w:t>
+      </w:r>
+    </w:p>
+    <w:p>
+      <w:pPr>
+        <w:jc w:val="both"/>
+      </w:pPr>
+      <w:r>
+        <w:rPr>
+          <w:rFonts w:ascii="Arial" w:hAnsi="Arial"/>
+          <w:b w:val="0"/>
+          <w:i w:val="0"/>
+          <w:sz w:val="19"/>
+        </w:rPr>
         <w:t xml:space="preserve">Fortune / Investor's Business Daily / Futurum. (April–Mai 2026). </w:t>
       </w:r>
       <w:r>
@@ -9709,7 +10077,7 @@
           <w:i w:val="0"/>
           <w:sz w:val="19"/>
         </w:rPr>
-        <w:t xml:space="preserve"> Dieses Arbeitspapier gibt den Stand Anfang Mai 2026 (Schnitt am 7. Mai 2026) wieder. Die Debatte entwickelt sich dynamisch, insbesondere im Zuge der OpenAI-Strategiepapiere und der Eröffnung des OpenAI Workshop in Washington, D.C. im Mai 2026, des Erstdurchgangs des GKV-Beitragssatzstabilisierungsgesetzes in der 1065. Bundesratssitzung am 8. Mai 2026 mit 79 Tagesordnungspunkten (Kabinettsbeschluss 29. April 2026, parlamentarische Behandlung vor der Sommerpause 2026 angekündigt), der laufenden Trilog-Verhandlungen zum Digital Omnibus on AI (zweite Runde 28. April 2026 ohne Einigung; nächste Runde 13. Mai 2026 — Knackpunkt ist nicht die Verschiebung der Hochrisiko-Pflichten, sondern die Konformitätsbewertungs-Architektur für Anhang I; die zypriotische Ratspräsidentschaft strebt einen Abschluss vor Ablauf ihrer Amtszeit am 30. Juni 2026 an, andernfalls übernimmt die irische Präsidentschaft), der am 5. Mai 2026 erfolgten Arraignment-Verhandlung im Altman-Verfahren mit „nicht schuldig"-Plädoyer und angeordneter psychiatrischer Begutachtung, des am 7. Mai 2026 versandten individuellen Microsoft-Buyout-Angebots (Annahmefrist 8. Juni 2026, VRSAR-Unterzeichnung 9.–22. Juni 2026, bis zu fünfjährige Krankenversicherungs-Verlängerung), des am 1. Mai 2026 vom Connecticut-Repräsentantenhaus mit 131 zu 17 Stimmen verabschiedeten </w:t>
+        <w:t xml:space="preserve"> Dieses Arbeitspapier gibt den Stand Anfang Mai 2026 (Schnitt am 7. Mai 2026 — abendliche Folgeaktualisierung) wieder. Die Debatte entwickelt sich dynamisch, insbesondere im Zuge der OpenAI-Strategiepapiere und der Eröffnung des OpenAI Workshop in Washington, D.C. im Mai 2026, des Erstdurchgangs des GKV-Beitragssatzstabilisierungsgesetzes in der 1065. Bundesratssitzung am 8. Mai 2026 mit 79 Tagesordnungspunkten (Kabinettsbeschluss 29. April 2026, parlamentarische Behandlung vor der Sommerpause 2026 angekündigt), der laufenden Trilog-Verhandlungen zum Digital Omnibus on AI (zweite Runde 28. April 2026 ohne Einigung; nächste Runde 13. Mai 2026 — Knackpunkt ist nicht die Verschiebung der Hochrisiko-Pflichten, sondern die Konformitätsbewertungs-Architektur für Anhang I; die zypriotische Ratspräsidentschaft strebt einen Abschluss vor Ablauf ihrer Amtszeit am 30. Juni 2026 an, andernfalls übernimmt die irische Präsidentschaft), der am 5. Mai 2026 erfolgten Arraignment-Verhandlung im Altman-Verfahren mit „nicht schuldig"-Plädoyer und angeordneter psychiatrischer Begutachtung, des am 7. Mai 2026 versandten individuellen Microsoft-Buyout-Angebots (Annahmefrist 8. Juni 2026, VRSAR-Unterzeichnung 9.–22. Juni 2026, bis zu fünfjährige Krankenversicherungs-Verlängerung), des am 1. Mai 2026 vom Connecticut-Repräsentantenhaus mit 131 zu 17 Stimmen verabschiedeten </w:t>
       </w:r>
       <w:r>
         <w:rPr>
@@ -9853,7 +10221,25 @@
           <w:i w:val="0"/>
           <w:sz w:val="19"/>
         </w:rPr>
-        <w:t xml:space="preserve"> auf 100 % bei zugleich ablehnender Position des Finanzministeriums, der revidierten IAB-Frühjahrsprognose vom 24. März 2026 (Erwerbstätigkeit −90.000, BIP +0,8 % bei 0,2 bis 0,3 Pp. Iran-Krieg-Dämpfung), der aktualisierten Tech-Layoff-Trackerstände zum 6. Mai 2026 (TrueUp 119.721 Personen aus 265 Layoff-Meldungen, SkillSyncer 113.863 Personen aus 179 Ereignissen) sowie des Big-Tech-AI-Capex-Programms 2026 mit einem Q1-Volumen von rund 130,65 Milliarden US-Dollar und einer Konsens-Schätzung von 660–700 Milliarden US-Dollar für das Gesamtjahr. Eine regelmäßige Aktualisierung ist vorgesehen.</w:t>
+        <w:t xml:space="preserve"> auf 100 % bei zugleich ablehnender Position des Finanzministeriums, der revidierten IAB-Frühjahrsprognose vom 24. März 2026 (Erwerbstätigkeit −90.000, BIP +0,8 % bei 0,2 bis 0,3 Pp. Iran-Krieg-Dämpfung), der aktualisierten Tech-Layoff-Trackerstände zum 6./7. Mai 2026 (TrueUp 119.721 Personen aus 265 Layoff-Meldungen am 6. Mai bzw. 121.111 Personen aus 273 Meldungen am 7. Mai, SkillSyncer 113.863 Personen aus 179 Ereignissen) sowie der am 5./6. Mai 2026 angekündigten KI-getriebenen Stellenstreichungen bei Coinbase (700 Stellen, 14 %), PayPal (rund 4.760 Stellen, 20 % über 2–3 Jahre), Freshworks (rund 500 Stellen, 11 %) und Cognizant (12.000–15.000 Stellen unter „Project Leap"), des am 7. Mai 2026 publizierten Microsoft-VRSAR-Programmstatus (rund 8.500 angebotsberechtigte Beschäftigte, </w:t>
+      </w:r>
+      <w:r>
+        <w:rPr>
+          <w:rFonts w:ascii="Arial" w:hAnsi="Arial"/>
+          <w:b w:val="0"/>
+          <w:i/>
+          <w:sz w:val="19"/>
+        </w:rPr>
+        <w:t>Separation Date</w:t>
+      </w:r>
+      <w:r>
+        <w:rPr>
+          <w:rFonts w:ascii="Arial" w:hAnsi="Arial"/>
+          <w:b w:val="0"/>
+          <w:i w:val="0"/>
+          <w:sz w:val="19"/>
+        </w:rPr>
+        <w:t xml:space="preserve"> 2. Juli 2026) und des Yale-Budget-Lab-Befundes vom April/6. Mai 2026 (kein aggregierter KI-Disruptionseffekt im US-Arbeitsmarkt; fiskalische Modellrechnung 39 Bio. USD Schulden vs. 5.500–42.400 USD Übergangshilfe pro Verdrängtem) sowie des Big-Tech-AI-Capex-Programms 2026 mit einem Q1-Volumen von rund 130,65 Milliarden US-Dollar und einer Konsens-Schätzung von 660–700 Milliarden US-Dollar für das Gesamtjahr. Eine regelmäßige Aktualisierung ist vorgesehen.</w:t>
       </w:r>
     </w:p>
     <w:p>

</xml_diff>